<commit_message>
Updating paper_main and paper_supplement
</commit_message>
<xml_diff>
--- a/paper_main.docx
+++ b/paper_main.docx
@@ -8,7 +8,7 @@
         <w:pStyle w:val="Heading1"/>
       </w:pPr>
       <w:r>
-        <w:t xml:space="preserve">Eye tracking in a polysynthetic language: Evidence for a distinction between lexical and grammatical suffixes</w:t>
+        <w:t xml:space="preserve">Eye Tracking in a Polysynthetic Language: Evidence for a Distinction between Lexical and Grammatical Suffixes</w:t>
       </w:r>
     </w:p>
     <w:p>
@@ -418,7 +418,7 @@
         <w:pStyle w:val="FirstParagraph"/>
       </w:pPr>
       <w:r>
-        <w:t xml:space="preserve">eye tracking; Kalaallisut; polysynthesis; affixes; grammar-lexicon distinction; attention</w:t>
+        <w:t xml:space="preserve">eye tracking; polysynthesis; affixes; grammar-lexicon distinction; attention</w:t>
       </w:r>
     </w:p>
     <w:p>
@@ -432,15 +432,6 @@
       <w:pPr>
         <w:pStyle w:val="Heading1"/>
       </w:pPr>
-      <w:r>
-        <w:rPr>
-          <w:rStyle w:val="SectionNumber"/>
-        </w:rPr>
-        <w:t xml:space="preserve">1</w:t>
-      </w:r>
-      <w:r>
-        <w:tab/>
-      </w:r>
       <w:r>
         <w:t xml:space="preserve">Introduction</w:t>
       </w:r>
@@ -1172,16 +1163,7 @@
         <w:pStyle w:val="Heading1"/>
       </w:pPr>
       <w:r>
-        <w:rPr>
-          <w:rStyle w:val="SectionNumber"/>
-        </w:rPr>
-        <w:t xml:space="preserve">2</w:t>
-      </w:r>
-      <w:r>
-        <w:tab/>
-      </w:r>
-      <w:r>
-        <w:t xml:space="preserve">The experiment</w:t>
+        <w:t xml:space="preserve">The Experiment</w:t>
       </w:r>
     </w:p>
     <w:p>
@@ -1200,22 +1182,22 @@
         <w:t xml:space="preserve">Besides testing the specific hypotheses regarding grammatical and lexical suffixes, the experiment design also allowed for investigating more general fixation patterns on multi-morphemic words.</w:t>
       </w:r>
     </w:p>
-    <w:bookmarkStart w:id="35" w:name="data-availability"/>
+    <w:bookmarkStart w:id="47" w:name="methods"/>
     <w:p>
       <w:pPr>
         <w:pStyle w:val="Heading2"/>
       </w:pPr>
       <w:r>
-        <w:rPr>
-          <w:rStyle w:val="SectionNumber"/>
-        </w:rPr>
-        <w:t xml:space="preserve">2.1</w:t>
-      </w:r>
-      <w:r>
-        <w:tab/>
-      </w:r>
-      <w:r>
-        <w:t xml:space="preserve">Data availability</w:t>
+        <w:t xml:space="preserve">Methods</w:t>
+      </w:r>
+    </w:p>
+    <w:bookmarkStart w:id="35" w:name="participants"/>
+    <w:p>
+      <w:pPr>
+        <w:pStyle w:val="Heading3"/>
+      </w:pPr>
+      <w:r>
+        <w:t xml:space="preserve">Participants</w:t>
       </w:r>
     </w:p>
     <w:p>
@@ -1223,58 +1205,126 @@
         <w:pStyle w:val="FirstParagraph"/>
       </w:pPr>
       <w:r>
-        <w:t xml:space="preserve">Data and analysis scripts are available here:</w:t>
-      </w:r>
-      <w:r>
-        <w:t xml:space="preserve"> </w:t>
-      </w:r>
-      <w:hyperlink r:id="rId34">
-        <w:r>
-          <w:rPr>
-            <w:rStyle w:val="Hyperlink"/>
-          </w:rPr>
-          <w:t xml:space="preserve">https://github.com/solvej-jaeger/eye_tracking_kalaallisut</w:t>
-        </w:r>
-      </w:hyperlink>
+        <w:t xml:space="preserve">A total of 52 native speakers of Kalaallisut participated in the experiment (40 female, mean age = 27.1)</w:t>
+      </w:r>
+      <w:r>
+        <w:rPr>
+          <w:rStyle w:val="FootnoteReference"/>
+        </w:rPr>
+        <w:footnoteReference w:id="34"/>
+      </w:r>
+      <w:r>
+        <w:t xml:space="preserve">. Of these, 45 were residents of Greenland and 7 of Denmark. None reported being dyslexic. All participants gave informed consent prior to participation. Participants were informed that the experiment involved reading sentences on a screen while their eye movements were tracked. All participants completed a short questionnaire about their demographic and language background. They received a gift as acknowledgement of their participation.</w:t>
+      </w:r>
+    </w:p>
+    <w:bookmarkEnd w:id="35"/>
+    <w:bookmarkStart w:id="38" w:name="apparatus-and-experimental-procedure"/>
+    <w:p>
+      <w:pPr>
+        <w:pStyle w:val="Heading3"/>
+      </w:pPr>
+      <w:r>
+        <w:t xml:space="preserve">Apparatus and Experimental Procedure</w:t>
+      </w:r>
+    </w:p>
+    <w:p>
+      <w:pPr>
+        <w:pStyle w:val="FirstParagraph"/>
+      </w:pPr>
+      <w:r>
+        <w:t xml:space="preserve">Movements of the right eye were recorded with an Eyelink Portable Duo eye tracker (SR Research, Ontario, Canada), sampling at 1000 Hz</w:t>
+      </w:r>
+      <w:r>
+        <w:rPr>
+          <w:rStyle w:val="FootnoteReference"/>
+        </w:rPr>
+        <w:footnoteReference w:id="36"/>
+      </w:r>
+      <w:r>
+        <w:t xml:space="preserve">. For the first 40 participants, sentences were displayed on a 24-inch monitor (brand: Philips, model ID: 240V55QDSB/00, resolution: 1920x1080) placed 90 cm from the subjects. For the remaining 12 participants, sentences were presented on a 27-inch monitor (brand: HP, model ID: HP E27m G4, resolution: 1920x1080) placed 104 cm from the subjects. In both cases, the screen width subtended 32 degrees of visual angle (the full trackable range of the eye tracker)</w:t>
+      </w:r>
+      <w:r>
+        <w:rPr>
+          <w:rStyle w:val="FootnoteReference"/>
+        </w:rPr>
+        <w:footnoteReference w:id="37"/>
+      </w:r>
       <w:r>
         <w:t xml:space="preserve">.</w:t>
       </w:r>
     </w:p>
-    <w:bookmarkEnd w:id="35"/>
-    <w:bookmarkStart w:id="49" w:name="methods"/>
-    <w:p>
-      <w:pPr>
-        <w:pStyle w:val="Heading2"/>
-      </w:pPr>
-      <w:r>
-        <w:rPr>
-          <w:rStyle w:val="SectionNumber"/>
-        </w:rPr>
-        <w:t xml:space="preserve">2.2</w:t>
-      </w:r>
-      <w:r>
-        <w:tab/>
-      </w:r>
-      <w:r>
-        <w:t xml:space="preserve">Methods</w:t>
-      </w:r>
-    </w:p>
-    <w:bookmarkStart w:id="37" w:name="participants"/>
+    <w:p>
+      <w:pPr>
+        <w:pStyle w:val="BodyText"/>
+      </w:pPr>
+      <w:r>
+        <w:t xml:space="preserve">The experiment was constructed in Experiment Builder (SR Research). Sentences were displayed in Courier New, font size 19. Each letter subtended 0.38 degrees of visual angle. The background was white and the text color black.</w:t>
+      </w:r>
+    </w:p>
+    <w:p>
+      <w:pPr>
+        <w:pStyle w:val="BodyText"/>
+      </w:pPr>
+      <w:r>
+        <w:t xml:space="preserve">A 9-point calibration procedure was performed at the start of the experiment, after every 40</w:t>
+      </w:r>
+      <w:r>
+        <w:rPr>
+          <w:vertAlign w:val="superscript"/>
+        </w:rPr>
+        <w:t xml:space="preserve">th</w:t>
+      </w:r>
+      <w:r>
+        <w:t xml:space="preserve"> </w:t>
+      </w:r>
+      <w:r>
+        <w:t xml:space="preserve">trial, and additionally as needed between trials. The average calibration error across participants was 0.35 degrees of visual angle (SD = 0.14).</w:t>
+      </w:r>
+    </w:p>
+    <w:p>
+      <w:pPr>
+        <w:pStyle w:val="BodyText"/>
+      </w:pPr>
+      <w:r>
+        <w:t xml:space="preserve">Participants were instructed to read for comprehension. Each trial consisted of three sentences presented below one another with clear spacing in between. No sentence was longer than a single line. The sentences appeared when the participant fixated a drift-check dot on the left side of the screen and simultaneously pressed space. After reading all three sentences, the participant again pressed space to proceed.</w:t>
+      </w:r>
+    </w:p>
+    <w:p>
+      <w:pPr>
+        <w:pStyle w:val="BodyText"/>
+      </w:pPr>
+      <w:r>
+        <w:t xml:space="preserve">A yes/no comprehension question followed 25% of the trials. Trials appeared in fully randomized order, so participants could not predict when the next comprehension question would appear. There were 160 trials in total, and each session lasted approximately one hour (mean duration excluding calibration and breaks = 39.5 minutes, SD = 9.1). A short break was provided after every 40</w:t>
+      </w:r>
+      <w:r>
+        <w:rPr>
+          <w:vertAlign w:val="superscript"/>
+        </w:rPr>
+        <w:t xml:space="preserve">th</w:t>
+      </w:r>
+      <w:r>
+        <w:t xml:space="preserve"> </w:t>
+      </w:r>
+      <w:r>
+        <w:t xml:space="preserve">trial.</w:t>
+      </w:r>
+    </w:p>
+    <w:p>
+      <w:pPr>
+        <w:pStyle w:val="BodyText"/>
+      </w:pPr>
+      <w:r>
+        <w:t xml:space="preserve">The experiment began with two practice trials, data from which were not included in the analyses.</w:t>
+      </w:r>
+    </w:p>
+    <w:bookmarkEnd w:id="38"/>
+    <w:bookmarkStart w:id="46" w:name="materials"/>
     <w:p>
       <w:pPr>
         <w:pStyle w:val="Heading3"/>
       </w:pPr>
       <w:r>
-        <w:rPr>
-          <w:rStyle w:val="SectionNumber"/>
-        </w:rPr>
-        <w:t xml:space="preserve">2.2.1</w:t>
-      </w:r>
-      <w:r>
-        <w:tab/>
-      </w:r>
-      <w:r>
-        <w:t xml:space="preserve">Participants</w:t>
+        <w:t xml:space="preserve">Materials</w:t>
       </w:r>
     </w:p>
     <w:p>
@@ -1282,158 +1332,13 @@
         <w:pStyle w:val="FirstParagraph"/>
       </w:pPr>
       <w:r>
-        <w:t xml:space="preserve">A total of 52 native speakers of Kalaallisut participated in the experiment (40 female, mean age = 27.1)</w:t>
-      </w:r>
-      <w:r>
-        <w:rPr>
-          <w:rStyle w:val="FootnoteReference"/>
-        </w:rPr>
-        <w:footnoteReference w:id="36"/>
-      </w:r>
-      <w:r>
-        <w:t xml:space="preserve">. Of these, 45 were residents of Greenland and 7 of Denmark. None reported being dyslexic. Participants were informed that the experiment involved reading sentences on a screen while their eye movements were tracked. All participants completed a short questionnaire about their demographic and language background. They received a gift as acknowledgement of their participation.</w:t>
-      </w:r>
-    </w:p>
-    <w:bookmarkEnd w:id="37"/>
-    <w:bookmarkStart w:id="40" w:name="apparatus-and-experimental-procedure"/>
-    <w:p>
-      <w:pPr>
-        <w:pStyle w:val="Heading3"/>
-      </w:pPr>
-      <w:r>
-        <w:rPr>
-          <w:rStyle w:val="SectionNumber"/>
-        </w:rPr>
-        <w:t xml:space="preserve">2.2.2</w:t>
-      </w:r>
-      <w:r>
-        <w:tab/>
-      </w:r>
-      <w:r>
-        <w:t xml:space="preserve">Apparatus and experimental procedure</w:t>
-      </w:r>
-    </w:p>
-    <w:p>
-      <w:pPr>
-        <w:pStyle w:val="FirstParagraph"/>
-      </w:pPr>
-      <w:r>
-        <w:t xml:space="preserve">Movements of the right eye were recorded with an Eyelink Portable Duo eye tracker (SR Research, Ontario, Canada), sampling at 1000 Hz</w:t>
-      </w:r>
-      <w:r>
-        <w:rPr>
-          <w:rStyle w:val="FootnoteReference"/>
-        </w:rPr>
-        <w:footnoteReference w:id="38"/>
-      </w:r>
-      <w:r>
-        <w:t xml:space="preserve">. For the first 40 participants, sentences were displayed on a 24-inch monitor (brand: Philips, model ID: 240V55QDSB/00, resolution: 1920x1080) placed 90 cm from the subjects. For the remaining 12 participants, sentences were presented on a 27-inch monitor (brand: HP, model ID: HP E27m G4, resolution: 1920x1080) placed 104 cm from the subjects. In both cases, the screen width subtended 32 degrees of visual angle (the full trackable range of the eye tracker)</w:t>
-      </w:r>
-      <w:r>
-        <w:rPr>
-          <w:rStyle w:val="FootnoteReference"/>
-        </w:rPr>
-        <w:footnoteReference w:id="39"/>
-      </w:r>
-      <w:r>
-        <w:t xml:space="preserve">.</w:t>
-      </w:r>
-    </w:p>
-    <w:p>
-      <w:pPr>
-        <w:pStyle w:val="BodyText"/>
-      </w:pPr>
-      <w:r>
-        <w:t xml:space="preserve">The experiment was constructed in Experiment Builder (SR Research). Sentences were displayed in Courier New, font size 19. Each letter subtended 0.38 degrees of visual angle. The background was white and the text color black.</w:t>
-      </w:r>
-    </w:p>
-    <w:p>
-      <w:pPr>
-        <w:pStyle w:val="BodyText"/>
-      </w:pPr>
-      <w:r>
-        <w:t xml:space="preserve">A 9-point calibration procedure was performed at the start of the experiment, after every 40</w:t>
-      </w:r>
-      <w:r>
-        <w:rPr>
-          <w:vertAlign w:val="superscript"/>
-        </w:rPr>
-        <w:t xml:space="preserve">th</w:t>
-      </w:r>
-      <w:r>
-        <w:t xml:space="preserve"> </w:t>
-      </w:r>
-      <w:r>
-        <w:t xml:space="preserve">trial, and additionally as needed between trials. The average calibration error across participants was 0.35 degrees of visual angle (SD = 0.14).</w:t>
-      </w:r>
-    </w:p>
-    <w:p>
-      <w:pPr>
-        <w:pStyle w:val="BodyText"/>
-      </w:pPr>
-      <w:r>
-        <w:t xml:space="preserve">Participants were instructed to read for comprehension. Each trial consisted of three sentences presented below one another with clear spacing in between. No sentence was longer than a single line. The sentences appeared when the participant fixated a drift-check dot on the left side of the screen and simultaneously pressed space. After reading all three sentences, the participant again pressed space to proceed.</w:t>
-      </w:r>
-    </w:p>
-    <w:p>
-      <w:pPr>
-        <w:pStyle w:val="BodyText"/>
-      </w:pPr>
-      <w:r>
-        <w:t xml:space="preserve">A yes/no comprehension question followed 25% of the trials. Trials appeared in fully randomized order, so participants could not predict when the next comprehension question would appear. There were 160 trials in total, and each session lasted approximately one hour (mean duration excluding calibration and breaks = 39.5 minutes, SD = 9.1). A short break was provided after every 40</w:t>
-      </w:r>
-      <w:r>
-        <w:rPr>
-          <w:vertAlign w:val="superscript"/>
-        </w:rPr>
-        <w:t xml:space="preserve">th</w:t>
-      </w:r>
-      <w:r>
-        <w:t xml:space="preserve"> </w:t>
-      </w:r>
-      <w:r>
-        <w:t xml:space="preserve">trial.</w:t>
-      </w:r>
-    </w:p>
-    <w:p>
-      <w:pPr>
-        <w:pStyle w:val="BodyText"/>
-      </w:pPr>
-      <w:r>
-        <w:t xml:space="preserve">The experiment began with two practice trials, data from which were not included in the analyses.</w:t>
-      </w:r>
-    </w:p>
-    <w:bookmarkEnd w:id="40"/>
-    <w:bookmarkStart w:id="48" w:name="materials"/>
-    <w:p>
-      <w:pPr>
-        <w:pStyle w:val="Heading3"/>
-      </w:pPr>
-      <w:r>
-        <w:rPr>
-          <w:rStyle w:val="SectionNumber"/>
-        </w:rPr>
-        <w:t xml:space="preserve">2.2.3</w:t>
-      </w:r>
-      <w:r>
-        <w:tab/>
-      </w:r>
-      <w:r>
-        <w:t xml:space="preserve">Materials</w:t>
-      </w:r>
-    </w:p>
-    <w:p>
-      <w:pPr>
-        <w:pStyle w:val="FirstParagraph"/>
-      </w:pPr>
-      <w:r>
         <w:t xml:space="preserve">Based on the modification criterion and discussions with author NBT, a linguist and native speaker of Kalaallisut, 8 lexical and 8 grammatical target suffixes were chosen (see Table</w:t>
       </w:r>
       <w:r>
         <w:t xml:space="preserve"> </w:t>
       </w:r>
       <w:r>
-        <w:t xml:space="preserve">2.1</w:t>
+        <w:t xml:space="preserve">1</w:t>
       </w:r>
       <w:r>
         <w:t xml:space="preserve">) (note that in some cases, unmodifiable, hence grammatical, suffixes have English translations that are modifiable).</w:t>
@@ -1443,10 +1348,10 @@
       <w:pPr>
         <w:pStyle w:val="TableCaption"/>
       </w:pPr>
-      <w:bookmarkStart w:id="41" w:name="tab:table1"/>
-      <w:bookmarkEnd w:id="41"/>
-      <w:r>
-        <w:t xml:space="preserve">Table 2.1: Lexical and grammatical target suffixes</w:t>
+      <w:bookmarkStart w:id="39" w:name="tab:table1"/>
+      <w:bookmarkEnd w:id="39"/>
+      <w:r>
+        <w:t xml:space="preserve">Table 1: Lexical and grammatical target suffixes</w:t>
       </w:r>
     </w:p>
     <w:tbl>
@@ -1455,7 +1360,7 @@
         <w:tblW w:type="pct" w:w="5000"/>
         <w:tblLayout w:type="fixed"/>
         <w:tblLook w:firstRow="1" w:lastRow="0" w:firstColumn="0" w:lastColumn="0" w:noHBand="0" w:noVBand="0" w:val="0020"/>
-        <w:tblCaption w:val="Table 2.1: Lexical and grammatical target suffixes"/>
+        <w:tblCaption w:val="Table 1: Lexical and grammatical target suffixes"/>
       </w:tblPr>
       <w:tblGrid>
         <w:gridCol w:w="2084"/>
@@ -2110,12 +2015,12 @@
         <w:rPr>
           <w:rStyle w:val="FootnoteReference"/>
         </w:rPr>
-        <w:footnoteReference w:id="42"/>
+        <w:footnoteReference w:id="40"/>
       </w:r>
       <w:r>
         <w:t xml:space="preserve">. A requirement was that the root have its own entry in the online dictionaries provided by Oqaasileriffik, The Language Secretariat of Greenland (</w:t>
       </w:r>
-      <w:hyperlink r:id="rId43">
+      <w:hyperlink r:id="rId41">
         <w:r>
           <w:rPr>
             <w:rStyle w:val="Hyperlink"/>
@@ -2154,7 +2059,7 @@
         <w:t xml:space="preserve"> </w:t>
       </w:r>
       <w:r>
-        <w:t xml:space="preserve">2.2</w:t>
+        <w:t xml:space="preserve">2</w:t>
       </w:r>
       <w:r>
         <w:t xml:space="preserve">) based on the modification criterion. The lexical words were nouns in the absolutive form. Given that the absolutive is zero-marked in Kalaallisut, these forms are morphologically simple. The grammatical words were conjunctions.</w:t>
@@ -2164,10 +2069,10 @@
       <w:pPr>
         <w:pStyle w:val="TableCaption"/>
       </w:pPr>
-      <w:bookmarkStart w:id="44" w:name="tab:table2"/>
-      <w:bookmarkEnd w:id="44"/>
-      <w:r>
-        <w:t xml:space="preserve">Table 2.2: Lexical and grammatical baseline words</w:t>
+      <w:bookmarkStart w:id="42" w:name="tab:table2"/>
+      <w:bookmarkEnd w:id="42"/>
+      <w:r>
+        <w:t xml:space="preserve">Table 2: Lexical and grammatical baseline words</w:t>
       </w:r>
     </w:p>
     <w:tbl>
@@ -2176,7 +2081,7 @@
         <w:tblW w:type="pct" w:w="5000"/>
         <w:tblLayout w:type="fixed"/>
         <w:tblLook w:firstRow="1" w:lastRow="0" w:firstColumn="0" w:lastColumn="0" w:noHBand="0" w:noVBand="0" w:val="0020"/>
-        <w:tblCaption w:val="Table 2.2: Lexical and grammatical baseline words"/>
+        <w:tblCaption w:val="Table 2: Lexical and grammatical baseline words"/>
       </w:tblPr>
       <w:tblGrid>
         <w:gridCol w:w="2495"/>
@@ -2783,12 +2688,12 @@
         <w:t xml:space="preserve"> </w:t>
       </w:r>
       <w:r>
-        <w:t xml:space="preserve">2.3</w:t>
+        <w:t xml:space="preserve">3</w:t>
       </w:r>
       <w:r>
         <w:t xml:space="preserve">). Frequency was measured as the absolute number of occurrences in the corpus of written Kalaallisut provided by Oqaasileriffik, The Language Secretariat of Greenland (</w:t>
       </w:r>
-      <w:hyperlink r:id="rId45">
+      <w:hyperlink r:id="rId43">
         <w:r>
           <w:rPr>
             <w:rStyle w:val="Hyperlink"/>
@@ -2804,10 +2709,10 @@
       <w:pPr>
         <w:pStyle w:val="TableCaption"/>
       </w:pPr>
-      <w:bookmarkStart w:id="46" w:name="tab:table3"/>
-      <w:bookmarkEnd w:id="46"/>
-      <w:r>
-        <w:t xml:space="preserve">Table 2.3:</w:t>
+      <w:bookmarkStart w:id="44" w:name="tab:table3"/>
+      <w:bookmarkEnd w:id="44"/>
+      <w:r>
+        <w:t xml:space="preserve">Table 3:</w:t>
       </w:r>
       <w:r>
         <w:t xml:space="preserve"> </w:t>
@@ -3567,7 +3472,7 @@
         <w:t xml:space="preserve"> </w:t>
       </w:r>
       <w:r>
-        <w:t xml:space="preserve">2.4</w:t>
+        <w:t xml:space="preserve">4</w:t>
       </w:r>
       <w:r>
         <w:t xml:space="preserve">).</w:t>
@@ -3577,10 +3482,10 @@
       <w:pPr>
         <w:pStyle w:val="TableCaption"/>
       </w:pPr>
-      <w:bookmarkStart w:id="47" w:name="tab:table4"/>
-      <w:bookmarkEnd w:id="47"/>
-      <w:r>
-        <w:t xml:space="preserve">Table 2.4:</w:t>
+      <w:bookmarkStart w:id="45" w:name="tab:table4"/>
+      <w:bookmarkEnd w:id="45"/>
+      <w:r>
+        <w:t xml:space="preserve">Table 4:</w:t>
       </w:r>
       <w:r>
         <w:t xml:space="preserve"> </w:t>
@@ -3630,8 +3535,8 @@
                 <w:left w:val="none" w:sz="0" w:space="0" w:color="000000"/>
                 <w:right w:val="none" w:sz="0" w:space="0" w:color="000000"/>
               </w:pBdr>
-              <w:spacing w:after="120" w:before="120" w:line="240"/>
-              <w:ind w:left="120" w:right="120" w:firstLine="0" w:firstLineChars="0"/>
+              <w:spacing w:after="100" w:before="100" w:line="240"/>
+              <w:ind w:left="100" w:right="100" w:firstLine="0" w:firstLineChars="0"/>
               <w:rPr>
                 <w:rFonts w:ascii="Arial" w:hAnsi="Arial" w:eastAsia="Arial" w:cs="Arial"/>
                 <w:i w:val="false"/>
@@ -3684,8 +3589,8 @@
                 <w:left w:val="none" w:sz="0" w:space="0" w:color="000000"/>
                 <w:right w:val="none" w:sz="0" w:space="0" w:color="000000"/>
               </w:pBdr>
-              <w:spacing w:after="120" w:before="120" w:line="240"/>
-              <w:ind w:left="120" w:right="120" w:firstLine="0" w:firstLineChars="0"/>
+              <w:spacing w:after="100" w:before="100" w:line="240"/>
+              <w:ind w:left="100" w:right="100" w:firstLine="0" w:firstLineChars="0"/>
               <w:rPr>
                 <w:rFonts w:ascii="Arial" w:hAnsi="Arial" w:eastAsia="Arial" w:cs="Arial"/>
                 <w:i w:val="false"/>
@@ -3738,8 +3643,8 @@
                 <w:left w:val="none" w:sz="0" w:space="0" w:color="000000"/>
                 <w:right w:val="none" w:sz="0" w:space="0" w:color="000000"/>
               </w:pBdr>
-              <w:spacing w:after="120" w:before="120" w:line="240"/>
-              <w:ind w:left="120" w:right="120" w:firstLine="0" w:firstLineChars="0"/>
+              <w:spacing w:after="100" w:before="100" w:line="240"/>
+              <w:ind w:left="100" w:right="100" w:firstLine="0" w:firstLineChars="0"/>
               <w:rPr>
                 <w:rFonts w:ascii="Arial" w:hAnsi="Arial" w:eastAsia="Arial" w:cs="Arial"/>
                 <w:i w:val="false"/>
@@ -3797,8 +3702,8 @@
                 <w:left w:val="none" w:sz="0" w:space="0" w:color="000000"/>
                 <w:right w:val="none" w:sz="0" w:space="0" w:color="000000"/>
               </w:pBdr>
-              <w:spacing w:after="120" w:before="120" w:line="240"/>
-              <w:ind w:left="120" w:right="120" w:firstLine="0" w:firstLineChars="0"/>
+              <w:spacing w:after="100" w:before="100" w:line="240"/>
+              <w:ind w:left="100" w:right="100" w:firstLine="0" w:firstLineChars="0"/>
               <w:rPr>
                 <w:rFonts w:ascii="Arial" w:hAnsi="Arial" w:eastAsia="Arial" w:cs="Arial"/>
                 <w:i w:val="false"/>
@@ -3851,8 +3756,8 @@
                 <w:left w:val="none" w:sz="0" w:space="0" w:color="000000"/>
                 <w:right w:val="none" w:sz="0" w:space="0" w:color="000000"/>
               </w:pBdr>
-              <w:spacing w:after="120" w:before="120" w:line="240"/>
-              <w:ind w:left="120" w:right="120" w:firstLine="0" w:firstLineChars="0"/>
+              <w:spacing w:after="100" w:before="100" w:line="240"/>
+              <w:ind w:left="100" w:right="100" w:firstLine="0" w:firstLineChars="0"/>
               <w:rPr>
                 <w:rFonts w:ascii="Arial" w:hAnsi="Arial" w:eastAsia="Arial" w:cs="Arial"/>
                 <w:i w:val="false"/>
@@ -3905,8 +3810,8 @@
                 <w:left w:val="none" w:sz="0" w:space="0" w:color="000000"/>
                 <w:right w:val="none" w:sz="0" w:space="0" w:color="000000"/>
               </w:pBdr>
-              <w:spacing w:after="120" w:before="120" w:line="240"/>
-              <w:ind w:left="120" w:right="120" w:firstLine="0" w:firstLineChars="0"/>
+              <w:spacing w:after="100" w:before="100" w:line="240"/>
+              <w:ind w:left="100" w:right="100" w:firstLine="0" w:firstLineChars="0"/>
               <w:rPr>
                 <w:rFonts w:ascii="Arial" w:hAnsi="Arial" w:eastAsia="Arial" w:cs="Arial"/>
                 <w:i w:val="false"/>
@@ -3964,8 +3869,8 @@
                 <w:left w:val="none" w:sz="0" w:space="0" w:color="000000"/>
                 <w:right w:val="none" w:sz="0" w:space="0" w:color="000000"/>
               </w:pBdr>
-              <w:spacing w:after="120" w:before="120" w:line="240"/>
-              <w:ind w:left="120" w:right="120" w:firstLine="0" w:firstLineChars="0"/>
+              <w:spacing w:after="100" w:before="100" w:line="240"/>
+              <w:ind w:left="100" w:right="100" w:firstLine="0" w:firstLineChars="0"/>
               <w:rPr>
                 <w:rFonts w:ascii="Arial" w:hAnsi="Arial" w:eastAsia="Arial" w:cs="Arial"/>
                 <w:i w:val="false"/>
@@ -4018,8 +3923,8 @@
                 <w:left w:val="none" w:sz="0" w:space="0" w:color="000000"/>
                 <w:right w:val="none" w:sz="0" w:space="0" w:color="000000"/>
               </w:pBdr>
-              <w:spacing w:after="120" w:before="120" w:line="240"/>
-              <w:ind w:left="120" w:right="120" w:firstLine="0" w:firstLineChars="0"/>
+              <w:spacing w:after="100" w:before="100" w:line="240"/>
+              <w:ind w:left="100" w:right="100" w:firstLine="0" w:firstLineChars="0"/>
               <w:rPr>
                 <w:rFonts w:ascii="Arial" w:hAnsi="Arial" w:eastAsia="Arial" w:cs="Arial"/>
                 <w:i w:val="false"/>
@@ -4072,8 +3977,8 @@
                 <w:left w:val="none" w:sz="0" w:space="0" w:color="000000"/>
                 <w:right w:val="none" w:sz="0" w:space="0" w:color="000000"/>
               </w:pBdr>
-              <w:spacing w:after="120" w:before="120" w:line="240"/>
-              <w:ind w:left="120" w:right="120" w:firstLine="0" w:firstLineChars="0"/>
+              <w:spacing w:after="100" w:before="100" w:line="240"/>
+              <w:ind w:left="100" w:right="100" w:firstLine="0" w:firstLineChars="0"/>
               <w:rPr>
                 <w:rFonts w:ascii="Arial" w:hAnsi="Arial" w:eastAsia="Arial" w:cs="Arial"/>
                 <w:i w:val="false"/>
@@ -4132,8 +4037,8 @@
                 <w:left w:val="none" w:sz="0" w:space="0" w:color="000000"/>
                 <w:right w:val="none" w:sz="0" w:space="0" w:color="000000"/>
               </w:pBdr>
-              <w:spacing w:after="120" w:before="120" w:line="240"/>
-              <w:ind w:left="120" w:right="120" w:firstLine="0" w:firstLineChars="0"/>
+              <w:spacing w:after="100" w:before="100" w:line="240"/>
+              <w:ind w:left="100" w:right="100" w:firstLine="0" w:firstLineChars="0"/>
               <w:rPr>
                 <w:rFonts w:ascii="Arial" w:hAnsi="Arial" w:eastAsia="Arial" w:cs="Arial"/>
                 <w:i w:val="false"/>
@@ -4162,7 +4067,39 @@
         </w:tc>
       </w:tr>
     </w:tbl>
-    <w:bookmarkEnd w:id="48"/>
+    <w:bookmarkEnd w:id="46"/>
+    <w:bookmarkEnd w:id="47"/>
+    <w:bookmarkStart w:id="49" w:name="transparency-and-openness"/>
+    <w:p>
+      <w:pPr>
+        <w:pStyle w:val="Heading2"/>
+      </w:pPr>
+      <w:r>
+        <w:t xml:space="preserve">Transparency and Openness</w:t>
+      </w:r>
+    </w:p>
+    <w:p>
+      <w:pPr>
+        <w:pStyle w:val="FirstParagraph"/>
+      </w:pPr>
+      <w:r>
+        <w:t xml:space="preserve">All data and analysis scripts are available here:</w:t>
+      </w:r>
+      <w:r>
+        <w:t xml:space="preserve"> </w:t>
+      </w:r>
+      <w:hyperlink r:id="rId48">
+        <w:r>
+          <w:rPr>
+            <w:rStyle w:val="Hyperlink"/>
+          </w:rPr>
+          <w:t xml:space="preserve">https://github.com/solvej-jaeger/eye_tracking_kalaallisut</w:t>
+        </w:r>
+      </w:hyperlink>
+      <w:r>
+        <w:t xml:space="preserve">. The study was not preregistered.</w:t>
+      </w:r>
+    </w:p>
     <w:bookmarkEnd w:id="49"/>
     <w:bookmarkEnd w:id="50"/>
     <w:bookmarkStart w:id="87" w:name="results"/>
@@ -4171,15 +4108,6 @@
         <w:pStyle w:val="Heading1"/>
       </w:pPr>
       <w:r>
-        <w:rPr>
-          <w:rStyle w:val="SectionNumber"/>
-        </w:rPr>
-        <w:t xml:space="preserve">3</w:t>
-      </w:r>
-      <w:r>
-        <w:tab/>
-      </w:r>
-      <w:r>
         <w:t xml:space="preserve">Results</w:t>
       </w:r>
     </w:p>
@@ -4202,7 +4130,7 @@
         <w:t xml:space="preserve"> </w:t>
       </w:r>
       <w:r>
-        <w:t xml:space="preserve">3.1</w:t>
+        <w:t xml:space="preserve">5</w:t>
       </w:r>
       <w:r>
         <w:rPr>
@@ -4221,7 +4149,7 @@
       <w:bookmarkStart w:id="52" w:name="tab:table5"/>
       <w:bookmarkEnd w:id="52"/>
       <w:r>
-        <w:t xml:space="preserve">Table 3.1:</w:t>
+        <w:t xml:space="preserve">Table 5:</w:t>
       </w:r>
       <w:r>
         <w:t xml:space="preserve"> </w:t>
@@ -5915,16 +5843,7 @@
         <w:pStyle w:val="Heading2"/>
       </w:pPr>
       <w:r>
-        <w:rPr>
-          <w:rStyle w:val="SectionNumber"/>
-        </w:rPr>
-        <w:t xml:space="preserve">3.1</w:t>
-      </w:r>
-      <w:r>
-        <w:tab/>
-      </w:r>
-      <w:r>
-        <w:t xml:space="preserve">Lexical and grammatical suffixes</w:t>
+        <w:t xml:space="preserve">Lexical and Grammatical Suffixes</w:t>
       </w:r>
     </w:p>
     <w:p>
@@ -5975,15 +5894,6 @@
         <w:pStyle w:val="Heading3"/>
       </w:pPr>
       <w:r>
-        <w:rPr>
-          <w:rStyle w:val="SectionNumber"/>
-        </w:rPr>
-        <w:t xml:space="preserve">3.1.1</w:t>
-      </w:r>
-      <w:r>
-        <w:tab/>
-      </w:r>
-      <w:r>
         <w:t xml:space="preserve">Skipping</w:t>
       </w:r>
     </w:p>
@@ -5998,7 +5908,7 @@
         <w:t xml:space="preserve"> </w:t>
       </w:r>
       <w:r>
-        <w:t xml:space="preserve">3.2</w:t>
+        <w:t xml:space="preserve">6</w:t>
       </w:r>
       <w:r>
         <w:t xml:space="preserve">)</w:t>
@@ -6020,7 +5930,7 @@
       <w:bookmarkStart w:id="55" w:name="tab:table6"/>
       <w:bookmarkEnd w:id="55"/>
       <w:r>
-        <w:t xml:space="preserve">Table 3.2:</w:t>
+        <w:t xml:space="preserve">Table 6:</w:t>
       </w:r>
       <w:r>
         <w:t xml:space="preserve"> </w:t>
@@ -7485,16 +7395,7 @@
         <w:pStyle w:val="Heading3"/>
       </w:pPr>
       <w:r>
-        <w:rPr>
-          <w:rStyle w:val="SectionNumber"/>
-        </w:rPr>
-        <w:t xml:space="preserve">3.1.2</w:t>
-      </w:r>
-      <w:r>
-        <w:tab/>
-      </w:r>
-      <w:r>
-        <w:t xml:space="preserve">First fixation duration</w:t>
+        <w:t xml:space="preserve">First Fixation Duration</w:t>
       </w:r>
     </w:p>
     <w:p>
@@ -7525,7 +7426,7 @@
         <w:t xml:space="preserve"> </w:t>
       </w:r>
       <w:r>
-        <w:t xml:space="preserve">3.3</w:t>
+        <w:t xml:space="preserve">7</w:t>
       </w:r>
       <w:r>
         <w:t xml:space="preserve">). The model showed a significant effect of structural status, with lexical suffixes receiving longer first fixations than grammatical ones, supporting the hypothesis. Suffix frequency had a negative effect on FFD, with more frequent suffixes receiving shorter fixations. There was also a negative effect of suffix length but again no significant effect of suffix predictability.</w:t>
@@ -7538,7 +7439,7 @@
       <w:bookmarkStart w:id="57" w:name="tab:table7"/>
       <w:bookmarkEnd w:id="57"/>
       <w:r>
-        <w:t xml:space="preserve">Table 3.3:</w:t>
+        <w:t xml:space="preserve">Table 7:</w:t>
       </w:r>
       <w:r>
         <w:t xml:space="preserve"> </w:t>
@@ -9003,16 +8904,7 @@
         <w:pStyle w:val="Heading3"/>
       </w:pPr>
       <w:r>
-        <w:rPr>
-          <w:rStyle w:val="SectionNumber"/>
-        </w:rPr>
-        <w:t xml:space="preserve">3.1.3</w:t>
-      </w:r>
-      <w:r>
-        <w:tab/>
-      </w:r>
-      <w:r>
-        <w:t xml:space="preserve">Gaze duration</w:t>
+        <w:t xml:space="preserve">Gaze Duration</w:t>
       </w:r>
     </w:p>
     <w:p>
@@ -9026,7 +8918,7 @@
         <w:t xml:space="preserve"> </w:t>
       </w:r>
       <w:r>
-        <w:t xml:space="preserve">3.4</w:t>
+        <w:t xml:space="preserve">8</w:t>
       </w:r>
       <w:r>
         <w:t xml:space="preserve">). The model revealed a significant effect of structural status, with longer GD for lexical than for grammatical suffixes, supporting the hypothesis. Suffix frequency had a negative effect on GD, with more frequent suffixes receiving shorter gaze durations. Suffix length had a positive effect, with longer gaze durations for longer suffixes. There was no significant effect of suffix predictability.</w:t>
@@ -9039,7 +8931,7 @@
       <w:bookmarkStart w:id="59" w:name="tab:table8"/>
       <w:bookmarkEnd w:id="59"/>
       <w:r>
-        <w:t xml:space="preserve">Table 3.4:</w:t>
+        <w:t xml:space="preserve">Table 8:</w:t>
       </w:r>
       <w:r>
         <w:t xml:space="preserve"> </w:t>
@@ -10505,16 +10397,7 @@
         <w:pStyle w:val="Heading2"/>
       </w:pPr>
       <w:r>
-        <w:rPr>
-          <w:rStyle w:val="SectionNumber"/>
-        </w:rPr>
-        <w:t xml:space="preserve">3.2</w:t>
-      </w:r>
-      <w:r>
-        <w:tab/>
-      </w:r>
-      <w:r>
-        <w:t xml:space="preserve">General characteristics of Kalaallisut reading</w:t>
+        <w:t xml:space="preserve">General Characteristics of Kalaallisut Reading</w:t>
       </w:r>
     </w:p>
     <w:p>
@@ -10536,7 +10419,7 @@
         <w:t xml:space="preserve"> </w:t>
       </w:r>
       <w:r>
-        <w:t xml:space="preserve">3.1</w:t>
+        <w:t xml:space="preserve">1</w:t>
       </w:r>
       <w:r>
         <w:t xml:space="preserve"> </w:t>
@@ -10563,7 +10446,7 @@
           <wp:inline>
             <wp:extent cx="3669832" cy="2752374"/>
             <wp:effectExtent b="0" l="0" r="0" t="0"/>
-            <wp:docPr descr="Figure 3.1: Fixation density as a function of word length" title="" id="64" name="Picture"/>
+            <wp:docPr descr="Figure 1: Fixation density as a function of word length" title="" id="64" name="Picture"/>
             <a:graphic>
               <a:graphicData uri="http://schemas.openxmlformats.org/drawingml/2006/picture">
                 <pic:pic>
@@ -10608,7 +10491,7 @@
       <w:bookmarkStart w:id="66" w:name="fig:figure1"/>
       <w:bookmarkEnd w:id="66"/>
       <w:r>
-        <w:t xml:space="preserve">Figure 3.1: Fixation density as a function of word length</w:t>
+        <w:t xml:space="preserve">Figure 1: Fixation density as a function of word length</w:t>
       </w:r>
     </w:p>
     <w:p>
@@ -10622,7 +10505,7 @@
         <w:t xml:space="preserve"> </w:t>
       </w:r>
       <w:r>
-        <w:t xml:space="preserve">3.2</w:t>
+        <w:t xml:space="preserve">2</w:t>
       </w:r>
       <w:r>
         <w:t xml:space="preserve"> </w:t>
@@ -10649,7 +10532,7 @@
           <wp:inline>
             <wp:extent cx="3669832" cy="1834916"/>
             <wp:effectExtent b="0" l="0" r="0" t="0"/>
-            <wp:docPr descr="Figure 3.2: Mean fixation duration per letter across target word" title="" id="69" name="Picture"/>
+            <wp:docPr descr="Figure 2: Mean fixation duration per letter across target word" title="" id="69" name="Picture"/>
             <a:graphic>
               <a:graphicData uri="http://schemas.openxmlformats.org/drawingml/2006/picture">
                 <pic:pic>
@@ -10694,7 +10577,7 @@
       <w:bookmarkStart w:id="71" w:name="fig:figure2"/>
       <w:bookmarkEnd w:id="71"/>
       <w:r>
-        <w:t xml:space="preserve">Figure 3.2: Mean fixation duration per letter across target word</w:t>
+        <w:t xml:space="preserve">Figure 2: Mean fixation duration per letter across target word</w:t>
       </w:r>
     </w:p>
     <w:p>
@@ -10708,7 +10591,7 @@
         <w:t xml:space="preserve"> </w:t>
       </w:r>
       <w:r>
-        <w:t xml:space="preserve">3.3</w:t>
+        <w:t xml:space="preserve">3</w:t>
       </w:r>
       <w:r>
         <w:t xml:space="preserve">)</w:t>
@@ -10732,7 +10615,7 @@
           <wp:inline>
             <wp:extent cx="3669832" cy="1834916"/>
             <wp:effectExtent b="0" l="0" r="0" t="0"/>
-            <wp:docPr descr="Figure 3.3: Mean fixation duration per letter across baseline word" title="" id="74" name="Picture"/>
+            <wp:docPr descr="Figure 3: Mean fixation duration per letter across baseline word" title="" id="74" name="Picture"/>
             <a:graphic>
               <a:graphicData uri="http://schemas.openxmlformats.org/drawingml/2006/picture">
                 <pic:pic>
@@ -10777,7 +10660,7 @@
       <w:bookmarkStart w:id="76" w:name="fig:figure3"/>
       <w:bookmarkEnd w:id="76"/>
       <w:r>
-        <w:t xml:space="preserve">Figure 3.3: Mean fixation duration per letter across baseline word</w:t>
+        <w:t xml:space="preserve">Figure 3: Mean fixation duration per letter across baseline word</w:t>
       </w:r>
     </w:p>
     <w:p>
@@ -10789,7 +10672,7 @@
           <wp:inline>
             <wp:extent cx="3669832" cy="1834916"/>
             <wp:effectExtent b="0" l="0" r="0" t="0"/>
-            <wp:docPr descr="Figure 3.4: Skipping rates for target suffixes and baseline words, by length. Error bars indicate standard error." title="" id="78" name="Picture"/>
+            <wp:docPr descr="Figure 4: Skipping rates for target suffixes and baseline words, by length. Error bars indicate standard error." title="" id="78" name="Picture"/>
             <a:graphic>
               <a:graphicData uri="http://schemas.openxmlformats.org/drawingml/2006/picture">
                 <pic:pic>
@@ -10834,7 +10717,7 @@
       <w:bookmarkStart w:id="80" w:name="fig:figure4"/>
       <w:bookmarkEnd w:id="80"/>
       <w:r>
-        <w:t xml:space="preserve">Figure 3.4: Skipping rates for target suffixes and baseline words, by length. Error bars indicate standard error.</w:t>
+        <w:t xml:space="preserve">Figure 4: Skipping rates for target suffixes and baseline words, by length. Error bars indicate standard error.</w:t>
       </w:r>
     </w:p>
     <w:p>
@@ -10848,7 +10731,7 @@
         <w:t xml:space="preserve"> </w:t>
       </w:r>
       <w:r>
-        <w:t xml:space="preserve">3.4</w:t>
+        <w:t xml:space="preserve">4</w:t>
       </w:r>
       <w:r>
         <w:t xml:space="preserve">). A generalized linear mixed-effects model with skipping (0/1) as dependent variable and type (target suffix/baseline word) and length as independent variables and with random intercepts for participants confirmed that this difference was statistically significant (</w:t>
@@ -10890,7 +10773,7 @@
           <wp:inline>
             <wp:extent cx="3669832" cy="1834916"/>
             <wp:effectExtent b="0" l="0" r="0" t="0"/>
-            <wp:docPr descr="Figure 3.5: Regression rates for roots, target suffixes and baseline words. Error bars indicate standard error." title="" id="82" name="Picture"/>
+            <wp:docPr descr="Figure 5: Regression rates for roots, target suffixes and baseline words. Error bars indicate standard error." title="" id="82" name="Picture"/>
             <a:graphic>
               <a:graphicData uri="http://schemas.openxmlformats.org/drawingml/2006/picture">
                 <pic:pic>
@@ -10935,7 +10818,7 @@
       <w:bookmarkStart w:id="84" w:name="fig:figure5"/>
       <w:bookmarkEnd w:id="84"/>
       <w:r>
-        <w:t xml:space="preserve">Figure 3.5: Regression rates for roots, target suffixes and baseline words. Error bars indicate standard error.</w:t>
+        <w:t xml:space="preserve">Figure 5: Regression rates for roots, target suffixes and baseline words. Error bars indicate standard error.</w:t>
       </w:r>
     </w:p>
     <w:p>
@@ -10949,7 +10832,7 @@
         <w:t xml:space="preserve"> </w:t>
       </w:r>
       <w:r>
-        <w:t xml:space="preserve">3.5</w:t>
+        <w:t xml:space="preserve">5</w:t>
       </w:r>
       <w:r>
         <w:t xml:space="preserve">). We found that the roots in the target words were regressed to more often than the target suffixes, and that baseline words were regressed to less often than the target suffixes. A generalized linear mixed-effects model with regression (0/1) as dependent variable and type (root/suffix/baseline word) and skipping status (whether the region had been skipped</w:t>
@@ -11021,7 +10904,7 @@
         <w:t xml:space="preserve"> </w:t>
       </w:r>
       <w:r>
-        <w:t xml:space="preserve">3.1</w:t>
+        <w:t xml:space="preserve">1</w:t>
       </w:r>
       <w:r>
         <w:t xml:space="preserve"> </w:t>
@@ -11033,7 +10916,7 @@
         <w:t xml:space="preserve"> </w:t>
       </w:r>
       <w:r>
-        <w:t xml:space="preserve">3.2</w:t>
+        <w:t xml:space="preserve">2</w:t>
       </w:r>
       <w:r>
         <w:t xml:space="preserve">, as regressions to a region lead to a higher fixation density on that region.</w:t>
@@ -11055,15 +10938,6 @@
         <w:pStyle w:val="Heading1"/>
       </w:pPr>
       <w:r>
-        <w:rPr>
-          <w:rStyle w:val="SectionNumber"/>
-        </w:rPr>
-        <w:t xml:space="preserve">4</w:t>
-      </w:r>
-      <w:r>
-        <w:tab/>
-      </w:r>
-      <w:r>
         <w:t xml:space="preserve">Discussion</w:t>
       </w:r>
     </w:p>
@@ -11122,16 +10996,7 @@
         <w:pStyle w:val="Heading2"/>
       </w:pPr>
       <w:r>
-        <w:rPr>
-          <w:rStyle w:val="SectionNumber"/>
-        </w:rPr>
-        <w:t xml:space="preserve">4.1</w:t>
-      </w:r>
-      <w:r>
-        <w:tab/>
-      </w:r>
-      <w:r>
-        <w:t xml:space="preserve">Lexical vs. grammatical suffixes</w:t>
+        <w:t xml:space="preserve">Lexical vs. Grammatical Suffixes</w:t>
       </w:r>
     </w:p>
     <w:p>
@@ -11168,16 +11033,7 @@
         <w:t xml:space="preserve">(Staub, 2024)</w:t>
       </w:r>
       <w:r>
-        <w:t xml:space="preserve">. Within our theoretical framework, grammatical suffixes would likewise in principle be expected to be skipped more often than lexical suffixes. However, skipping constitutes a relatively indirect and noisy measure of attention allocation. The decision to skip a suffix depends both on the degree to which the suffix has been processed parafoveally and on whether that processing is deemed sufficient to forego direct fixation. Degree of parafoveal processing is influenced by multiple factors, including properties such as frequency and predictability of both the root and the suffix. In Kalaallisut, morpheme skipping rates may also be influenced by the difficulty of identifying morpheme boundaries parafoveally, as these boundaries are not visually marked (see further discussion in section</w:t>
-      </w:r>
-      <w:r>
-        <w:t xml:space="preserve"> </w:t>
-      </w:r>
-      <w:r>
-        <w:t xml:space="preserve">4.5</w:t>
-      </w:r>
-      <w:r>
-        <w:t xml:space="preserve">). Against this background, the absence of a structural-status effect on skipping does not undermine the fixation-time findings. Notably, a similar dissociation between fixation-duration measures and skipping probability was observed by</w:t>
+        <w:t xml:space="preserve">. Within our theoretical framework, grammatical suffixes would likewise in principle be expected to be skipped more often than lexical suffixes. However, skipping constitutes a relatively indirect and noisy measure of attention allocation. The decision to skip a suffix depends both on the degree to which the suffix has been processed parafoveally and on whether that processing is deemed sufficient to forego direct fixation. Degree of parafoveal processing is influenced by multiple factors, including properties such as frequency and predictability of both the root and the suffix. In Kalaallisut, morpheme skipping rates may also be influenced by the difficulty of identifying morpheme boundaries parafoveally, as these boundaries are not visually marked (see further discussion in the section Differences between reading of suffixes and words). Against this background, the absence of a structural-status effect on skipping does not undermine the fixation-time findings. Notably, a similar dissociation between fixation-duration measures and skipping probability was observed by</w:t>
       </w:r>
       <w:r>
         <w:t xml:space="preserve"> </w:t>
@@ -11257,16 +11113,7 @@
         <w:pStyle w:val="Heading2"/>
       </w:pPr>
       <w:r>
-        <w:rPr>
-          <w:rStyle w:val="SectionNumber"/>
-        </w:rPr>
-        <w:t xml:space="preserve">4.2</w:t>
-      </w:r>
-      <w:r>
-        <w:tab/>
-      </w:r>
-      <w:r>
-        <w:t xml:space="preserve">Morphemes as processing units</w:t>
+        <w:t xml:space="preserve">Morphemes as Processing Units</w:t>
       </w:r>
     </w:p>
     <w:p>
@@ -11274,16 +11121,7 @@
         <w:pStyle w:val="FirstParagraph"/>
       </w:pPr>
       <w:r>
-        <w:t xml:space="preserve">Beyond the effects of structural status, the suffix-level analyses revealed robust effects of frequency and length: More frequent suffixes were skipped more often and received shorter fixation times, whereas longer suffixes were skipped less frequently and attracted longer gaze durations. As mentioned in section</w:t>
-      </w:r>
-      <w:r>
-        <w:t xml:space="preserve"> </w:t>
-      </w:r>
-      <w:r>
-        <w:t xml:space="preserve">4</w:t>
-      </w:r>
-      <w:r>
-        <w:t xml:space="preserve">, these patterns closely mirror well-established word-level effects reported for other languages</w:t>
+        <w:t xml:space="preserve">Beyond the effects of structural status, the suffix-level analyses revealed robust effects of frequency and length: More frequent suffixes were skipped more often and received shorter fixation times, whereas longer suffixes were skipped less frequently and attracted longer gaze durations. As mentioned above, these patterns closely mirror well-established word-level effects reported for other languages</w:t>
       </w:r>
       <w:r>
         <w:t xml:space="preserve"> </w:t>
@@ -11356,16 +11194,7 @@
         <w:pStyle w:val="Heading2"/>
       </w:pPr>
       <w:r>
-        <w:rPr>
-          <w:rStyle w:val="SectionNumber"/>
-        </w:rPr>
-        <w:t xml:space="preserve">4.3</w:t>
-      </w:r>
-      <w:r>
-        <w:tab/>
-      </w:r>
-      <w:r>
-        <w:t xml:space="preserve">Word length and fixation density</w:t>
+        <w:t xml:space="preserve">Word Length and Fixation Density</w:t>
       </w:r>
     </w:p>
     <w:p>
@@ -11379,7 +11208,7 @@
         <w:t xml:space="preserve"> </w:t>
       </w:r>
       <w:r>
-        <w:t xml:space="preserve">3.1</w:t>
+        <w:t xml:space="preserve">1</w:t>
       </w:r>
       <w:r>
         <w:t xml:space="preserve">, fixation density exhibits a U-shaped relationship with word length, with a minimum at approximately nine letters, a pattern that is observed for both fast and slow readers (see Supplementary Materials). Beyond nine letters, fixation density increases with increasing word length, suggesting that reading long words in Kalaallisut imposes a high processing load on the reader. This may reflect morphological processes, as word length in Kalaallisut often correlates with morphological complexity. In line with this, suffixes within the multi-morphemic target words were skipped less and regressed to more frequently than the morphologically simple baseline words of similar length.</w:t>
@@ -11429,16 +11258,7 @@
         <w:pStyle w:val="Heading2"/>
       </w:pPr>
       <w:r>
-        <w:rPr>
-          <w:rStyle w:val="SectionNumber"/>
-        </w:rPr>
-        <w:t xml:space="preserve">4.4</w:t>
-      </w:r>
-      <w:r>
-        <w:tab/>
-      </w:r>
-      <w:r>
-        <w:t xml:space="preserve">Asymmetric attention distribution</w:t>
+        <w:t xml:space="preserve">Asymmetric Attention Distribution</w:t>
       </w:r>
     </w:p>
     <w:p>
@@ -11452,7 +11272,7 @@
         <w:t xml:space="preserve"> </w:t>
       </w:r>
       <w:r>
-        <w:t xml:space="preserve">3.2</w:t>
+        <w:t xml:space="preserve">2</w:t>
       </w:r>
       <w:r>
         <w:t xml:space="preserve">) exhibits a clear asymmetry, with morphemes later in the word receiving less attention than those earlier in the word. Several, partly interacting factors may account for this pattern. One possible contributor is frequency: Many suffixes are considerably more frequent than roots, potentially facilitating faster processing (although a mixed-effects model of fixation density across word regions that includes frequency as a predictor indicates that frequency alone does not account for the observed pattern; see Supplementary Materials). Another possible contributing factor is word-final position: The inflection’s position next to a space may make it easier to identify parafoveally than the suffixes embedded in the middle of the word, increasing the likelihood of skipping.</w:t>
@@ -11498,16 +11318,7 @@
         <w:pStyle w:val="Heading2"/>
       </w:pPr>
       <w:r>
-        <w:rPr>
-          <w:rStyle w:val="SectionNumber"/>
-        </w:rPr>
-        <w:t xml:space="preserve">4.5</w:t>
-      </w:r>
-      <w:r>
-        <w:tab/>
-      </w:r>
-      <w:r>
-        <w:t xml:space="preserve">Differences between reading of suffixes and words</w:t>
+        <w:t xml:space="preserve">Differences between Reading of Suffixes and Words</w:t>
       </w:r>
     </w:p>
     <w:p>
@@ -11521,7 +11332,7 @@
         <w:t xml:space="preserve"> </w:t>
       </w:r>
       <w:r>
-        <w:t xml:space="preserve">3.2</w:t>
+        <w:t xml:space="preserve">2</w:t>
       </w:r>
       <w:r>
         <w:t xml:space="preserve">) clearly shows that reading a four-morpheme Kalaallisut word is not simply equivalent to reading three or four independent words. Instead, morphemes are processed within a structured and highly asymmetric attentional landscape shaped by morphological organization and visual position. Comparing the profiles of attention distribution within words (Figures</w:t>
@@ -11530,7 +11341,7 @@
         <w:t xml:space="preserve"> </w:t>
       </w:r>
       <w:r>
-        <w:t xml:space="preserve">3.2</w:t>
+        <w:t xml:space="preserve">2</w:t>
       </w:r>
       <w:r>
         <w:t xml:space="preserve"> </w:t>
@@ -11542,7 +11353,7 @@
         <w:t xml:space="preserve"> </w:t>
       </w:r>
       <w:r>
-        <w:t xml:space="preserve">3.3</w:t>
+        <w:t xml:space="preserve">3</w:t>
       </w:r>
       <w:r>
         <w:t xml:space="preserve">) further highlights this distinction: While fixation patterns for the morphologically simple baseline words show a characteristic peak in the second quartile of the word, suffixes do not exhibit a comparable pattern. Thus, reading suffixes cannot be equated with reading independent words.</w:t>
@@ -11559,7 +11370,7 @@
         <w:t xml:space="preserve"> </w:t>
       </w:r>
       <w:r>
-        <w:t xml:space="preserve">3.4</w:t>
+        <w:t xml:space="preserve">4</w:t>
       </w:r>
       <w:r>
         <w:t xml:space="preserve">). Even though the baseline words were selected to match the target suffixes in morphological complexity and structural status, they were skipped more frequently than the suffixes. This is noteworthy because suffixes are, if anything, more predictable than words, given the limited inventory of suffixes in the language</w:t>
@@ -11602,7 +11413,7 @@
         <w:t xml:space="preserve"> </w:t>
       </w:r>
       <w:r>
-        <w:t xml:space="preserve">3.1</w:t>
+        <w:t xml:space="preserve">1</w:t>
       </w:r>
       <w:r>
         <w:t xml:space="preserve">) – suggest that reading multi-morphemic words in Kalaallisut places relatively high demands on the processing system. Given that such words are pervasive in the language, this raises the broader question of whether reading Kalaallisut is, all else being equal, more resource demanding than reading languages characterized by shorter words, such as English. This question remains open and requires targeted cross-linguistic investigation. Nevertheless, it is noteworthy that many native speakers of Kalaallisut prefer reading in Danish or English when given the choice, despite the widespread use of Kalaallisut text in schools and the media in Greenland. In the present study, 35 participants (67%) reported reading Kalaallisut every day, yet only 25 of these 35 identified Kalaallisut as one of their preferred languages for reading.</w:t>
@@ -11631,15 +11442,6 @@
       <w:pPr>
         <w:pStyle w:val="Heading1"/>
       </w:pPr>
-      <w:r>
-        <w:rPr>
-          <w:rStyle w:val="SectionNumber"/>
-        </w:rPr>
-        <w:t xml:space="preserve">5</w:t>
-      </w:r>
-      <w:r>
-        <w:tab/>
-      </w:r>
       <w:r>
         <w:t xml:space="preserve">Conclusions</w:t>
       </w:r>
@@ -14467,9 +14269,11 @@
     <w:bookmarkEnd w:id="177"/>
     <w:bookmarkEnd w:id="178"/>
     <w:sectPr>
-      <w:footnotePr>
-        <w:numRestart w:val="eachSect"/>
-      </w:footnotePr>
+      <w:footerReference r:id="rId9" w:type="default"/>
+      <w:pgSz w:h="16838" w:w="11906"/>
+      <w:pgMar w:bottom="1440" w:footer="708" w:gutter="0" w:header="708" w:left="1440" w:right="1440" w:top="1440"/>
+      <w:cols w:space="708"/>
+      <w:docGrid w:linePitch="360"/>
     </w:sectPr>
   </w:body>
 </w:document>
@@ -14479,6 +14283,48 @@
 <w:comments xmlns:w="http://schemas.openxmlformats.org/wordprocessingml/2006/main" xmlns:m="http://schemas.openxmlformats.org/officeDocument/2006/math" xmlns:r="http://schemas.openxmlformats.org/officeDocument/2006/relationships" xmlns:o="urn:schemas-microsoft-com:office:office" xmlns:v="urn:schemas-microsoft-com:vml" xmlns:w10="urn:schemas-microsoft-com:office:word" xmlns:a="http://schemas.openxmlformats.org/drawingml/2006/main" xmlns:pic="http://schemas.openxmlformats.org/drawingml/2006/picture" xmlns:wp="http://schemas.openxmlformats.org/drawingml/2006/wordprocessingDrawing"/>
 </file>
 
+<file path=word/footer1.xml><?xml version="1.0" encoding="utf-8"?>
+<w:ftr xmlns:wpc="http://schemas.microsoft.com/office/word/2010/wordprocessingCanvas" xmlns:cx="http://schemas.microsoft.com/office/drawing/2014/chartex" xmlns:cx1="http://schemas.microsoft.com/office/drawing/2015/9/8/chartex" xmlns:cx2="http://schemas.microsoft.com/office/drawing/2015/10/21/chartex" xmlns:cx3="http://schemas.microsoft.com/office/drawing/2016/5/9/chartex" xmlns:cx4="http://schemas.microsoft.com/office/drawing/2016/5/10/chartex" xmlns:cx5="http://schemas.microsoft.com/office/drawing/2016/5/11/chartex" xmlns:cx6="http://schemas.microsoft.com/office/drawing/2016/5/12/chartex" xmlns:cx7="http://schemas.microsoft.com/office/drawing/2016/5/13/chartex" xmlns:cx8="http://schemas.microsoft.com/office/drawing/2016/5/14/chartex" xmlns:mc="http://schemas.openxmlformats.org/markup-compatibility/2006" xmlns:aink="http://schemas.microsoft.com/office/drawing/2016/ink" xmlns:am3d="http://schemas.microsoft.com/office/drawing/2017/model3d" xmlns:o="urn:schemas-microsoft-com:office:office" xmlns:oel="http://schemas.microsoft.com/office/2019/extlst" xmlns:r="http://schemas.openxmlformats.org/officeDocument/2006/relationships" xmlns:m="http://schemas.openxmlformats.org/officeDocument/2006/math" xmlns:v="urn:schemas-microsoft-com:vml" xmlns:wp14="http://schemas.microsoft.com/office/word/2010/wordprocessingDrawing" xmlns:wp="http://schemas.openxmlformats.org/drawingml/2006/wordprocessingDrawing" xmlns:w10="urn:schemas-microsoft-com:office:word" xmlns:w="http://schemas.openxmlformats.org/wordprocessingml/2006/main" xmlns:w14="http://schemas.microsoft.com/office/word/2010/wordml" xmlns:w15="http://schemas.microsoft.com/office/word/2012/wordml" xmlns:w16cex="http://schemas.microsoft.com/office/word/2018/wordml/cex" xmlns:w16cid="http://schemas.microsoft.com/office/word/2016/wordml/cid" xmlns:w16="http://schemas.microsoft.com/office/word/2018/wordml" xmlns:w16du="http://schemas.microsoft.com/office/word/2023/wordml/word16du" xmlns:w16sdtdh="http://schemas.microsoft.com/office/word/2020/wordml/sdtdatahash" xmlns:w16sdtfl="http://schemas.microsoft.com/office/word/2024/wordml/sdtformatlock" xmlns:w16se="http://schemas.microsoft.com/office/word/2015/wordml/symex" xmlns:wpg="http://schemas.microsoft.com/office/word/2010/wordprocessingGroup" xmlns:wpi="http://schemas.microsoft.com/office/word/2010/wordprocessingInk" xmlns:wne="http://schemas.microsoft.com/office/word/2006/wordml" xmlns:wps="http://schemas.microsoft.com/office/word/2010/wordprocessingShape" mc:Ignorable="w14 w15 w16se w16cid w16 w16cex w16sdtdh w16sdtfl w16du wp14">
+  <w:sdt>
+    <w:sdtPr>
+      <w:id w:val="1514493650"/>
+      <w:docPartObj>
+        <w:docPartGallery w:val="Page Numbers (Bottom of Page)"/>
+        <w:docPartUnique/>
+      </w:docPartObj>
+    </w:sdtPr>
+    <w:sdtContent>
+      <w:p>
+        <w:pPr>
+          <w:pStyle w:val="Footer"/>
+          <w:jc w:val="right"/>
+        </w:pPr>
+        <w:r>
+          <w:fldChar w:fldCharType="begin"/>
+        </w:r>
+        <w:r>
+          <w:instrText>PAGE   \* MERGEFORMAT</w:instrText>
+        </w:r>
+        <w:r>
+          <w:fldChar w:fldCharType="separate"/>
+        </w:r>
+        <w:r>
+          <w:t>2</w:t>
+        </w:r>
+        <w:r>
+          <w:fldChar w:fldCharType="end"/>
+        </w:r>
+      </w:p>
+    </w:sdtContent>
+  </w:sdt>
+  <w:p>
+    <w:pPr>
+      <w:pStyle w:val="Footer"/>
+    </w:pPr>
+  </w:p>
+</w:ftr>
+</file>
+
 <file path=word/footnotes.xml><?xml version="1.0" encoding="utf-8"?>
 <w:footnotes xmlns:w="http://schemas.openxmlformats.org/wordprocessingml/2006/main" xmlns:m="http://schemas.openxmlformats.org/officeDocument/2006/math" xmlns:r="http://schemas.openxmlformats.org/officeDocument/2006/relationships" xmlns:o="urn:schemas-microsoft-com:office:office" xmlns:v="urn:schemas-microsoft-com:vml" xmlns:w10="urn:schemas-microsoft-com:office:word" xmlns:a="http://schemas.openxmlformats.org/drawingml/2006/main" xmlns:pic="http://schemas.openxmlformats.org/drawingml/2006/picture" xmlns:wp="http://schemas.openxmlformats.org/drawingml/2006/wordprocessingDrawing">
   <w:footnote w:type="continuationSeparator" w:id="0">
@@ -14514,6 +14360,25 @@
       </w:r>
     </w:p>
   </w:footnote>
+  <w:footnote w:id="34">
+    <w:p>
+      <w:pPr>
+        <w:pStyle w:val="FootnoteText"/>
+      </w:pPr>
+      <w:r>
+        <w:rPr>
+          <w:rStyle w:val="FootnoteReference"/>
+        </w:rPr>
+        <w:footnoteRef/>
+      </w:r>
+      <w:r>
+        <w:t xml:space="preserve"> </w:t>
+      </w:r>
+      <w:r>
+        <w:t xml:space="preserve">One of the participants only completed half of the experiment due to physical discomfort.</w:t>
+      </w:r>
+    </w:p>
+  </w:footnote>
   <w:footnote w:id="36">
     <w:p>
       <w:pPr>
@@ -14529,11 +14394,11 @@
         <w:t xml:space="preserve"> </w:t>
       </w:r>
       <w:r>
-        <w:t xml:space="preserve">One of the participants only completed half of the experiment due to physical discomfort.</w:t>
+        <w:t xml:space="preserve">For two participants, it was not possible to calibrate the tracker using the right eye. In these two cases, the left eye was tracked instead.</w:t>
       </w:r>
     </w:p>
   </w:footnote>
-  <w:footnote w:id="38">
+  <w:footnote w:id="37">
     <w:p>
       <w:pPr>
         <w:pStyle w:val="FootnoteText"/>
@@ -14548,30 +14413,11 @@
         <w:t xml:space="preserve"> </w:t>
       </w:r>
       <w:r>
-        <w:t xml:space="preserve">For two participants, it was not possible to calibrate the tracker using the right eye. In these two cases, the left eye was tracked instead.</w:t>
+        <w:t xml:space="preserve">Two different monitors were used because the first 40 participants were tested in Greenland and the last 12 in Denmark.</w:t>
       </w:r>
     </w:p>
   </w:footnote>
-  <w:footnote w:id="39">
-    <w:p>
-      <w:pPr>
-        <w:pStyle w:val="FootnoteText"/>
-      </w:pPr>
-      <w:r>
-        <w:rPr>
-          <w:rStyle w:val="FootnoteReference"/>
-        </w:rPr>
-        <w:footnoteRef/>
-      </w:r>
-      <w:r>
-        <w:t xml:space="preserve"> </w:t>
-      </w:r>
-      <w:r>
-        <w:t xml:space="preserve">Two different monitors were used because the first 40 participants were tested in Greenland and the last 12 in Denmark.</w:t>
-      </w:r>
-    </w:p>
-  </w:footnote>
-  <w:footnote w:id="42">
+  <w:footnote w:id="40">
     <w:p>
       <w:pPr>
         <w:pStyle w:val="FootnoteText"/>
@@ -14638,7 +14484,7 @@
       <w:r>
         <w:t xml:space="preserve"> </w:t>
       </w:r>
-      <w:hyperlink r:id="rId34">
+      <w:hyperlink r:id="rId48">
         <w:r>
           <w:rPr>
             <w:rStyle w:val="Hyperlink"/>
@@ -15428,214 +15274,439 @@
 </file>
 
 <file path=word/styles.xml><?xml version="1.0" encoding="utf-8"?>
-<w:styles xmlns:r="http://schemas.openxmlformats.org/officeDocument/2006/relationships" xmlns:w="http://schemas.openxmlformats.org/wordprocessingml/2006/main">
+<w:styles xmlns:mc="http://schemas.openxmlformats.org/markup-compatibility/2006" xmlns:r="http://schemas.openxmlformats.org/officeDocument/2006/relationships" xmlns:w="http://schemas.openxmlformats.org/wordprocessingml/2006/main" xmlns:w14="http://schemas.microsoft.com/office/word/2010/wordml" xmlns:w15="http://schemas.microsoft.com/office/word/2012/wordml" xmlns:w16="http://schemas.microsoft.com/office/word/2018/wordml" xmlns:w16cex="http://schemas.microsoft.com/office/word/2018/wordml/cex" xmlns:w16cid="http://schemas.microsoft.com/office/word/2016/wordml/cid" xmlns:w16du="http://schemas.microsoft.com/office/word/2023/wordml/word16du" xmlns:w16sdtdh="http://schemas.microsoft.com/office/word/2020/wordml/sdtdatahash" xmlns:w16sdtfl="http://schemas.microsoft.com/office/word/2024/wordml/sdtformatlock" xmlns:w16se="http://schemas.microsoft.com/office/word/2015/wordml/symex" mc:Ignorable="w14 w15 w16se w16cid w16 w16cex w16sdtdh w16sdtfl w16du">
   <w:docDefaults>
     <w:rPrDefault>
       <w:rPr>
         <w:rFonts w:asciiTheme="minorHAnsi" w:cstheme="minorBidi" w:eastAsiaTheme="minorHAnsi" w:hAnsiTheme="minorHAnsi"/>
-        <w:sz w:val="24"/>
-        <w:szCs w:val="24"/>
-        <w:lang w:bidi="ar-SA" w:eastAsia="en-US" w:val="en-US"/>
+        <w:sz w:val="22"/>
+        <w:szCs w:val="22"/>
+        <w:lang w:bidi="ar-SA" w:eastAsia="en-US" w:val="da-DK"/>
       </w:rPr>
     </w:rPrDefault>
     <w:pPrDefault>
       <w:pPr>
-        <w:spacing w:after="200"/>
+        <w:spacing w:after="160" w:line="259" w:lineRule="auto"/>
       </w:pPr>
     </w:pPrDefault>
   </w:docDefaults>
-  <w:latentStyles w:count="276" w:defLockedState="0" w:defQFormat="0" w:defSemiHidden="0" w:defUIPriority="0" w:defUnhideWhenUsed="0"/>
+  <w:latentStyles w:count="376" w:defLockedState="0" w:defQFormat="0" w:defSemiHidden="0" w:defUIPriority="99" w:defUnhideWhenUsed="0">
+    <w:lsdException w:name="Normal" w:qFormat="1" w:uiPriority="0"/>
+    <w:lsdException w:name="heading 1" w:qFormat="1" w:uiPriority="9"/>
+    <w:lsdException w:name="heading 2" w:qFormat="1" w:semiHidden="1" w:uiPriority="9" w:unhideWhenUsed="1"/>
+    <w:lsdException w:name="heading 3" w:qFormat="1" w:semiHidden="1" w:uiPriority="9" w:unhideWhenUsed="1"/>
+    <w:lsdException w:name="heading 4" w:qFormat="1" w:semiHidden="1" w:uiPriority="9" w:unhideWhenUsed="1"/>
+    <w:lsdException w:name="heading 5" w:qFormat="1" w:semiHidden="1" w:uiPriority="9" w:unhideWhenUsed="1"/>
+    <w:lsdException w:name="heading 6" w:qFormat="1" w:semiHidden="1" w:uiPriority="9" w:unhideWhenUsed="1"/>
+    <w:lsdException w:name="heading 7" w:qFormat="1" w:semiHidden="1" w:uiPriority="9" w:unhideWhenUsed="1"/>
+    <w:lsdException w:name="heading 8" w:qFormat="1" w:semiHidden="1" w:uiPriority="9" w:unhideWhenUsed="1"/>
+    <w:lsdException w:name="heading 9" w:qFormat="1" w:semiHidden="1" w:uiPriority="9" w:unhideWhenUsed="1"/>
+    <w:lsdException w:name="index 1" w:semiHidden="1" w:unhideWhenUsed="1"/>
+    <w:lsdException w:name="index 2" w:semiHidden="1" w:unhideWhenUsed="1"/>
+    <w:lsdException w:name="index 3" w:semiHidden="1" w:unhideWhenUsed="1"/>
+    <w:lsdException w:name="index 4" w:semiHidden="1" w:unhideWhenUsed="1"/>
+    <w:lsdException w:name="index 5" w:semiHidden="1" w:unhideWhenUsed="1"/>
+    <w:lsdException w:name="index 6" w:semiHidden="1" w:unhideWhenUsed="1"/>
+    <w:lsdException w:name="index 7" w:semiHidden="1" w:unhideWhenUsed="1"/>
+    <w:lsdException w:name="index 8" w:semiHidden="1" w:unhideWhenUsed="1"/>
+    <w:lsdException w:name="index 9" w:semiHidden="1" w:unhideWhenUsed="1"/>
+    <w:lsdException w:name="toc 1" w:semiHidden="1" w:uiPriority="39" w:unhideWhenUsed="1"/>
+    <w:lsdException w:name="toc 2" w:semiHidden="1" w:uiPriority="39" w:unhideWhenUsed="1"/>
+    <w:lsdException w:name="toc 3" w:semiHidden="1" w:uiPriority="39" w:unhideWhenUsed="1"/>
+    <w:lsdException w:name="toc 4" w:semiHidden="1" w:uiPriority="39" w:unhideWhenUsed="1"/>
+    <w:lsdException w:name="toc 5" w:semiHidden="1" w:uiPriority="39" w:unhideWhenUsed="1"/>
+    <w:lsdException w:name="toc 6" w:semiHidden="1" w:uiPriority="39" w:unhideWhenUsed="1"/>
+    <w:lsdException w:name="toc 7" w:semiHidden="1" w:uiPriority="39" w:unhideWhenUsed="1"/>
+    <w:lsdException w:name="toc 8" w:semiHidden="1" w:uiPriority="39" w:unhideWhenUsed="1"/>
+    <w:lsdException w:name="toc 9" w:semiHidden="1" w:uiPriority="39" w:unhideWhenUsed="1"/>
+    <w:lsdException w:name="Normal Indent" w:semiHidden="1" w:unhideWhenUsed="1"/>
+    <w:lsdException w:name="footnote text" w:semiHidden="1" w:unhideWhenUsed="1"/>
+    <w:lsdException w:name="annotation text" w:semiHidden="1" w:unhideWhenUsed="1"/>
+    <w:lsdException w:name="header" w:semiHidden="1" w:unhideWhenUsed="1"/>
+    <w:lsdException w:name="footer" w:semiHidden="1" w:unhideWhenUsed="1"/>
+    <w:lsdException w:name="index heading" w:semiHidden="1" w:unhideWhenUsed="1"/>
+    <w:lsdException w:name="caption" w:qFormat="1" w:semiHidden="1" w:uiPriority="35" w:unhideWhenUsed="1"/>
+    <w:lsdException w:name="table of figures" w:semiHidden="1" w:unhideWhenUsed="1"/>
+    <w:lsdException w:name="envelope address" w:semiHidden="1" w:unhideWhenUsed="1"/>
+    <w:lsdException w:name="envelope return" w:semiHidden="1" w:unhideWhenUsed="1"/>
+    <w:lsdException w:name="footnote reference" w:semiHidden="1" w:unhideWhenUsed="1"/>
+    <w:lsdException w:name="annotation reference" w:semiHidden="1" w:unhideWhenUsed="1"/>
+    <w:lsdException w:name="line number" w:semiHidden="1" w:unhideWhenUsed="1"/>
+    <w:lsdException w:name="page number" w:semiHidden="1" w:unhideWhenUsed="1"/>
+    <w:lsdException w:name="endnote reference" w:semiHidden="1" w:unhideWhenUsed="1"/>
+    <w:lsdException w:name="endnote text" w:semiHidden="1" w:unhideWhenUsed="1"/>
+    <w:lsdException w:name="table of authorities" w:semiHidden="1" w:unhideWhenUsed="1"/>
+    <w:lsdException w:name="macro" w:semiHidden="1" w:unhideWhenUsed="1"/>
+    <w:lsdException w:name="toa heading" w:semiHidden="1" w:unhideWhenUsed="1"/>
+    <w:lsdException w:name="List" w:semiHidden="1" w:unhideWhenUsed="1"/>
+    <w:lsdException w:name="List Bullet" w:semiHidden="1" w:unhideWhenUsed="1"/>
+    <w:lsdException w:name="List Number" w:semiHidden="1" w:unhideWhenUsed="1"/>
+    <w:lsdException w:name="List 2" w:semiHidden="1" w:unhideWhenUsed="1"/>
+    <w:lsdException w:name="List 3" w:semiHidden="1" w:unhideWhenUsed="1"/>
+    <w:lsdException w:name="List 4" w:semiHidden="1" w:unhideWhenUsed="1"/>
+    <w:lsdException w:name="List 5" w:semiHidden="1" w:unhideWhenUsed="1"/>
+    <w:lsdException w:name="List Bullet 2" w:semiHidden="1" w:unhideWhenUsed="1"/>
+    <w:lsdException w:name="List Bullet 3" w:semiHidden="1" w:unhideWhenUsed="1"/>
+    <w:lsdException w:name="List Bullet 4" w:semiHidden="1" w:unhideWhenUsed="1"/>
+    <w:lsdException w:name="List Bullet 5" w:semiHidden="1" w:unhideWhenUsed="1"/>
+    <w:lsdException w:name="List Number 2" w:semiHidden="1" w:unhideWhenUsed="1"/>
+    <w:lsdException w:name="List Number 3" w:semiHidden="1" w:unhideWhenUsed="1"/>
+    <w:lsdException w:name="List Number 4" w:semiHidden="1" w:unhideWhenUsed="1"/>
+    <w:lsdException w:name="List Number 5" w:semiHidden="1" w:unhideWhenUsed="1"/>
+    <w:lsdException w:name="Title" w:qFormat="1" w:uiPriority="10"/>
+    <w:lsdException w:name="Closing" w:semiHidden="1" w:unhideWhenUsed="1"/>
+    <w:lsdException w:name="Signature" w:semiHidden="1" w:unhideWhenUsed="1"/>
+    <w:lsdException w:name="Default Paragraph Font" w:semiHidden="1" w:uiPriority="1" w:unhideWhenUsed="1"/>
+    <w:lsdException w:name="Body Text" w:semiHidden="1" w:unhideWhenUsed="1"/>
+    <w:lsdException w:name="Body Text Indent" w:semiHidden="1" w:unhideWhenUsed="1"/>
+    <w:lsdException w:name="List Continue" w:semiHidden="1" w:unhideWhenUsed="1"/>
+    <w:lsdException w:name="List Continue 2" w:semiHidden="1" w:unhideWhenUsed="1"/>
+    <w:lsdException w:name="List Continue 3" w:semiHidden="1" w:unhideWhenUsed="1"/>
+    <w:lsdException w:name="List Continue 4" w:semiHidden="1" w:unhideWhenUsed="1"/>
+    <w:lsdException w:name="List Continue 5" w:semiHidden="1" w:unhideWhenUsed="1"/>
+    <w:lsdException w:name="Message Header" w:semiHidden="1" w:unhideWhenUsed="1"/>
+    <w:lsdException w:name="Subtitle" w:qFormat="1" w:uiPriority="11"/>
+    <w:lsdException w:name="Salutation" w:semiHidden="1" w:unhideWhenUsed="1"/>
+    <w:lsdException w:name="Date" w:semiHidden="1" w:unhideWhenUsed="1"/>
+    <w:lsdException w:name="Body Text First Indent" w:semiHidden="1" w:unhideWhenUsed="1"/>
+    <w:lsdException w:name="Body Text First Indent 2" w:semiHidden="1" w:unhideWhenUsed="1"/>
+    <w:lsdException w:name="Note Heading" w:semiHidden="1" w:unhideWhenUsed="1"/>
+    <w:lsdException w:name="Body Text 2" w:semiHidden="1" w:unhideWhenUsed="1"/>
+    <w:lsdException w:name="Body Text 3" w:semiHidden="1" w:unhideWhenUsed="1"/>
+    <w:lsdException w:name="Body Text Indent 2" w:semiHidden="1" w:unhideWhenUsed="1"/>
+    <w:lsdException w:name="Body Text Indent 3" w:semiHidden="1" w:unhideWhenUsed="1"/>
+    <w:lsdException w:name="Block Text" w:semiHidden="1" w:unhideWhenUsed="1"/>
+    <w:lsdException w:name="Hyperlink" w:semiHidden="1" w:unhideWhenUsed="1"/>
+    <w:lsdException w:name="FollowedHyperlink" w:semiHidden="1" w:unhideWhenUsed="1"/>
+    <w:lsdException w:name="Strong" w:qFormat="1" w:uiPriority="22"/>
+    <w:lsdException w:name="Emphasis" w:qFormat="1" w:uiPriority="20"/>
+    <w:lsdException w:name="Document Map" w:semiHidden="1" w:unhideWhenUsed="1"/>
+    <w:lsdException w:name="Plain Text" w:semiHidden="1" w:unhideWhenUsed="1"/>
+    <w:lsdException w:name="E-mail Signature" w:semiHidden="1" w:unhideWhenUsed="1"/>
+    <w:lsdException w:name="HTML Top of Form" w:semiHidden="1" w:unhideWhenUsed="1"/>
+    <w:lsdException w:name="HTML Bottom of Form" w:semiHidden="1" w:unhideWhenUsed="1"/>
+    <w:lsdException w:name="Normal (Web)" w:semiHidden="1" w:unhideWhenUsed="1"/>
+    <w:lsdException w:name="HTML Acronym" w:semiHidden="1" w:unhideWhenUsed="1"/>
+    <w:lsdException w:name="HTML Address" w:semiHidden="1" w:unhideWhenUsed="1"/>
+    <w:lsdException w:name="HTML Cite" w:semiHidden="1" w:unhideWhenUsed="1"/>
+    <w:lsdException w:name="HTML Code" w:semiHidden="1" w:unhideWhenUsed="1"/>
+    <w:lsdException w:name="HTML Definition" w:semiHidden="1" w:unhideWhenUsed="1"/>
+    <w:lsdException w:name="HTML Keyboard" w:semiHidden="1" w:unhideWhenUsed="1"/>
+    <w:lsdException w:name="HTML Preformatted" w:semiHidden="1" w:unhideWhenUsed="1"/>
+    <w:lsdException w:name="HTML Sample" w:semiHidden="1" w:unhideWhenUsed="1"/>
+    <w:lsdException w:name="HTML Typewriter" w:semiHidden="1" w:unhideWhenUsed="1"/>
+    <w:lsdException w:name="HTML Variable" w:semiHidden="1" w:unhideWhenUsed="1"/>
+    <w:lsdException w:name="Normal Table" w:semiHidden="1" w:unhideWhenUsed="1"/>
+    <w:lsdException w:name="annotation subject" w:semiHidden="1" w:unhideWhenUsed="1"/>
+    <w:lsdException w:name="No List" w:semiHidden="1" w:unhideWhenUsed="1"/>
+    <w:lsdException w:name="Outline List 1" w:semiHidden="1" w:unhideWhenUsed="1"/>
+    <w:lsdException w:name="Outline List 2" w:semiHidden="1" w:unhideWhenUsed="1"/>
+    <w:lsdException w:name="Outline List 3" w:semiHidden="1" w:unhideWhenUsed="1"/>
+    <w:lsdException w:name="Table Simple 1" w:semiHidden="1" w:unhideWhenUsed="1"/>
+    <w:lsdException w:name="Table Simple 2" w:semiHidden="1" w:unhideWhenUsed="1"/>
+    <w:lsdException w:name="Table Simple 3" w:semiHidden="1" w:unhideWhenUsed="1"/>
+    <w:lsdException w:name="Table Classic 1" w:semiHidden="1" w:unhideWhenUsed="1"/>
+    <w:lsdException w:name="Table Classic 2" w:semiHidden="1" w:unhideWhenUsed="1"/>
+    <w:lsdException w:name="Table Classic 3" w:semiHidden="1" w:unhideWhenUsed="1"/>
+    <w:lsdException w:name="Table Classic 4" w:semiHidden="1" w:unhideWhenUsed="1"/>
+    <w:lsdException w:name="Table Colorful 1" w:semiHidden="1" w:unhideWhenUsed="1"/>
+    <w:lsdException w:name="Table Colorful 2" w:semiHidden="1" w:unhideWhenUsed="1"/>
+    <w:lsdException w:name="Table Colorful 3" w:semiHidden="1" w:unhideWhenUsed="1"/>
+    <w:lsdException w:name="Table Columns 1" w:semiHidden="1" w:unhideWhenUsed="1"/>
+    <w:lsdException w:name="Table Columns 2" w:semiHidden="1" w:unhideWhenUsed="1"/>
+    <w:lsdException w:name="Table Columns 3" w:semiHidden="1" w:unhideWhenUsed="1"/>
+    <w:lsdException w:name="Table Columns 4" w:semiHidden="1" w:unhideWhenUsed="1"/>
+    <w:lsdException w:name="Table Columns 5" w:semiHidden="1" w:unhideWhenUsed="1"/>
+    <w:lsdException w:name="Table Grid 1" w:semiHidden="1" w:unhideWhenUsed="1"/>
+    <w:lsdException w:name="Table Grid 2" w:semiHidden="1" w:unhideWhenUsed="1"/>
+    <w:lsdException w:name="Table Grid 3" w:semiHidden="1" w:unhideWhenUsed="1"/>
+    <w:lsdException w:name="Table Grid 4" w:semiHidden="1" w:unhideWhenUsed="1"/>
+    <w:lsdException w:name="Table Grid 5" w:semiHidden="1" w:unhideWhenUsed="1"/>
+    <w:lsdException w:name="Table Grid 6" w:semiHidden="1" w:unhideWhenUsed="1"/>
+    <w:lsdException w:name="Table Grid 7" w:semiHidden="1" w:unhideWhenUsed="1"/>
+    <w:lsdException w:name="Table Grid 8" w:semiHidden="1" w:unhideWhenUsed="1"/>
+    <w:lsdException w:name="Table List 1" w:semiHidden="1" w:unhideWhenUsed="1"/>
+    <w:lsdException w:name="Table List 2" w:semiHidden="1" w:unhideWhenUsed="1"/>
+    <w:lsdException w:name="Table List 3" w:semiHidden="1" w:unhideWhenUsed="1"/>
+    <w:lsdException w:name="Table List 4" w:semiHidden="1" w:unhideWhenUsed="1"/>
+    <w:lsdException w:name="Table List 5" w:semiHidden="1" w:unhideWhenUsed="1"/>
+    <w:lsdException w:name="Table List 6" w:semiHidden="1" w:unhideWhenUsed="1"/>
+    <w:lsdException w:name="Table List 7" w:semiHidden="1" w:unhideWhenUsed="1"/>
+    <w:lsdException w:name="Table List 8" w:semiHidden="1" w:unhideWhenUsed="1"/>
+    <w:lsdException w:name="Table 3D effects 1" w:semiHidden="1" w:unhideWhenUsed="1"/>
+    <w:lsdException w:name="Table 3D effects 2" w:semiHidden="1" w:unhideWhenUsed="1"/>
+    <w:lsdException w:name="Table 3D effects 3" w:semiHidden="1" w:unhideWhenUsed="1"/>
+    <w:lsdException w:name="Table Contemporary" w:semiHidden="1" w:unhideWhenUsed="1"/>
+    <w:lsdException w:name="Table Elegant" w:semiHidden="1" w:unhideWhenUsed="1"/>
+    <w:lsdException w:name="Table Professional" w:semiHidden="1" w:unhideWhenUsed="1"/>
+    <w:lsdException w:name="Table Subtle 1" w:semiHidden="1" w:unhideWhenUsed="1"/>
+    <w:lsdException w:name="Table Subtle 2" w:semiHidden="1" w:unhideWhenUsed="1"/>
+    <w:lsdException w:name="Table Web 1" w:semiHidden="1" w:unhideWhenUsed="1"/>
+    <w:lsdException w:name="Table Web 2" w:semiHidden="1" w:unhideWhenUsed="1"/>
+    <w:lsdException w:name="Table Web 3" w:semiHidden="1" w:unhideWhenUsed="1"/>
+    <w:lsdException w:name="Balloon Text" w:semiHidden="1" w:unhideWhenUsed="1"/>
+    <w:lsdException w:name="Table Grid" w:uiPriority="39"/>
+    <w:lsdException w:name="Table Theme" w:semiHidden="1" w:unhideWhenUsed="1"/>
+    <w:lsdException w:name="Placeholder Text" w:semiHidden="1"/>
+    <w:lsdException w:name="No Spacing" w:qFormat="1" w:uiPriority="1"/>
+    <w:lsdException w:name="Light Shading" w:uiPriority="60"/>
+    <w:lsdException w:name="Light List" w:uiPriority="61"/>
+    <w:lsdException w:name="Light Grid" w:uiPriority="62"/>
+    <w:lsdException w:name="Medium Shading 1" w:uiPriority="63"/>
+    <w:lsdException w:name="Medium Shading 2" w:uiPriority="64"/>
+    <w:lsdException w:name="Medium List 1" w:uiPriority="65"/>
+    <w:lsdException w:name="Medium List 2" w:uiPriority="66"/>
+    <w:lsdException w:name="Medium Grid 1" w:uiPriority="67"/>
+    <w:lsdException w:name="Medium Grid 2" w:uiPriority="68"/>
+    <w:lsdException w:name="Medium Grid 3" w:uiPriority="69"/>
+    <w:lsdException w:name="Dark List" w:uiPriority="70"/>
+    <w:lsdException w:name="Colorful Shading" w:uiPriority="71"/>
+    <w:lsdException w:name="Colorful List" w:uiPriority="72"/>
+    <w:lsdException w:name="Colorful Grid" w:uiPriority="73"/>
+    <w:lsdException w:name="Light Shading Accent 1" w:uiPriority="60"/>
+    <w:lsdException w:name="Light List Accent 1" w:uiPriority="61"/>
+    <w:lsdException w:name="Light Grid Accent 1" w:uiPriority="62"/>
+    <w:lsdException w:name="Medium Shading 1 Accent 1" w:uiPriority="63"/>
+    <w:lsdException w:name="Medium Shading 2 Accent 1" w:uiPriority="64"/>
+    <w:lsdException w:name="Medium List 1 Accent 1" w:uiPriority="65"/>
+    <w:lsdException w:name="Revision" w:semiHidden="1"/>
+    <w:lsdException w:name="List Paragraph" w:qFormat="1" w:uiPriority="34"/>
+    <w:lsdException w:name="Quote" w:qFormat="1" w:uiPriority="29"/>
+    <w:lsdException w:name="Intense Quote" w:qFormat="1" w:uiPriority="30"/>
+    <w:lsdException w:name="Medium List 2 Accent 1" w:uiPriority="66"/>
+    <w:lsdException w:name="Medium Grid 1 Accent 1" w:uiPriority="67"/>
+    <w:lsdException w:name="Medium Grid 2 Accent 1" w:uiPriority="68"/>
+    <w:lsdException w:name="Medium Grid 3 Accent 1" w:uiPriority="69"/>
+    <w:lsdException w:name="Dark List Accent 1" w:uiPriority="70"/>
+    <w:lsdException w:name="Colorful Shading Accent 1" w:uiPriority="71"/>
+    <w:lsdException w:name="Colorful List Accent 1" w:uiPriority="72"/>
+    <w:lsdException w:name="Colorful Grid Accent 1" w:uiPriority="73"/>
+    <w:lsdException w:name="Light Shading Accent 2" w:uiPriority="60"/>
+    <w:lsdException w:name="Light List Accent 2" w:uiPriority="61"/>
+    <w:lsdException w:name="Light Grid Accent 2" w:uiPriority="62"/>
+    <w:lsdException w:name="Medium Shading 1 Accent 2" w:uiPriority="63"/>
+    <w:lsdException w:name="Medium Shading 2 Accent 2" w:uiPriority="64"/>
+    <w:lsdException w:name="Medium List 1 Accent 2" w:uiPriority="65"/>
+    <w:lsdException w:name="Medium List 2 Accent 2" w:uiPriority="66"/>
+    <w:lsdException w:name="Medium Grid 1 Accent 2" w:uiPriority="67"/>
+    <w:lsdException w:name="Medium Grid 2 Accent 2" w:uiPriority="68"/>
+    <w:lsdException w:name="Medium Grid 3 Accent 2" w:uiPriority="69"/>
+    <w:lsdException w:name="Dark List Accent 2" w:uiPriority="70"/>
+    <w:lsdException w:name="Colorful Shading Accent 2" w:uiPriority="71"/>
+    <w:lsdException w:name="Colorful List Accent 2" w:uiPriority="72"/>
+    <w:lsdException w:name="Colorful Grid Accent 2" w:uiPriority="73"/>
+    <w:lsdException w:name="Light Shading Accent 3" w:uiPriority="60"/>
+    <w:lsdException w:name="Light List Accent 3" w:uiPriority="61"/>
+    <w:lsdException w:name="Light Grid Accent 3" w:uiPriority="62"/>
+    <w:lsdException w:name="Medium Shading 1 Accent 3" w:uiPriority="63"/>
+    <w:lsdException w:name="Medium Shading 2 Accent 3" w:uiPriority="64"/>
+    <w:lsdException w:name="Medium List 1 Accent 3" w:uiPriority="65"/>
+    <w:lsdException w:name="Medium List 2 Accent 3" w:uiPriority="66"/>
+    <w:lsdException w:name="Medium Grid 1 Accent 3" w:uiPriority="67"/>
+    <w:lsdException w:name="Medium Grid 2 Accent 3" w:uiPriority="68"/>
+    <w:lsdException w:name="Medium Grid 3 Accent 3" w:uiPriority="69"/>
+    <w:lsdException w:name="Dark List Accent 3" w:uiPriority="70"/>
+    <w:lsdException w:name="Colorful Shading Accent 3" w:uiPriority="71"/>
+    <w:lsdException w:name="Colorful List Accent 3" w:uiPriority="72"/>
+    <w:lsdException w:name="Colorful Grid Accent 3" w:uiPriority="73"/>
+    <w:lsdException w:name="Light Shading Accent 4" w:uiPriority="60"/>
+    <w:lsdException w:name="Light List Accent 4" w:uiPriority="61"/>
+    <w:lsdException w:name="Light Grid Accent 4" w:uiPriority="62"/>
+    <w:lsdException w:name="Medium Shading 1 Accent 4" w:uiPriority="63"/>
+    <w:lsdException w:name="Medium Shading 2 Accent 4" w:uiPriority="64"/>
+    <w:lsdException w:name="Medium List 1 Accent 4" w:uiPriority="65"/>
+    <w:lsdException w:name="Medium List 2 Accent 4" w:uiPriority="66"/>
+    <w:lsdException w:name="Medium Grid 1 Accent 4" w:uiPriority="67"/>
+    <w:lsdException w:name="Medium Grid 2 Accent 4" w:uiPriority="68"/>
+    <w:lsdException w:name="Medium Grid 3 Accent 4" w:uiPriority="69"/>
+    <w:lsdException w:name="Dark List Accent 4" w:uiPriority="70"/>
+    <w:lsdException w:name="Colorful Shading Accent 4" w:uiPriority="71"/>
+    <w:lsdException w:name="Colorful List Accent 4" w:uiPriority="72"/>
+    <w:lsdException w:name="Colorful Grid Accent 4" w:uiPriority="73"/>
+    <w:lsdException w:name="Light Shading Accent 5" w:uiPriority="60"/>
+    <w:lsdException w:name="Light List Accent 5" w:uiPriority="61"/>
+    <w:lsdException w:name="Light Grid Accent 5" w:uiPriority="62"/>
+    <w:lsdException w:name="Medium Shading 1 Accent 5" w:uiPriority="63"/>
+    <w:lsdException w:name="Medium Shading 2 Accent 5" w:uiPriority="64"/>
+    <w:lsdException w:name="Medium List 1 Accent 5" w:uiPriority="65"/>
+    <w:lsdException w:name="Medium List 2 Accent 5" w:uiPriority="66"/>
+    <w:lsdException w:name="Medium Grid 1 Accent 5" w:uiPriority="67"/>
+    <w:lsdException w:name="Medium Grid 2 Accent 5" w:uiPriority="68"/>
+    <w:lsdException w:name="Medium Grid 3 Accent 5" w:uiPriority="69"/>
+    <w:lsdException w:name="Dark List Accent 5" w:uiPriority="70"/>
+    <w:lsdException w:name="Colorful Shading Accent 5" w:uiPriority="71"/>
+    <w:lsdException w:name="Colorful List Accent 5" w:uiPriority="72"/>
+    <w:lsdException w:name="Colorful Grid Accent 5" w:uiPriority="73"/>
+    <w:lsdException w:name="Light Shading Accent 6" w:uiPriority="60"/>
+    <w:lsdException w:name="Light List Accent 6" w:uiPriority="61"/>
+    <w:lsdException w:name="Light Grid Accent 6" w:uiPriority="62"/>
+    <w:lsdException w:name="Medium Shading 1 Accent 6" w:uiPriority="63"/>
+    <w:lsdException w:name="Medium Shading 2 Accent 6" w:uiPriority="64"/>
+    <w:lsdException w:name="Medium List 1 Accent 6" w:uiPriority="65"/>
+    <w:lsdException w:name="Medium List 2 Accent 6" w:uiPriority="66"/>
+    <w:lsdException w:name="Medium Grid 1 Accent 6" w:uiPriority="67"/>
+    <w:lsdException w:name="Medium Grid 2 Accent 6" w:uiPriority="68"/>
+    <w:lsdException w:name="Medium Grid 3 Accent 6" w:uiPriority="69"/>
+    <w:lsdException w:name="Dark List Accent 6" w:uiPriority="70"/>
+    <w:lsdException w:name="Colorful Shading Accent 6" w:uiPriority="71"/>
+    <w:lsdException w:name="Colorful List Accent 6" w:uiPriority="72"/>
+    <w:lsdException w:name="Colorful Grid Accent 6" w:uiPriority="73"/>
+    <w:lsdException w:name="Subtle Emphasis" w:qFormat="1" w:uiPriority="19"/>
+    <w:lsdException w:name="Intense Emphasis" w:qFormat="1" w:uiPriority="21"/>
+    <w:lsdException w:name="Subtle Reference" w:qFormat="1" w:uiPriority="31"/>
+    <w:lsdException w:name="Intense Reference" w:qFormat="1" w:uiPriority="32"/>
+    <w:lsdException w:name="Book Title" w:qFormat="1" w:uiPriority="33"/>
+    <w:lsdException w:name="Bibliography" w:semiHidden="1" w:uiPriority="37" w:unhideWhenUsed="1"/>
+    <w:lsdException w:name="TOC Heading" w:qFormat="1" w:semiHidden="1" w:uiPriority="39" w:unhideWhenUsed="1"/>
+    <w:lsdException w:name="Plain Table 1" w:uiPriority="41"/>
+    <w:lsdException w:name="Plain Table 2" w:uiPriority="42"/>
+    <w:lsdException w:name="Plain Table 3" w:uiPriority="43"/>
+    <w:lsdException w:name="Plain Table 4" w:uiPriority="44"/>
+    <w:lsdException w:name="Plain Table 5" w:uiPriority="45"/>
+    <w:lsdException w:name="Grid Table Light" w:uiPriority="40"/>
+    <w:lsdException w:name="Grid Table 1 Light" w:uiPriority="46"/>
+    <w:lsdException w:name="Grid Table 2" w:uiPriority="47"/>
+    <w:lsdException w:name="Grid Table 3" w:uiPriority="48"/>
+    <w:lsdException w:name="Grid Table 4" w:uiPriority="49"/>
+    <w:lsdException w:name="Grid Table 5 Dark" w:uiPriority="50"/>
+    <w:lsdException w:name="Grid Table 6 Colorful" w:uiPriority="51"/>
+    <w:lsdException w:name="Grid Table 7 Colorful" w:uiPriority="52"/>
+    <w:lsdException w:name="Grid Table 1 Light Accent 1" w:uiPriority="46"/>
+    <w:lsdException w:name="Grid Table 2 Accent 1" w:uiPriority="47"/>
+    <w:lsdException w:name="Grid Table 3 Accent 1" w:uiPriority="48"/>
+    <w:lsdException w:name="Grid Table 4 Accent 1" w:uiPriority="49"/>
+    <w:lsdException w:name="Grid Table 5 Dark Accent 1" w:uiPriority="50"/>
+    <w:lsdException w:name="Grid Table 6 Colorful Accent 1" w:uiPriority="51"/>
+    <w:lsdException w:name="Grid Table 7 Colorful Accent 1" w:uiPriority="52"/>
+    <w:lsdException w:name="Grid Table 1 Light Accent 2" w:uiPriority="46"/>
+    <w:lsdException w:name="Grid Table 2 Accent 2" w:uiPriority="47"/>
+    <w:lsdException w:name="Grid Table 3 Accent 2" w:uiPriority="48"/>
+    <w:lsdException w:name="Grid Table 4 Accent 2" w:uiPriority="49"/>
+    <w:lsdException w:name="Grid Table 5 Dark Accent 2" w:uiPriority="50"/>
+    <w:lsdException w:name="Grid Table 6 Colorful Accent 2" w:uiPriority="51"/>
+    <w:lsdException w:name="Grid Table 7 Colorful Accent 2" w:uiPriority="52"/>
+    <w:lsdException w:name="Grid Table 1 Light Accent 3" w:uiPriority="46"/>
+    <w:lsdException w:name="Grid Table 2 Accent 3" w:uiPriority="47"/>
+    <w:lsdException w:name="Grid Table 3 Accent 3" w:uiPriority="48"/>
+    <w:lsdException w:name="Grid Table 4 Accent 3" w:uiPriority="49"/>
+    <w:lsdException w:name="Grid Table 5 Dark Accent 3" w:uiPriority="50"/>
+    <w:lsdException w:name="Grid Table 6 Colorful Accent 3" w:uiPriority="51"/>
+    <w:lsdException w:name="Grid Table 7 Colorful Accent 3" w:uiPriority="52"/>
+    <w:lsdException w:name="Grid Table 1 Light Accent 4" w:uiPriority="46"/>
+    <w:lsdException w:name="Grid Table 2 Accent 4" w:uiPriority="47"/>
+    <w:lsdException w:name="Grid Table 3 Accent 4" w:uiPriority="48"/>
+    <w:lsdException w:name="Grid Table 4 Accent 4" w:uiPriority="49"/>
+    <w:lsdException w:name="Grid Table 5 Dark Accent 4" w:uiPriority="50"/>
+    <w:lsdException w:name="Grid Table 6 Colorful Accent 4" w:uiPriority="51"/>
+    <w:lsdException w:name="Grid Table 7 Colorful Accent 4" w:uiPriority="52"/>
+    <w:lsdException w:name="Grid Table 1 Light Accent 5" w:uiPriority="46"/>
+    <w:lsdException w:name="Grid Table 2 Accent 5" w:uiPriority="47"/>
+    <w:lsdException w:name="Grid Table 3 Accent 5" w:uiPriority="48"/>
+    <w:lsdException w:name="Grid Table 4 Accent 5" w:uiPriority="49"/>
+    <w:lsdException w:name="Grid Table 5 Dark Accent 5" w:uiPriority="50"/>
+    <w:lsdException w:name="Grid Table 6 Colorful Accent 5" w:uiPriority="51"/>
+    <w:lsdException w:name="Grid Table 7 Colorful Accent 5" w:uiPriority="52"/>
+    <w:lsdException w:name="Grid Table 1 Light Accent 6" w:uiPriority="46"/>
+    <w:lsdException w:name="Grid Table 2 Accent 6" w:uiPriority="47"/>
+    <w:lsdException w:name="Grid Table 3 Accent 6" w:uiPriority="48"/>
+    <w:lsdException w:name="Grid Table 4 Accent 6" w:uiPriority="49"/>
+    <w:lsdException w:name="Grid Table 5 Dark Accent 6" w:uiPriority="50"/>
+    <w:lsdException w:name="Grid Table 6 Colorful Accent 6" w:uiPriority="51"/>
+    <w:lsdException w:name="Grid Table 7 Colorful Accent 6" w:uiPriority="52"/>
+    <w:lsdException w:name="List Table 1 Light" w:uiPriority="46"/>
+    <w:lsdException w:name="List Table 2" w:uiPriority="47"/>
+    <w:lsdException w:name="List Table 3" w:uiPriority="48"/>
+    <w:lsdException w:name="List Table 4" w:uiPriority="49"/>
+    <w:lsdException w:name="List Table 5 Dark" w:uiPriority="50"/>
+    <w:lsdException w:name="List Table 6 Colorful" w:uiPriority="51"/>
+    <w:lsdException w:name="List Table 7 Colorful" w:uiPriority="52"/>
+    <w:lsdException w:name="List Table 1 Light Accent 1" w:uiPriority="46"/>
+    <w:lsdException w:name="List Table 2 Accent 1" w:uiPriority="47"/>
+    <w:lsdException w:name="List Table 3 Accent 1" w:uiPriority="48"/>
+    <w:lsdException w:name="List Table 4 Accent 1" w:uiPriority="49"/>
+    <w:lsdException w:name="List Table 5 Dark Accent 1" w:uiPriority="50"/>
+    <w:lsdException w:name="List Table 6 Colorful Accent 1" w:uiPriority="51"/>
+    <w:lsdException w:name="List Table 7 Colorful Accent 1" w:uiPriority="52"/>
+    <w:lsdException w:name="List Table 1 Light Accent 2" w:uiPriority="46"/>
+    <w:lsdException w:name="List Table 2 Accent 2" w:uiPriority="47"/>
+    <w:lsdException w:name="List Table 3 Accent 2" w:uiPriority="48"/>
+    <w:lsdException w:name="List Table 4 Accent 2" w:uiPriority="49"/>
+    <w:lsdException w:name="List Table 5 Dark Accent 2" w:uiPriority="50"/>
+    <w:lsdException w:name="List Table 6 Colorful Accent 2" w:uiPriority="51"/>
+    <w:lsdException w:name="List Table 7 Colorful Accent 2" w:uiPriority="52"/>
+    <w:lsdException w:name="List Table 1 Light Accent 3" w:uiPriority="46"/>
+    <w:lsdException w:name="List Table 2 Accent 3" w:uiPriority="47"/>
+    <w:lsdException w:name="List Table 3 Accent 3" w:uiPriority="48"/>
+    <w:lsdException w:name="List Table 4 Accent 3" w:uiPriority="49"/>
+    <w:lsdException w:name="List Table 5 Dark Accent 3" w:uiPriority="50"/>
+    <w:lsdException w:name="List Table 6 Colorful Accent 3" w:uiPriority="51"/>
+    <w:lsdException w:name="List Table 7 Colorful Accent 3" w:uiPriority="52"/>
+    <w:lsdException w:name="List Table 1 Light Accent 4" w:uiPriority="46"/>
+    <w:lsdException w:name="List Table 2 Accent 4" w:uiPriority="47"/>
+    <w:lsdException w:name="List Table 3 Accent 4" w:uiPriority="48"/>
+    <w:lsdException w:name="List Table 4 Accent 4" w:uiPriority="49"/>
+    <w:lsdException w:name="List Table 5 Dark Accent 4" w:uiPriority="50"/>
+    <w:lsdException w:name="List Table 6 Colorful Accent 4" w:uiPriority="51"/>
+    <w:lsdException w:name="List Table 7 Colorful Accent 4" w:uiPriority="52"/>
+    <w:lsdException w:name="List Table 1 Light Accent 5" w:uiPriority="46"/>
+    <w:lsdException w:name="List Table 2 Accent 5" w:uiPriority="47"/>
+    <w:lsdException w:name="List Table 3 Accent 5" w:uiPriority="48"/>
+    <w:lsdException w:name="List Table 4 Accent 5" w:uiPriority="49"/>
+    <w:lsdException w:name="List Table 5 Dark Accent 5" w:uiPriority="50"/>
+    <w:lsdException w:name="List Table 6 Colorful Accent 5" w:uiPriority="51"/>
+    <w:lsdException w:name="List Table 7 Colorful Accent 5" w:uiPriority="52"/>
+    <w:lsdException w:name="List Table 1 Light Accent 6" w:uiPriority="46"/>
+    <w:lsdException w:name="List Table 2 Accent 6" w:uiPriority="47"/>
+    <w:lsdException w:name="List Table 3 Accent 6" w:uiPriority="48"/>
+    <w:lsdException w:name="List Table 4 Accent 6" w:uiPriority="49"/>
+    <w:lsdException w:name="List Table 5 Dark Accent 6" w:uiPriority="50"/>
+    <w:lsdException w:name="List Table 6 Colorful Accent 6" w:uiPriority="51"/>
+    <w:lsdException w:name="List Table 7 Colorful Accent 6" w:uiPriority="52"/>
+    <w:lsdException w:name="Mention" w:semiHidden="1" w:unhideWhenUsed="1"/>
+    <w:lsdException w:name="Smart Hyperlink" w:semiHidden="1" w:unhideWhenUsed="1"/>
+    <w:lsdException w:name="Hashtag" w:semiHidden="1" w:unhideWhenUsed="1"/>
+    <w:lsdException w:name="Unresolved Mention" w:semiHidden="1" w:unhideWhenUsed="1"/>
+    <w:lsdException w:name="Smart Link" w:semiHidden="1" w:unhideWhenUsed="1"/>
+  </w:latentStyles>
   <w:style w:default="1" w:styleId="Normal" w:type="paragraph">
     <w:name w:val="Normal"/>
     <w:qFormat/>
-  </w:style>
-  <w:style w:styleId="BodyText" w:type="paragraph">
-    <w:name w:val="Body Text"/>
-    <w:basedOn w:val="Normal"/>
-    <w:link w:val="BodyTextChar"/>
-    <w:qFormat/>
+    <w:rsid w:val="00F61DF2"/>
     <w:pPr>
-      <w:spacing w:after="180" w:before="180"/>
+      <w:spacing w:line="480" w:lineRule="auto"/>
     </w:pPr>
-  </w:style>
-  <w:style w:customStyle="1" w:styleId="FirstParagraph" w:type="paragraph">
-    <w:name w:val="First Paragraph"/>
-    <w:basedOn w:val="BodyText"/>
-    <w:next w:val="BodyText"/>
-    <w:qFormat/>
-  </w:style>
-  <w:style w:customStyle="1" w:styleId="Compact" w:type="paragraph">
-    <w:name w:val="Compact"/>
-    <w:basedOn w:val="BodyText"/>
-    <w:qFormat/>
-    <w:pPr>
-      <w:spacing w:after="36" w:before="36"/>
-    </w:pPr>
-  </w:style>
-  <w:style w:styleId="Title" w:type="paragraph">
-    <w:name w:val="Title"/>
-    <w:basedOn w:val="Normal"/>
-    <w:next w:val="BodyText"/>
-    <w:link w:val="TitleChar"/>
-    <w:uiPriority w:val="10"/>
-    <w:qFormat/>
-    <w:rsid w:val="00A10FD9"/>
-    <w:pPr>
-      <w:spacing w:after="80" w:line="240" w:lineRule="auto"/>
-      <w:contextualSpacing/>
-      <w:jc w:val="center"/>
-    </w:pPr>
-    <w:rPr>
-      <w:rFonts w:asciiTheme="majorHAnsi" w:cstheme="majorBidi" w:eastAsiaTheme="majorEastAsia" w:hAnsiTheme="majorHAnsi"/>
-      <w:sz w:val="56"/>
-      <w:szCs w:val="56"/>
-    </w:rPr>
-  </w:style>
-  <w:style w:customStyle="1" w:styleId="TitleChar" w:type="character">
-    <w:name w:val="Title Char"/>
-    <w:basedOn w:val="DefaultParagraphFont"/>
-    <w:link w:val="Title"/>
-    <w:uiPriority w:val="10"/>
-    <w:rsid w:val="00A10FD9"/>
-    <w:rPr>
-      <w:rFonts w:asciiTheme="majorHAnsi" w:cstheme="majorBidi" w:eastAsiaTheme="majorEastAsia" w:hAnsiTheme="majorHAnsi"/>
-      <w:sz w:val="56"/>
-      <w:szCs w:val="56"/>
-    </w:rPr>
-  </w:style>
-  <w:style w:styleId="Subtitle" w:type="paragraph">
-    <w:name w:val="Subtitle"/>
-    <w:basedOn w:val="Title"/>
-    <w:next w:val="BodyText"/>
-    <w:link w:val="SubtitleChar"/>
-    <w:uiPriority w:val="11"/>
-    <w:qFormat/>
-    <w:rsid w:val="00A10FD9"/>
-    <w:pPr>
-      <w:numPr>
-        <w:ilvl w:val="1"/>
-      </w:numPr>
-    </w:pPr>
-    <w:rPr>
-      <w:rFonts w:cstheme="majorBidi" w:eastAsiaTheme="majorEastAsia"/>
-      <w:spacing w:val="15"/>
-      <w:sz w:val="28"/>
-      <w:szCs w:val="28"/>
-    </w:rPr>
-  </w:style>
-  <w:style w:customStyle="1" w:styleId="SubtitleChar" w:type="character">
-    <w:name w:val="Subtitle Char"/>
-    <w:basedOn w:val="DefaultParagraphFont"/>
-    <w:link w:val="Subtitle"/>
-    <w:uiPriority w:val="11"/>
-    <w:rsid w:val="00A10FD9"/>
-    <w:rPr>
-      <w:rFonts w:cstheme="majorBidi" w:eastAsiaTheme="majorEastAsia"/>
-      <w:color w:themeColor="text1" w:themeTint="A6" w:val="595959"/>
-      <w:spacing w:val="15"/>
-      <w:sz w:val="28"/>
-      <w:szCs w:val="28"/>
-    </w:rPr>
-  </w:style>
-  <w:style w:customStyle="1" w:styleId="Author" w:type="paragraph">
-    <w:name w:val="Author"/>
-    <w:basedOn w:val="Title"/>
-    <w:next w:val="BodyText"/>
-    <w:qFormat/>
-    <w:pPr>
-      <w:keepNext/>
-      <w:keepLines/>
-    </w:pPr>
-    <w:rPr>
-      <w:sz w:val="24"/>
-      <w:szCs w:val="24"/>
-    </w:rPr>
-  </w:style>
-  <w:style w:styleId="Date" w:type="paragraph">
-    <w:name w:val="Date"/>
-    <w:basedOn w:val="Title"/>
-    <w:next w:val="BodyText"/>
-    <w:qFormat/>
-    <w:pPr>
-      <w:keepNext/>
-      <w:keepLines/>
-    </w:pPr>
-    <w:rPr>
-      <w:sz w:val="24"/>
-      <w:szCs w:val="24"/>
-    </w:rPr>
-  </w:style>
-  <w:style w:customStyle="1" w:styleId="AbstractTitle" w:type="paragraph">
-    <w:name w:val="Abstract Title"/>
-    <w:basedOn w:val="Normal"/>
-    <w:next w:val="Abstract"/>
-    <w:qFormat/>
-    <w:pPr>
-      <w:keepNext/>
-      <w:keepLines/>
-      <w:spacing w:after="0" w:before="300"/>
-      <w:jc w:val="center"/>
-    </w:pPr>
-    <w:rPr>
-      <w:b/>
-      <w:sz w:val="20"/>
-      <w:szCs w:val="20"/>
-    </w:rPr>
-  </w:style>
-  <w:style w:customStyle="1" w:styleId="Abstract" w:type="paragraph">
-    <w:name w:val="Abstract"/>
-    <w:basedOn w:val="Normal"/>
-    <w:next w:val="BodyText"/>
-    <w:qFormat/>
-    <w:pPr>
-      <w:keepNext/>
-      <w:keepLines/>
-      <w:spacing w:after="300" w:before="100"/>
-    </w:pPr>
-    <w:rPr>
-      <w:sz w:val="20"/>
-      <w:szCs w:val="20"/>
-    </w:rPr>
-  </w:style>
-  <w:style w:styleId="Bibliography" w:type="paragraph">
-    <w:name w:val="Bibliography"/>
-    <w:basedOn w:val="Normal"/>
-    <w:next w:val="Bibliography"/>
-    <w:qFormat/>
-    <w:pPr/>
-    <w:rPr/>
   </w:style>
   <w:style w:styleId="Heading1" w:type="paragraph">
     <w:name w:val="heading 1"/>
     <w:basedOn w:val="Normal"/>
-    <w:next w:val="BodyText"/>
+    <w:next w:val="Normal"/>
     <w:link w:val="Heading1Char"/>
     <w:uiPriority w:val="9"/>
     <w:qFormat/>
-    <w:rsid w:val="00A10FD9"/>
+    <w:rsid w:val="00F61DF2"/>
     <w:pPr>
       <w:keepNext/>
       <w:keepLines/>
       <w:spacing w:after="80" w:before="360"/>
+      <w:jc w:val="center"/>
       <w:outlineLvl w:val="0"/>
     </w:pPr>
     <w:rPr>
-      <w:rFonts w:asciiTheme="majorHAnsi" w:cstheme="majorBidi" w:eastAsiaTheme="majorEastAsia" w:hAnsiTheme="majorHAnsi"/>
-      <w:color w:themeColor="accent1" w:themeShade="BF" w:val="0F4761"/>
-      <w:sz w:val="40"/>
+      <w:rFonts w:cstheme="majorBidi" w:eastAsiaTheme="majorEastAsia"/>
+      <w:b/>
       <w:szCs w:val="40"/>
     </w:rPr>
   </w:style>
   <w:style w:styleId="Heading2" w:type="paragraph">
     <w:name w:val="heading 2"/>
     <w:basedOn w:val="Normal"/>
-    <w:next w:val="BodyText"/>
+    <w:next w:val="Normal"/>
     <w:link w:val="Heading2Char"/>
     <w:uiPriority w:val="9"/>
     <w:semiHidden/>
     <w:unhideWhenUsed/>
     <w:qFormat/>
-    <w:rsid w:val="00A10FD9"/>
+    <w:rsid w:val="00F61DF2"/>
     <w:pPr>
       <w:keepNext/>
       <w:keepLines/>
@@ -15643,22 +15714,20 @@
       <w:outlineLvl w:val="1"/>
     </w:pPr>
     <w:rPr>
-      <w:rFonts w:asciiTheme="majorHAnsi" w:cstheme="majorBidi" w:eastAsiaTheme="majorEastAsia" w:hAnsiTheme="majorHAnsi"/>
-      <w:color w:themeColor="accent1" w:themeShade="BF" w:val="0F4761"/>
-      <w:sz w:val="32"/>
+      <w:rFonts w:cstheme="majorBidi" w:eastAsiaTheme="majorEastAsia"/>
+      <w:b/>
       <w:szCs w:val="32"/>
     </w:rPr>
   </w:style>
   <w:style w:styleId="Heading3" w:type="paragraph">
     <w:name w:val="heading 3"/>
     <w:basedOn w:val="Normal"/>
-    <w:next w:val="BodyText"/>
+    <w:next w:val="Normal"/>
     <w:link w:val="Heading3Char"/>
     <w:uiPriority w:val="9"/>
-    <w:semiHidden/>
     <w:unhideWhenUsed/>
     <w:qFormat/>
-    <w:rsid w:val="00A10FD9"/>
+    <w:rsid w:val="00F61DF2"/>
     <w:pPr>
       <w:keepNext/>
       <w:keepLines/>
@@ -15667,21 +15736,21 @@
     </w:pPr>
     <w:rPr>
       <w:rFonts w:cstheme="majorBidi" w:eastAsiaTheme="majorEastAsia"/>
-      <w:color w:themeColor="accent1" w:themeShade="BF" w:val="0F4761"/>
-      <w:sz w:val="28"/>
+      <w:b/>
+      <w:i/>
       <w:szCs w:val="28"/>
     </w:rPr>
   </w:style>
   <w:style w:styleId="Heading4" w:type="paragraph">
     <w:name w:val="heading 4"/>
     <w:basedOn w:val="Normal"/>
-    <w:next w:val="BodyText"/>
+    <w:next w:val="Normal"/>
     <w:link w:val="Heading4Char"/>
     <w:uiPriority w:val="9"/>
     <w:semiHidden/>
     <w:unhideWhenUsed/>
     <w:qFormat/>
-    <w:rsid w:val="00A10FD9"/>
+    <w:rsid w:val="00293C62"/>
     <w:pPr>
       <w:keepNext/>
       <w:keepLines/>
@@ -15698,13 +15767,13 @@
   <w:style w:styleId="Heading5" w:type="paragraph">
     <w:name w:val="heading 5"/>
     <w:basedOn w:val="Normal"/>
-    <w:next w:val="BodyText"/>
+    <w:next w:val="Normal"/>
     <w:link w:val="Heading5Char"/>
     <w:uiPriority w:val="9"/>
     <w:semiHidden/>
     <w:unhideWhenUsed/>
     <w:qFormat/>
-    <w:rsid w:val="00A10FD9"/>
+    <w:rsid w:val="00293C62"/>
     <w:pPr>
       <w:keepNext/>
       <w:keepLines/>
@@ -15719,13 +15788,13 @@
   <w:style w:styleId="Heading6" w:type="paragraph">
     <w:name w:val="heading 6"/>
     <w:basedOn w:val="Normal"/>
-    <w:next w:val="BodyText"/>
+    <w:next w:val="Normal"/>
     <w:link w:val="Heading6Char"/>
     <w:uiPriority w:val="9"/>
     <w:semiHidden/>
     <w:unhideWhenUsed/>
     <w:qFormat/>
-    <w:rsid w:val="00A10FD9"/>
+    <w:rsid w:val="00293C62"/>
     <w:pPr>
       <w:keepNext/>
       <w:keepLines/>
@@ -15742,13 +15811,13 @@
   <w:style w:styleId="Heading7" w:type="paragraph">
     <w:name w:val="heading 7"/>
     <w:basedOn w:val="Normal"/>
-    <w:next w:val="BodyText"/>
+    <w:next w:val="Normal"/>
     <w:link w:val="Heading7Char"/>
     <w:uiPriority w:val="9"/>
     <w:semiHidden/>
     <w:unhideWhenUsed/>
     <w:qFormat/>
-    <w:rsid w:val="00A10FD9"/>
+    <w:rsid w:val="00293C62"/>
     <w:pPr>
       <w:keepNext/>
       <w:keepLines/>
@@ -15763,13 +15832,13 @@
   <w:style w:styleId="Heading8" w:type="paragraph">
     <w:name w:val="heading 8"/>
     <w:basedOn w:val="Normal"/>
-    <w:next w:val="BodyText"/>
+    <w:next w:val="Normal"/>
     <w:link w:val="Heading8Char"/>
     <w:uiPriority w:val="9"/>
     <w:semiHidden/>
     <w:unhideWhenUsed/>
     <w:qFormat/>
-    <w:rsid w:val="00A10FD9"/>
+    <w:rsid w:val="00293C62"/>
     <w:pPr>
       <w:keepNext/>
       <w:keepLines/>
@@ -15786,13 +15855,13 @@
   <w:style w:styleId="Heading9" w:type="paragraph">
     <w:name w:val="heading 9"/>
     <w:basedOn w:val="Normal"/>
-    <w:next w:val="BodyText"/>
+    <w:next w:val="Normal"/>
     <w:link w:val="Heading9Char"/>
     <w:uiPriority w:val="9"/>
     <w:semiHidden/>
     <w:unhideWhenUsed/>
     <w:qFormat/>
-    <w:rsid w:val="00A10FD9"/>
+    <w:rsid w:val="00293C62"/>
     <w:pPr>
       <w:keepNext/>
       <w:keepLines/>
@@ -15804,16 +15873,42 @@
       <w:color w:themeColor="text1" w:themeTint="D8" w:val="272727"/>
     </w:rPr>
   </w:style>
+  <w:style w:default="1" w:styleId="DefaultParagraphFont" w:type="character">
+    <w:name w:val="Default Paragraph Font"/>
+    <w:uiPriority w:val="1"/>
+    <w:semiHidden/>
+    <w:unhideWhenUsed/>
+  </w:style>
+  <w:style w:default="1" w:styleId="TableNormal" w:type="table">
+    <w:name w:val="Normal Table"/>
+    <w:uiPriority w:val="99"/>
+    <w:semiHidden/>
+    <w:unhideWhenUsed/>
+    <w:tblPr>
+      <w:tblInd w:type="dxa" w:w="0"/>
+      <w:tblCellMar>
+        <w:top w:type="dxa" w:w="0"/>
+        <w:left w:type="dxa" w:w="108"/>
+        <w:bottom w:type="dxa" w:w="0"/>
+        <w:right w:type="dxa" w:w="108"/>
+      </w:tblCellMar>
+    </w:tblPr>
+  </w:style>
+  <w:style w:default="1" w:styleId="NoList" w:type="numbering">
+    <w:name w:val="No List"/>
+    <w:uiPriority w:val="99"/>
+    <w:semiHidden/>
+    <w:unhideWhenUsed/>
+  </w:style>
   <w:style w:customStyle="1" w:styleId="Heading1Char" w:type="character">
     <w:name w:val="Heading 1 Char"/>
     <w:basedOn w:val="DefaultParagraphFont"/>
     <w:link w:val="Heading1"/>
     <w:uiPriority w:val="9"/>
-    <w:rsid w:val="00A10FD9"/>
+    <w:rsid w:val="00F61DF2"/>
     <w:rPr>
-      <w:rFonts w:asciiTheme="majorHAnsi" w:cstheme="majorBidi" w:eastAsiaTheme="majorEastAsia" w:hAnsiTheme="majorHAnsi"/>
-      <w:color w:themeColor="accent1" w:themeShade="BF" w:val="0F4761"/>
-      <w:sz w:val="40"/>
+      <w:rFonts w:cstheme="majorBidi" w:eastAsiaTheme="majorEastAsia"/>
+      <w:b/>
       <w:szCs w:val="40"/>
     </w:rPr>
   </w:style>
@@ -15823,11 +15918,10 @@
     <w:link w:val="Heading2"/>
     <w:uiPriority w:val="9"/>
     <w:semiHidden/>
-    <w:rsid w:val="00A10FD9"/>
+    <w:rsid w:val="00F61DF2"/>
     <w:rPr>
-      <w:rFonts w:asciiTheme="majorHAnsi" w:cstheme="majorBidi" w:eastAsiaTheme="majorEastAsia" w:hAnsiTheme="majorHAnsi"/>
-      <w:color w:themeColor="accent1" w:themeShade="BF" w:val="0F4761"/>
-      <w:sz w:val="32"/>
+      <w:rFonts w:cstheme="majorBidi" w:eastAsiaTheme="majorEastAsia"/>
+      <w:b/>
       <w:szCs w:val="32"/>
     </w:rPr>
   </w:style>
@@ -15836,12 +15930,11 @@
     <w:basedOn w:val="DefaultParagraphFont"/>
     <w:link w:val="Heading3"/>
     <w:uiPriority w:val="9"/>
-    <w:semiHidden/>
-    <w:rsid w:val="00A10FD9"/>
+    <w:rsid w:val="00F61DF2"/>
     <w:rPr>
       <w:rFonts w:cstheme="majorBidi" w:eastAsiaTheme="majorEastAsia"/>
-      <w:color w:themeColor="accent1" w:themeShade="BF" w:val="0F4761"/>
-      <w:sz w:val="28"/>
+      <w:b/>
+      <w:i/>
       <w:szCs w:val="28"/>
     </w:rPr>
   </w:style>
@@ -15851,7 +15944,7 @@
     <w:link w:val="Heading4"/>
     <w:uiPriority w:val="9"/>
     <w:semiHidden/>
-    <w:rsid w:val="00A10FD9"/>
+    <w:rsid w:val="00293C62"/>
     <w:rPr>
       <w:rFonts w:cstheme="majorBidi" w:eastAsiaTheme="majorEastAsia"/>
       <w:i/>
@@ -15865,7 +15958,7 @@
     <w:link w:val="Heading5"/>
     <w:uiPriority w:val="9"/>
     <w:semiHidden/>
-    <w:rsid w:val="00A10FD9"/>
+    <w:rsid w:val="00293C62"/>
     <w:rPr>
       <w:rFonts w:cstheme="majorBidi" w:eastAsiaTheme="majorEastAsia"/>
       <w:color w:themeColor="accent1" w:themeShade="BF" w:val="0F4761"/>
@@ -15877,7 +15970,7 @@
     <w:link w:val="Heading6"/>
     <w:uiPriority w:val="9"/>
     <w:semiHidden/>
-    <w:rsid w:val="00A10FD9"/>
+    <w:rsid w:val="00293C62"/>
     <w:rPr>
       <w:rFonts w:cstheme="majorBidi" w:eastAsiaTheme="majorEastAsia"/>
       <w:i/>
@@ -15891,7 +15984,7 @@
     <w:link w:val="Heading7"/>
     <w:uiPriority w:val="9"/>
     <w:semiHidden/>
-    <w:rsid w:val="00A10FD9"/>
+    <w:rsid w:val="00293C62"/>
     <w:rPr>
       <w:rFonts w:cstheme="majorBidi" w:eastAsiaTheme="majorEastAsia"/>
       <w:color w:themeColor="text1" w:themeTint="A6" w:val="595959"/>
@@ -15903,7 +15996,7 @@
     <w:link w:val="Heading8"/>
     <w:uiPriority w:val="9"/>
     <w:semiHidden/>
-    <w:rsid w:val="00A10FD9"/>
+    <w:rsid w:val="00293C62"/>
     <w:rPr>
       <w:rFonts w:cstheme="majorBidi" w:eastAsiaTheme="majorEastAsia"/>
       <w:i/>
@@ -15917,178 +16010,289 @@
     <w:link w:val="Heading9"/>
     <w:uiPriority w:val="9"/>
     <w:semiHidden/>
-    <w:rsid w:val="00A10FD9"/>
+    <w:rsid w:val="00293C62"/>
     <w:rPr>
       <w:rFonts w:cstheme="majorBidi" w:eastAsiaTheme="majorEastAsia"/>
       <w:color w:themeColor="text1" w:themeTint="D8" w:val="272727"/>
     </w:rPr>
   </w:style>
-  <w:style w:styleId="BlockText" w:type="paragraph">
-    <w:name w:val="Block Text"/>
-    <w:basedOn w:val="BodyText"/>
-    <w:next w:val="BodyText"/>
-    <w:uiPriority w:val="9"/>
-    <w:unhideWhenUsed/>
+  <w:style w:styleId="Title" w:type="paragraph">
+    <w:name w:val="Title"/>
+    <w:basedOn w:val="Normal"/>
+    <w:next w:val="Normal"/>
+    <w:link w:val="TitleChar"/>
+    <w:uiPriority w:val="10"/>
     <w:qFormat/>
+    <w:rsid w:val="00293C62"/>
     <w:pPr>
-      <w:spacing w:after="100" w:before="100"/>
-      <w:ind w:firstLine="0" w:left="480" w:right="480"/>
-    </w:pPr>
-  </w:style>
-  <w:style w:styleId="FootnoteText" w:type="paragraph">
-    <w:name w:val="Footnote Text"/>
-    <w:basedOn w:val="Normal"/>
-    <w:next w:val="FootnoteText"/>
-    <w:uiPriority w:val="9"/>
-    <w:unhideWhenUsed/>
-    <w:qFormat/>
-  </w:style>
-  <w:style w:styleId="FootnoteBlockText" w:type="paragraph">
-    <w:name w:val="Footnote Block Text"/>
-    <w:basedOn w:val="FootnoteText"/>
-    <w:next w:val="FootnoteText"/>
-    <w:uiPriority w:val="9"/>
-    <w:unhideWhenUsed/>
-    <w:qFormat/>
-    <w:pPr>
-      <w:spacing w:after="100" w:before="100"/>
-      <w:ind w:firstLine="0" w:left="480" w:right="480"/>
-    </w:pPr>
-  </w:style>
-  <w:style w:default="1" w:styleId="DefaultParagraphFont" w:type="character">
-    <w:name w:val="Default Paragraph Font"/>
-    <w:semiHidden/>
-    <w:unhideWhenUsed/>
-  </w:style>
-  <w:style w:default="1" w:styleId="Table" w:type="table">
-    <w:name w:val="Table"/>
-    <w:basedOn w:val="TableNormal"/>
-    <w:semiHidden/>
-    <w:unhideWhenUsed/>
-    <w:qFormat/>
-    <w:tblPr>
-      <w:tblInd w:type="dxa" w:w="0"/>
-      <w:tblCellMar>
-        <w:top w:type="dxa" w:w="0"/>
-        <w:left w:type="dxa" w:w="108"/>
-        <w:bottom w:type="dxa" w:w="0"/>
-        <w:right w:type="dxa" w:w="108"/>
-      </w:tblCellMar>
-    </w:tblPr>
-    <w:tblStylePr w:type="firstRow">
-      <w:tblPr>
-        <w:jc w:val="left"/>
-        <w:tblInd w:type="dxa" w:w="0"/>
-      </w:tblPr>
-      <w:trPr>
-        <w:jc w:val="left"/>
-      </w:trPr>
-      <w:tcPr>
-        <w:tcBorders>
-          <w:bottom w:val="single"/>
-        </w:tcBorders>
-        <w:vAlign w:val="bottom"/>
-      </w:tcPr>
-    </w:tblStylePr>
-  </w:style>
-  <w:style w:customStyle="1" w:styleId="DefinitionTerm" w:type="paragraph">
-    <w:name w:val="Definition Term"/>
-    <w:basedOn w:val="Normal"/>
-    <w:next w:val="Definition"/>
-    <w:pPr>
-      <w:keepNext/>
-      <w:keepLines/>
-      <w:spacing w:after="0"/>
+      <w:spacing w:after="80" w:line="240" w:lineRule="auto"/>
+      <w:contextualSpacing/>
     </w:pPr>
     <w:rPr>
-      <w:b/>
+      <w:rFonts w:asciiTheme="majorHAnsi" w:cstheme="majorBidi" w:eastAsiaTheme="majorEastAsia" w:hAnsiTheme="majorHAnsi"/>
+      <w:spacing w:val="-10"/>
+      <w:kern w:val="28"/>
+      <w:sz w:val="56"/>
+      <w:szCs w:val="56"/>
     </w:rPr>
   </w:style>
-  <w:style w:customStyle="1" w:styleId="Definition" w:type="paragraph">
-    <w:name w:val="Definition"/>
+  <w:style w:customStyle="1" w:styleId="TitleChar" w:type="character">
+    <w:name w:val="Title Char"/>
+    <w:basedOn w:val="DefaultParagraphFont"/>
+    <w:link w:val="Title"/>
+    <w:uiPriority w:val="10"/>
+    <w:rsid w:val="00293C62"/>
+    <w:rPr>
+      <w:rFonts w:asciiTheme="majorHAnsi" w:cstheme="majorBidi" w:eastAsiaTheme="majorEastAsia" w:hAnsiTheme="majorHAnsi"/>
+      <w:spacing w:val="-10"/>
+      <w:kern w:val="28"/>
+      <w:sz w:val="56"/>
+      <w:szCs w:val="56"/>
+    </w:rPr>
+  </w:style>
+  <w:style w:styleId="Subtitle" w:type="paragraph">
+    <w:name w:val="Subtitle"/>
     <w:basedOn w:val="Normal"/>
+    <w:next w:val="Normal"/>
+    <w:link w:val="SubtitleChar"/>
+    <w:uiPriority w:val="11"/>
+    <w:qFormat/>
+    <w:rsid w:val="00293C62"/>
+    <w:pPr>
+      <w:numPr>
+        <w:ilvl w:val="1"/>
+      </w:numPr>
+    </w:pPr>
+    <w:rPr>
+      <w:rFonts w:cstheme="majorBidi" w:eastAsiaTheme="majorEastAsia"/>
+      <w:color w:themeColor="text1" w:themeTint="A6" w:val="595959"/>
+      <w:spacing w:val="15"/>
+      <w:sz w:val="28"/>
+      <w:szCs w:val="28"/>
+    </w:rPr>
   </w:style>
-  <w:style w:styleId="Caption" w:type="paragraph">
-    <w:name w:val="Caption"/>
+  <w:style w:customStyle="1" w:styleId="SubtitleChar" w:type="character">
+    <w:name w:val="Subtitle Char"/>
+    <w:basedOn w:val="DefaultParagraphFont"/>
+    <w:link w:val="Subtitle"/>
+    <w:uiPriority w:val="11"/>
+    <w:rsid w:val="00293C62"/>
+    <w:rPr>
+      <w:rFonts w:cstheme="majorBidi" w:eastAsiaTheme="majorEastAsia"/>
+      <w:color w:themeColor="text1" w:themeTint="A6" w:val="595959"/>
+      <w:spacing w:val="15"/>
+      <w:sz w:val="28"/>
+      <w:szCs w:val="28"/>
+    </w:rPr>
+  </w:style>
+  <w:style w:styleId="Quote" w:type="paragraph">
+    <w:name w:val="Quote"/>
     <w:basedOn w:val="Normal"/>
-    <w:link w:val="BodyTextChar"/>
+    <w:next w:val="Normal"/>
+    <w:link w:val="QuoteChar"/>
+    <w:uiPriority w:val="29"/>
+    <w:qFormat/>
+    <w:rsid w:val="00293C62"/>
     <w:pPr>
-      <w:spacing w:after="120" w:before="0"/>
+      <w:spacing w:before="160"/>
+      <w:jc w:val="center"/>
     </w:pPr>
     <w:rPr>
       <w:i/>
+      <w:iCs/>
+      <w:color w:themeColor="text1" w:themeTint="BF" w:val="404040"/>
     </w:rPr>
   </w:style>
-  <w:style w:customStyle="1" w:styleId="TableCaption" w:type="paragraph">
-    <w:name w:val="Table Caption"/>
-    <w:basedOn w:val="Caption"/>
+  <w:style w:customStyle="1" w:styleId="QuoteChar" w:type="character">
+    <w:name w:val="Quote Char"/>
+    <w:basedOn w:val="DefaultParagraphFont"/>
+    <w:link w:val="Quote"/>
+    <w:uiPriority w:val="29"/>
+    <w:rsid w:val="00293C62"/>
+    <w:rPr>
+      <w:i/>
+      <w:iCs/>
+      <w:color w:themeColor="text1" w:themeTint="BF" w:val="404040"/>
+    </w:rPr>
+  </w:style>
+  <w:style w:styleId="ListParagraph" w:type="paragraph">
+    <w:name w:val="List Paragraph"/>
+    <w:basedOn w:val="Normal"/>
+    <w:uiPriority w:val="34"/>
+    <w:qFormat/>
+    <w:rsid w:val="00293C62"/>
     <w:pPr>
-      <w:keepNext/>
+      <w:ind w:left="720"/>
+      <w:contextualSpacing/>
     </w:pPr>
   </w:style>
-  <w:style w:customStyle="1" w:styleId="ImageCaption" w:type="paragraph">
-    <w:name w:val="Image Caption"/>
-    <w:basedOn w:val="Caption"/>
+  <w:style w:styleId="IntenseEmphasis" w:type="character">
+    <w:name w:val="Intense Emphasis"/>
+    <w:basedOn w:val="DefaultParagraphFont"/>
+    <w:uiPriority w:val="21"/>
+    <w:qFormat/>
+    <w:rsid w:val="00293C62"/>
+    <w:rPr>
+      <w:i/>
+      <w:iCs/>
+      <w:color w:themeColor="accent1" w:themeShade="BF" w:val="0F4761"/>
+    </w:rPr>
   </w:style>
-  <w:style w:customStyle="1" w:styleId="Figure" w:type="paragraph">
-    <w:name w:val="Figure"/>
+  <w:style w:styleId="IntenseQuote" w:type="paragraph">
+    <w:name w:val="Intense Quote"/>
     <w:basedOn w:val="Normal"/>
+    <w:next w:val="Normal"/>
+    <w:link w:val="IntenseQuoteChar"/>
+    <w:uiPriority w:val="30"/>
+    <w:qFormat/>
+    <w:rsid w:val="00293C62"/>
+    <w:pPr>
+      <w:pBdr>
+        <w:top w:color="0F4761" w:space="10" w:sz="4" w:themeColor="accent1" w:themeShade="BF" w:val="single"/>
+        <w:bottom w:color="0F4761" w:space="10" w:sz="4" w:themeColor="accent1" w:themeShade="BF" w:val="single"/>
+      </w:pBdr>
+      <w:spacing w:after="360" w:before="360"/>
+      <w:ind w:left="864" w:right="864"/>
+      <w:jc w:val="center"/>
+    </w:pPr>
+    <w:rPr>
+      <w:i/>
+      <w:iCs/>
+      <w:color w:themeColor="accent1" w:themeShade="BF" w:val="0F4761"/>
+    </w:rPr>
   </w:style>
-  <w:style w:customStyle="1" w:styleId="CaptionedFigure" w:type="paragraph">
-    <w:name w:val="Captioned Figure"/>
-    <w:basedOn w:val="Figure"/>
+  <w:style w:customStyle="1" w:styleId="IntenseQuoteChar" w:type="character">
+    <w:name w:val="Intense Quote Char"/>
+    <w:basedOn w:val="DefaultParagraphFont"/>
+    <w:link w:val="IntenseQuote"/>
+    <w:uiPriority w:val="30"/>
+    <w:rsid w:val="00293C62"/>
+    <w:rPr>
+      <w:i/>
+      <w:iCs/>
+      <w:color w:themeColor="accent1" w:themeShade="BF" w:val="0F4761"/>
+    </w:rPr>
+  </w:style>
+  <w:style w:styleId="IntenseReference" w:type="character">
+    <w:name w:val="Intense Reference"/>
+    <w:basedOn w:val="DefaultParagraphFont"/>
+    <w:uiPriority w:val="32"/>
+    <w:qFormat/>
+    <w:rsid w:val="00293C62"/>
+    <w:rPr>
+      <w:b/>
+      <w:bCs/>
+      <w:smallCaps/>
+      <w:color w:themeColor="accent1" w:themeShade="BF" w:val="0F4761"/>
+      <w:spacing w:val="5"/>
+    </w:rPr>
+  </w:style>
+  <w:style w:styleId="Header" w:type="paragraph">
+    <w:name w:val="header"/>
+    <w:basedOn w:val="Normal"/>
+    <w:link w:val="HeaderChar"/>
+    <w:uiPriority w:val="99"/>
+    <w:unhideWhenUsed/>
+    <w:rsid w:val="000016B7"/>
     <w:pPr>
-      <w:keepNext/>
+      <w:tabs>
+        <w:tab w:pos="4513" w:val="center"/>
+        <w:tab w:pos="9026" w:val="right"/>
+      </w:tabs>
+      <w:spacing w:after="0" w:line="240" w:lineRule="auto"/>
     </w:pPr>
   </w:style>
-  <w:style w:customStyle="1" w:styleId="BodyTextChar" w:type="character">
-    <w:name w:val="Body Text Char"/>
+  <w:style w:customStyle="1" w:styleId="HeaderChar" w:type="character">
+    <w:name w:val="Header Char"/>
     <w:basedOn w:val="DefaultParagraphFont"/>
-    <w:link w:val="BodyText"/>
+    <w:link w:val="Header"/>
+    <w:uiPriority w:val="99"/>
+    <w:rsid w:val="000016B7"/>
   </w:style>
-  <w:style w:customStyle="1" w:styleId="VerbatimChar" w:type="character">
-    <w:name w:val="Verbatim Char"/>
-    <w:basedOn w:val="BodyTextChar"/>
+  <w:style w:styleId="Footer" w:type="paragraph">
+    <w:name w:val="footer"/>
+    <w:basedOn w:val="Normal"/>
+    <w:link w:val="FooterChar"/>
+    <w:uiPriority w:val="99"/>
+    <w:unhideWhenUsed/>
+    <w:rsid w:val="000016B7"/>
+    <w:pPr>
+      <w:tabs>
+        <w:tab w:pos="4513" w:val="center"/>
+        <w:tab w:pos="9026" w:val="right"/>
+      </w:tabs>
+      <w:spacing w:after="0" w:line="240" w:lineRule="auto"/>
+    </w:pPr>
+  </w:style>
+  <w:style w:customStyle="1" w:styleId="FooterChar" w:type="character">
+    <w:name w:val="Footer Char"/>
+    <w:basedOn w:val="DefaultParagraphFont"/>
+    <w:link w:val="Footer"/>
+    <w:uiPriority w:val="99"/>
+    <w:rsid w:val="000016B7"/>
+  </w:style>
+  <w:style w:styleId="FootnoteText" w:type="paragraph">
+    <w:name w:val="footnote text"/>
+    <w:basedOn w:val="Normal"/>
+    <w:link w:val="FootnoteTextChar"/>
+    <w:uiPriority w:val="99"/>
+    <w:semiHidden/>
+    <w:unhideWhenUsed/>
+    <w:rsid w:val="00607D40"/>
+    <w:pPr>
+      <w:spacing w:after="0" w:line="240" w:lineRule="auto"/>
+    </w:pPr>
     <w:rPr>
-      <w:rFonts w:ascii="Consolas" w:hAnsi="Consolas"/>
-      <w:sz w:val="22"/>
+      <w:sz w:val="20"/>
+      <w:szCs w:val="20"/>
     </w:rPr>
   </w:style>
-  <w:style w:customStyle="1" w:styleId="SectionNumber" w:type="character">
-    <w:name w:val="Section Number"/>
-    <w:basedOn w:val="BodyTextChar"/>
+  <w:style w:customStyle="1" w:styleId="FootnoteTextChar" w:type="character">
+    <w:name w:val="Footnote Text Char"/>
+    <w:basedOn w:val="DefaultParagraphFont"/>
+    <w:link w:val="FootnoteText"/>
+    <w:uiPriority w:val="99"/>
+    <w:semiHidden/>
+    <w:rsid w:val="00607D40"/>
+    <w:rPr>
+      <w:sz w:val="20"/>
+      <w:szCs w:val="20"/>
+    </w:rPr>
   </w:style>
   <w:style w:styleId="FootnoteReference" w:type="character">
-    <w:name w:val="Footnote Reference"/>
-    <w:basedOn w:val="BodyTextChar"/>
+    <w:name w:val="footnote reference"/>
+    <w:basedOn w:val="DefaultParagraphFont"/>
+    <w:uiPriority w:val="99"/>
+    <w:semiHidden/>
+    <w:unhideWhenUsed/>
+    <w:rsid w:val="00607D40"/>
     <w:rPr>
       <w:vertAlign w:val="superscript"/>
     </w:rPr>
   </w:style>
-  <w:style w:styleId="Hyperlink" w:type="character">
-    <w:name w:val="Hyperlink"/>
-    <w:basedOn w:val="BodyTextChar"/>
-    <w:rPr>
-      <w:color w:themeColor="accent1" w:val="4F81BD"/>
-    </w:rPr>
+  <w:style w:styleId="TableGrid" w:type="table">
+    <w:name w:val="Table Grid"/>
+    <w:basedOn w:val="TableNormal"/>
+    <w:uiPriority w:val="39"/>
+    <w:rsid w:val="00607D40"/>
+    <w:pPr>
+      <w:spacing w:after="0" w:line="240" w:lineRule="auto"/>
+    </w:pPr>
+    <w:tblPr>
+      <w:tblBorders>
+        <w:top w:color="auto" w:space="0" w:sz="4" w:val="single"/>
+        <w:left w:color="auto" w:space="0" w:sz="4" w:val="single"/>
+        <w:bottom w:color="auto" w:space="0" w:sz="4" w:val="single"/>
+        <w:right w:color="auto" w:space="0" w:sz="4" w:val="single"/>
+        <w:insideH w:color="auto" w:space="0" w:sz="4" w:val="single"/>
+        <w:insideV w:color="auto" w:space="0" w:sz="4" w:val="single"/>
+      </w:tblBorders>
+    </w:tblPr>
   </w:style>
-  <w:style w:styleId="TOCHeading" w:type="paragraph">
-    <w:name w:val="TOC Heading"/>
-    <w:basedOn w:val="Heading1"/>
-    <w:next w:val="BodyText"/>
-    <w:uiPriority w:val="39"/>
-    <w:unhideWhenUsed/>
+  <w:style w:type="paragraph" w:customStyle="1" w:styleId="TableCaption">
+    <w:name w:val="Table Caption"/>
+    <w:basedOn w:val="BodyText"/>
     <w:qFormat/>
-    <w:pPr>
-      <w:spacing w:before="240" w:line="259" w:lineRule="auto"/>
-      <w:outlineLvl w:val="9"/>
-    </w:pPr>
-    <w:rPr>
-      <w:rFonts w:asciiTheme="majorHAnsi" w:cstheme="majorBidi" w:eastAsiaTheme="majorEastAsia" w:hAnsiTheme="majorHAnsi"/>
-      <w:b w:val="0"/>
-      <w:bCs w:val="0"/>
-      <w:color w:themeColor="accent1" w:themeShade="BF" w:val="365F91"/>
-    </w:rPr>
   </w:style>
   <w:style w:type="paragraph" w:customStyle="1" w:styleId="SourceCode">
     <w:name w:val="Source Code"/>
@@ -16461,7 +16665,7 @@
         <a:latin typeface="Aptos" panose="02110004020202020204"/>
         <a:ea typeface=""/>
         <a:cs typeface=""/>
-        <a:font script="Jpan" typeface="游明朝"/>
+        <a:font script="Jpan" typeface="游ゴシック"/>
         <a:font script="Hang" typeface="맑은 고딕"/>
         <a:font script="Hans" typeface="等线"/>
         <a:font script="Hant" typeface="新細明體"/>
@@ -16652,7 +16856,7 @@
   <a:extraClrSchemeLst/>
   <a:extLst>
     <a:ext uri="{05A4C25C-085E-4340-85A3-A5531E510DB2}">
-      <thm15:themeFamily xmlns:thm15="http://schemas.microsoft.com/office/thememl/2012/main" name="Office Theme" id="{2E142A2C-CD16-42D6-873A-C26D2A0506FA}" vid="{1BDDFF52-6CD6-40A5-AB3C-68EB2F1E4D0A}"/>
+      <thm15:themeFamily xmlns:thm15="http://schemas.microsoft.com/office/thememl/2012/main" name="Office Theme" id="{62F939B6-93AF-4DB8-9C6B-D6C7DFDC589F}" vid="{4A3C46E8-61CC-4603-A589-7422A47A8E4A}"/>
     </a:ext>
   </a:extLst>
 </a:theme>

</xml_diff>

<commit_message>
small adjustments to the paper
</commit_message>
<xml_diff>
--- a/paper_main.docx
+++ b/paper_main.docx
@@ -2,7 +2,7 @@
 <file path=word/document.xml><?xml version="1.0" encoding="utf-8"?>
 <w:document xmlns:w="http://schemas.openxmlformats.org/wordprocessingml/2006/main" xmlns:m="http://schemas.openxmlformats.org/officeDocument/2006/math" xmlns:r="http://schemas.openxmlformats.org/officeDocument/2006/relationships" xmlns:o="urn:schemas-microsoft-com:office:office" xmlns:v="urn:schemas-microsoft-com:vml" xmlns:w10="urn:schemas-microsoft-com:office:word" xmlns:a="http://schemas.openxmlformats.org/drawingml/2006/main" xmlns:pic="http://schemas.openxmlformats.org/drawingml/2006/picture" xmlns:wp="http://schemas.openxmlformats.org/drawingml/2006/wordprocessingDrawing">
   <w:body>
-    <w:bookmarkStart w:id="29" w:name="X2c1e7606d135571962e7f60c7c77b8e5cbc0dc4"/>
+    <w:bookmarkStart w:id="16" w:name="X2c1e7606d135571962e7f60c7c77b8e5cbc0dc4"/>
     <w:p>
       <w:pPr>
         <w:pStyle w:val="Heading1"/>
@@ -11,373 +11,40 @@
         <w:t xml:space="preserve">Eye Tracking in a Polysynthetic Language: Evidence for a Distinction between Lexical and Grammatical Suffixes</w:t>
       </w:r>
     </w:p>
+    <w:bookmarkEnd w:id="16"/>
+    <w:bookmarkStart w:id="17" w:name="abstract"/>
+    <w:p>
+      <w:pPr>
+        <w:pStyle w:val="Heading1"/>
+      </w:pPr>
+      <w:r>
+        <w:t xml:space="preserve">Abstract</w:t>
+      </w:r>
+    </w:p>
     <w:p>
       <w:pPr>
         <w:pStyle w:val="FirstParagraph"/>
       </w:pPr>
       <w:r>
-        <w:t xml:space="preserve">Solvej W. Jaeger</w:t>
-      </w:r>
-      <w:r>
-        <w:rPr>
-          <w:vertAlign w:val="superscript"/>
-        </w:rPr>
-        <w:t xml:space="preserve">a</w:t>
-      </w:r>
-      <w:r>
-        <w:t xml:space="preserve">*, Johanne S. K. Nedergaard</w:t>
-      </w:r>
-      <w:r>
-        <w:rPr>
-          <w:vertAlign w:val="superscript"/>
-        </w:rPr>
-        <w:t xml:space="preserve">a</w:t>
-      </w:r>
-      <w:r>
-        <w:t xml:space="preserve">, Mads Nielsen</w:t>
-      </w:r>
-      <w:r>
-        <w:rPr>
-          <w:vertAlign w:val="superscript"/>
-        </w:rPr>
-        <w:t xml:space="preserve">a</w:t>
-      </w:r>
-      <w:r>
-        <w:t xml:space="preserve">, Naja B. Trondhjem</w:t>
-      </w:r>
-      <w:r>
-        <w:rPr>
-          <w:vertAlign w:val="superscript"/>
-        </w:rPr>
-        <w:t xml:space="preserve">b,c</w:t>
-      </w:r>
-      <w:r>
-        <w:t xml:space="preserve">, Malu A. Hendriksen</w:t>
-      </w:r>
-      <w:r>
-        <w:rPr>
-          <w:vertAlign w:val="superscript"/>
-        </w:rPr>
-        <w:t xml:space="preserve">b</w:t>
-      </w:r>
-      <w:r>
-        <w:t xml:space="preserve">, Amalie H. Joergensen</w:t>
-      </w:r>
-      <w:r>
-        <w:rPr>
-          <w:vertAlign w:val="superscript"/>
-        </w:rPr>
-        <w:t xml:space="preserve">a</w:t>
-      </w:r>
-      <w:r>
-        <w:t xml:space="preserve">, Kasper Boye</w:t>
-      </w:r>
-      <w:r>
-        <w:rPr>
-          <w:vertAlign w:val="superscript"/>
-        </w:rPr>
-        <w:t xml:space="preserve">a</w:t>
-      </w:r>
-    </w:p>
-    <w:p>
-      <w:pPr>
-        <w:pStyle w:val="BodyText"/>
-      </w:pPr>
-    </w:p>
-    <w:p>
-      <w:pPr>
-        <w:pStyle w:val="BodyText"/>
-      </w:pPr>
-      <w:r>
-        <w:rPr>
-          <w:vertAlign w:val="superscript"/>
-        </w:rPr>
-        <w:t xml:space="preserve">a</w:t>
-      </w:r>
-      <w:r>
-        <w:t xml:space="preserve"> </w:t>
-      </w:r>
-      <w:r>
-        <w:t xml:space="preserve">Department of Nordic Studies and Linguistics, University of Copenhagen,</w:t>
-      </w:r>
-      <w:r>
-        <w:br/>
-      </w:r>
-      <w:r>
-        <w:t xml:space="preserve">Njalsgade 76, 2300 Copenhagen S, Denmark</w:t>
-      </w:r>
-      <w:r>
-        <w:br/>
-      </w:r>
-      <w:r>
-        <w:t xml:space="preserve">Email:</w:t>
-      </w:r>
-      <w:r>
-        <w:t xml:space="preserve"> </w:t>
-      </w:r>
-      <w:hyperlink r:id="rId20">
-        <w:r>
-          <w:rPr>
-            <w:rStyle w:val="Hyperlink"/>
-          </w:rPr>
-          <w:t xml:space="preserve">swj@hum.ku.dk</w:t>
-        </w:r>
-      </w:hyperlink>
-      <w:r>
-        <w:t xml:space="preserve">;</w:t>
-      </w:r>
-      <w:r>
-        <w:t xml:space="preserve"> </w:t>
-      </w:r>
-      <w:hyperlink r:id="rId21">
-        <w:r>
-          <w:rPr>
-            <w:rStyle w:val="Hyperlink"/>
-          </w:rPr>
-          <w:t xml:space="preserve">jskn@hum.ku.dk</w:t>
-        </w:r>
-      </w:hyperlink>
-      <w:r>
-        <w:t xml:space="preserve">;</w:t>
-      </w:r>
-      <w:r>
-        <w:t xml:space="preserve"> </w:t>
-      </w:r>
-      <w:hyperlink r:id="rId22">
-        <w:r>
-          <w:rPr>
-            <w:rStyle w:val="Hyperlink"/>
-          </w:rPr>
-          <w:t xml:space="preserve">mni@hum.ku.dk</w:t>
-        </w:r>
-      </w:hyperlink>
-      <w:r>
-        <w:t xml:space="preserve">;</w:t>
-      </w:r>
-      <w:r>
-        <w:t xml:space="preserve"> </w:t>
-      </w:r>
-      <w:hyperlink r:id="rId23">
-        <w:r>
-          <w:rPr>
-            <w:rStyle w:val="Hyperlink"/>
-          </w:rPr>
-          <w:t xml:space="preserve">srd228@alumni.ku.dk</w:t>
-        </w:r>
-      </w:hyperlink>
-      <w:r>
-        <w:t xml:space="preserve">;</w:t>
-      </w:r>
-      <w:r>
-        <w:t xml:space="preserve"> </w:t>
-      </w:r>
-      <w:hyperlink r:id="rId24">
-        <w:r>
-          <w:rPr>
-            <w:rStyle w:val="Hyperlink"/>
-          </w:rPr>
-          <w:t xml:space="preserve">boye@hum.ku.dk</w:t>
-        </w:r>
-      </w:hyperlink>
-    </w:p>
-    <w:p>
-      <w:pPr>
-        <w:pStyle w:val="BodyText"/>
-      </w:pPr>
-    </w:p>
-    <w:p>
-      <w:pPr>
-        <w:pStyle w:val="BodyText"/>
-      </w:pPr>
-      <w:r>
-        <w:rPr>
-          <w:vertAlign w:val="superscript"/>
-        </w:rPr>
-        <w:t xml:space="preserve">b</w:t>
-      </w:r>
-      <w:r>
-        <w:t xml:space="preserve"> </w:t>
-      </w:r>
-      <w:r>
-        <w:t xml:space="preserve">Department of Cross-Cultural and Regional Studies, University of Copenhagen,</w:t>
-      </w:r>
-      <w:r>
-        <w:br/>
-      </w:r>
-      <w:r>
-        <w:t xml:space="preserve">Karen Blixens Plads 8, 2300 Copenhagen S, Denmark</w:t>
-      </w:r>
-      <w:r>
-        <w:br/>
-      </w:r>
-      <w:r>
-        <w:t xml:space="preserve">Email:</w:t>
-      </w:r>
-      <w:r>
-        <w:t xml:space="preserve"> </w:t>
-      </w:r>
-      <w:hyperlink r:id="rId25">
-        <w:r>
-          <w:rPr>
-            <w:rStyle w:val="Hyperlink"/>
-          </w:rPr>
-          <w:t xml:space="preserve">trondhjem@hum.ku.dk</w:t>
-        </w:r>
-      </w:hyperlink>
-      <w:r>
-        <w:t xml:space="preserve">;</w:t>
-      </w:r>
-      <w:r>
-        <w:t xml:space="preserve"> </w:t>
-      </w:r>
-      <w:hyperlink r:id="rId26">
-        <w:r>
-          <w:rPr>
-            <w:rStyle w:val="Hyperlink"/>
-          </w:rPr>
-          <w:t xml:space="preserve">nfj459@hum.ku.dk</w:t>
-        </w:r>
-      </w:hyperlink>
-    </w:p>
-    <w:p>
-      <w:pPr>
-        <w:pStyle w:val="BodyText"/>
-      </w:pPr>
-    </w:p>
-    <w:p>
-      <w:pPr>
-        <w:pStyle w:val="BodyText"/>
-      </w:pPr>
-      <w:r>
-        <w:rPr>
-          <w:vertAlign w:val="superscript"/>
-        </w:rPr>
-        <w:t xml:space="preserve">c</w:t>
-      </w:r>
-      <w:r>
-        <w:t xml:space="preserve"> </w:t>
-      </w:r>
-      <w:r>
-        <w:t xml:space="preserve">Centre for Language Research, Ilisimatusarfik,</w:t>
-      </w:r>
-      <w:r>
-        <w:br/>
-      </w:r>
-      <w:r>
-        <w:t xml:space="preserve">Manutooq 1, 3905 Nuussuaq, Greenland</w:t>
-      </w:r>
-      <w:r>
-        <w:br/>
-      </w:r>
-      <w:r>
-        <w:t xml:space="preserve">Email:</w:t>
-      </w:r>
-      <w:r>
-        <w:t xml:space="preserve"> </w:t>
-      </w:r>
-      <w:hyperlink r:id="rId27">
-        <w:r>
-          <w:rPr>
-            <w:rStyle w:val="Hyperlink"/>
-          </w:rPr>
-          <w:t xml:space="preserve">natr@uni.gl</w:t>
-        </w:r>
-      </w:hyperlink>
-    </w:p>
-    <w:p>
-      <w:pPr>
-        <w:pStyle w:val="BodyText"/>
-      </w:pPr>
-    </w:p>
-    <w:p>
-      <w:pPr>
-        <w:pStyle w:val="BodyText"/>
-      </w:pPr>
-      <w:r>
-        <w:t xml:space="preserve">*Corresponding author</w:t>
-      </w:r>
-    </w:p>
-    <w:p>
-      <w:pPr>
-        <w:pStyle w:val="BodyText"/>
-      </w:pPr>
-      <w:r>
-        <w:t xml:space="preserve">Solvej W. Jaeger</w:t>
-      </w:r>
-      <w:r>
-        <w:br/>
-      </w:r>
-      <w:r>
-        <w:t xml:space="preserve">Department of Nordic Studies and Linguistics</w:t>
-      </w:r>
-      <w:r>
-        <w:br/>
-      </w:r>
-      <w:r>
-        <w:t xml:space="preserve">University of Copenhagen</w:t>
-      </w:r>
-      <w:r>
-        <w:br/>
-      </w:r>
-      <w:r>
-        <w:t xml:space="preserve">Njalsgade 76</w:t>
-      </w:r>
-      <w:r>
-        <w:br/>
-      </w:r>
-      <w:r>
-        <w:t xml:space="preserve">2300 Copenhagen S</w:t>
-      </w:r>
-      <w:r>
-        <w:br/>
-      </w:r>
-      <w:r>
-        <w:t xml:space="preserve">Denmark</w:t>
-      </w:r>
-      <w:r>
-        <w:br/>
-      </w:r>
-    </w:p>
-    <w:p>
-      <w:pPr>
-        <w:pStyle w:val="BodyText"/>
-      </w:pPr>
-      <w:r>
-        <w:t xml:space="preserve">Email:</w:t>
-      </w:r>
-      <w:r>
-        <w:t xml:space="preserve"> </w:t>
-      </w:r>
-      <w:hyperlink r:id="rId20">
-        <w:r>
-          <w:rPr>
-            <w:rStyle w:val="Hyperlink"/>
-          </w:rPr>
-          <w:t xml:space="preserve">swj@hum.ku.dk</w:t>
-        </w:r>
-      </w:hyperlink>
-      <w:r>
-        <w:br/>
-      </w:r>
-      <w:r>
-        <w:t xml:space="preserve">Alternative email:</w:t>
-      </w:r>
-      <w:r>
-        <w:t xml:space="preserve"> </w:t>
-      </w:r>
-      <w:hyperlink r:id="rId28">
-        <w:r>
-          <w:rPr>
-            <w:rStyle w:val="Hyperlink"/>
-          </w:rPr>
-          <w:t xml:space="preserve">solvej.jaeger@gmail.com</w:t>
-        </w:r>
-      </w:hyperlink>
-      <w:r>
-        <w:br/>
-      </w:r>
-      <w:r>
-        <w:t xml:space="preserve">Phone: +45 53 31 33 07</w:t>
+        <w:t xml:space="preserve">This eye-tracking study investigates the processing of multi-morphemic words during reading in Kalaallisut (Greenlandic), a so-called polysynthetic language characterized by extreme morphological richness. The study has two main aims. First, it tests the hypothesis that some Kalaallisut derivational suffixes are lexical rather than grammatical, and that this distinction is reflected in the allocation of visual attention during reading. Second, it provides an exploratory account of overall fixation patterns on multi-morphemic words in Kalaallisut reading. The hypothesis-driven analyses show that lexical suffixes elicited longer first fixation durations and gaze durations than grammatical suffixes, even when suffix frequency and length were controlled for, supporting the proposed lexical–grammatical distinction and challenging the widespread assumption that affixes form a uniformly grammatical category. In addition, suffix frequency and length significantly influenced reading measures in ways that parallel well-established word-level effects in other languages, suggesting that suffixes function as processing units in Kalaallisut reading. Turning to the exploratory analyses, long, multi-morphemic words elicited a high density of fixations compared to shorter words, indicating substantial processing demands. Within multi-morphemic words, visual attention was asymmetrically distributed, with fixations most highly concentrated near the root at the beginning of the word.</w:t>
+      </w:r>
+    </w:p>
+    <w:bookmarkEnd w:id="17"/>
+    <w:bookmarkStart w:id="18" w:name="keywords"/>
+    <w:p>
+      <w:pPr>
+        <w:pStyle w:val="Heading1"/>
+      </w:pPr>
+      <w:r>
+        <w:t xml:space="preserve">Keywords</w:t>
+      </w:r>
+    </w:p>
+    <w:p>
+      <w:pPr>
+        <w:pStyle w:val="FirstParagraph"/>
+      </w:pPr>
+      <w:r>
+        <w:t xml:space="preserve">eye tracking; polysynthesis; affixes; grammar-lexicon distinction; attention</w:t>
       </w:r>
     </w:p>
     <w:p>
@@ -385,49 +52,8 @@
         <w:br w:type="page"/>
       </w:r>
     </w:p>
-    <w:bookmarkEnd w:id="29"/>
-    <w:bookmarkStart w:id="30" w:name="abstract"/>
-    <w:p>
-      <w:pPr>
-        <w:pStyle w:val="Heading1"/>
-      </w:pPr>
-      <w:r>
-        <w:t xml:space="preserve">Abstract</w:t>
-      </w:r>
-    </w:p>
-    <w:p>
-      <w:pPr>
-        <w:pStyle w:val="FirstParagraph"/>
-      </w:pPr>
-      <w:r>
-        <w:t xml:space="preserve">This eye-tracking study investigates the processing of multi-morphemic words during reading in Kalaallisut (Greenlandic), a so-called polysynthetic language characterized by extreme morphological richness. The study has two main aims. First, it tests the hypothesis that some Kalaallisut derivational suffixes are lexical rather than grammatical, and that this distinction is reflected in the allocation of visual attention during reading. Second, it provides an exploratory account of overall fixation patterns on multi-morphemic words in Kalaallisut reading. The hypothesis-driven analyses show that lexical suffixes elicited longer first fixation durations and gaze durations than grammatical suffixes, even when suffix frequency and length were controlled for, supporting the proposed lexical–grammatical distinction and challenging the widespread assumption that affixes form a uniformly grammatical category. In addition, suffix frequency and length significantly influenced reading measures in ways that parallel well-established word-level effects in other languages, suggesting that suffixes function as processing units in Kalaallisut reading. Turning to the exploratory analyses, long, multi-morphemic words elicited a high density of fixations compared to shorter words, indicating substantial processing demands. Within multi-morphemic words, visual attention was asymmetrically distributed, with fixations most highly concentrated near the root at the beginning of the word.</w:t>
-      </w:r>
-    </w:p>
-    <w:bookmarkEnd w:id="30"/>
-    <w:bookmarkStart w:id="31" w:name="keywords"/>
-    <w:p>
-      <w:pPr>
-        <w:pStyle w:val="Heading1"/>
-      </w:pPr>
-      <w:r>
-        <w:t xml:space="preserve">Keywords</w:t>
-      </w:r>
-    </w:p>
-    <w:p>
-      <w:pPr>
-        <w:pStyle w:val="FirstParagraph"/>
-      </w:pPr>
-      <w:r>
-        <w:t xml:space="preserve">eye tracking; polysynthesis; affixes; grammar-lexicon distinction; attention</w:t>
-      </w:r>
-    </w:p>
-    <w:p>
-      <w:r>
-        <w:br w:type="page"/>
-      </w:r>
-    </w:p>
-    <w:bookmarkEnd w:id="31"/>
-    <w:bookmarkStart w:id="33" w:name="introduction"/>
+    <w:bookmarkEnd w:id="18"/>
+    <w:bookmarkStart w:id="20" w:name="introduction"/>
     <w:p>
       <w:pPr>
         <w:pStyle w:val="Heading1"/>
@@ -556,7 +182,7 @@
         <w:rPr>
           <w:rStyle w:val="FootnoteReference"/>
         </w:rPr>
-        <w:footnoteReference w:id="32"/>
+        <w:footnoteReference w:id="19"/>
       </w:r>
       <w:r>
         <w:t xml:space="preserve">:</w:t>
@@ -916,7 +542,7 @@
         <w:t xml:space="preserve"> </w:t>
       </w:r>
       <w:r>
-        <w:t xml:space="preserve">(Jaeger &amp; Boye, under review)</w:t>
+        <w:t xml:space="preserve">(Jaeger &amp; Boye, 2026)</w:t>
       </w:r>
       <w:r>
         <w:t xml:space="preserve">.</w:t>
@@ -960,13 +586,7 @@
         <w:t xml:space="preserve"> </w:t>
       </w:r>
       <w:r>
-        <w:t xml:space="preserve">‘quickly’</w:t>
-      </w:r>
-      <w:r>
-        <w:t xml:space="preserve"> </w:t>
-      </w:r>
-      <w:r>
-        <w:t xml:space="preserve">can be modified by means of the suffix</w:t>
+        <w:t xml:space="preserve">‘quickly’ can be modified by means of the suffix</w:t>
       </w:r>
       <w:r>
         <w:t xml:space="preserve"> </w:t>
@@ -1156,8 +776,8 @@
         <w:t xml:space="preserve">Based on the theory outlined here, we would expect that Kalaallisut suffixes classified as lexical attract more attention in language processing than suffixes classified as grammatical. The present eye-tracking experiment is designed to test this. If the results support the prediction, the implications would be far-reaching, calling for a rethinking of affixes as not exclusively grammatical in nature. Beyond these theoretical implications, the experiment also contributes to the understanding of how multi-morphemic words are processed during reading in a morphologically rich language, a topic that has so far received little attention. The study can thus provide empirical insights into whether models of reading and word processing developed primarily on Indo-European languages can be generalized to polysynthetic languages such as Kalaallisut.</w:t>
       </w:r>
     </w:p>
-    <w:bookmarkEnd w:id="33"/>
-    <w:bookmarkStart w:id="50" w:name="the-experiment"/>
+    <w:bookmarkEnd w:id="20"/>
+    <w:bookmarkStart w:id="39" w:name="the-experiment"/>
     <w:p>
       <w:pPr>
         <w:pStyle w:val="Heading1"/>
@@ -1182,7 +802,7 @@
         <w:t xml:space="preserve">Besides testing the specific hypotheses regarding grammatical and lexical suffixes, the experiment design also allowed for investigating more general fixation patterns on multi-morphemic words.</w:t>
       </w:r>
     </w:p>
-    <w:bookmarkStart w:id="47" w:name="methods"/>
+    <w:bookmarkStart w:id="36" w:name="methods"/>
     <w:p>
       <w:pPr>
         <w:pStyle w:val="Heading2"/>
@@ -1191,7 +811,7 @@
         <w:t xml:space="preserve">Methods</w:t>
       </w:r>
     </w:p>
-    <w:bookmarkStart w:id="35" w:name="participants"/>
+    <w:bookmarkStart w:id="22" w:name="participants"/>
     <w:p>
       <w:pPr>
         <w:pStyle w:val="Heading3"/>
@@ -1211,14 +831,14 @@
         <w:rPr>
           <w:rStyle w:val="FootnoteReference"/>
         </w:rPr>
-        <w:footnoteReference w:id="34"/>
+        <w:footnoteReference w:id="21"/>
       </w:r>
       <w:r>
         <w:t xml:space="preserve">. Of these, 45 were residents of Greenland and 7 of Denmark. None reported being dyslexic. All participants gave informed consent prior to participation. Participants were informed that the experiment involved reading sentences on a screen while their eye movements were tracked. All participants completed a short questionnaire about their demographic and language background. They received a gift as acknowledgement of their participation.</w:t>
       </w:r>
     </w:p>
-    <w:bookmarkEnd w:id="35"/>
-    <w:bookmarkStart w:id="38" w:name="apparatus-and-experimental-procedure"/>
+    <w:bookmarkEnd w:id="22"/>
+    <w:bookmarkStart w:id="25" w:name="apparatus-and-experimental-procedure"/>
     <w:p>
       <w:pPr>
         <w:pStyle w:val="Heading3"/>
@@ -1238,7 +858,7 @@
         <w:rPr>
           <w:rStyle w:val="FootnoteReference"/>
         </w:rPr>
-        <w:footnoteReference w:id="36"/>
+        <w:footnoteReference w:id="23"/>
       </w:r>
       <w:r>
         <w:t xml:space="preserve">. For the first 40 participants, sentences were displayed on a 24-inch monitor (brand: Philips, model ID: 240V55QDSB/00, resolution: 1920x1080) placed 90 cm from the subjects. For the remaining 12 participants, sentences were presented on a 27-inch monitor (brand: HP, model ID: HP E27m G4, resolution: 1920x1080) placed 104 cm from the subjects. In both cases, the screen width subtended 32 degrees of visual angle (the full trackable range of the eye tracker)</w:t>
@@ -1247,7 +867,7 @@
         <w:rPr>
           <w:rStyle w:val="FootnoteReference"/>
         </w:rPr>
-        <w:footnoteReference w:id="37"/>
+        <w:footnoteReference w:id="24"/>
       </w:r>
       <w:r>
         <w:t xml:space="preserve">.</w:t>
@@ -1317,8 +937,8 @@
         <w:t xml:space="preserve">The experiment began with two practice trials, data from which were not included in the analyses.</w:t>
       </w:r>
     </w:p>
-    <w:bookmarkEnd w:id="38"/>
-    <w:bookmarkStart w:id="46" w:name="materials"/>
+    <w:bookmarkEnd w:id="25"/>
+    <w:bookmarkStart w:id="35" w:name="materials"/>
     <w:p>
       <w:pPr>
         <w:pStyle w:val="Heading3"/>
@@ -1332,7 +952,19 @@
         <w:pStyle w:val="FirstParagraph"/>
       </w:pPr>
       <w:r>
-        <w:t xml:space="preserve">Based on the modification criterion and discussions with author NBT, a linguist and native speaker of Kalaallisut, 8 lexical and 8 grammatical target suffixes were chosen (see Table</w:t>
+        <w:t xml:space="preserve">Based on the modification criterion and discussions with author NBT, a linguist and native speaker of Kalaallisut, 8 lexical and 8 grammatical target suffixes were chosen</w:t>
+      </w:r>
+      <w:r>
+        <w:rPr>
+          <w:rStyle w:val="FootnoteReference"/>
+        </w:rPr>
+        <w:footnoteReference w:id="26"/>
+      </w:r>
+      <w:r>
+        <w:t xml:space="preserve"> </w:t>
+      </w:r>
+      <w:r>
+        <w:t xml:space="preserve">(see Table</w:t>
       </w:r>
       <w:r>
         <w:t xml:space="preserve"> </w:t>
@@ -1348,8 +980,8 @@
       <w:pPr>
         <w:pStyle w:val="TableCaption"/>
       </w:pPr>
-      <w:bookmarkStart w:id="39" w:name="tab:table1"/>
-      <w:bookmarkEnd w:id="39"/>
+      <w:bookmarkStart w:id="27" w:name="tab:table1"/>
+      <w:bookmarkEnd w:id="27"/>
       <w:r>
         <w:t xml:space="preserve">Table 1: Lexical and grammatical target suffixes</w:t>
       </w:r>
@@ -1818,19 +1450,7 @@
               <w:jc w:val="left"/>
             </w:pPr>
             <w:r>
-              <w:t xml:space="preserve">‘look for’</w:t>
-            </w:r>
-            <w:r>
-              <w:t xml:space="preserve"> </w:t>
-            </w:r>
-            <w:r>
-              <w:t xml:space="preserve">/</w:t>
-            </w:r>
-            <w:r>
-              <w:t xml:space="preserve"> </w:t>
-            </w:r>
-            <w:r>
-              <w:t xml:space="preserve">‘celebrate’</w:t>
+              <w:t xml:space="preserve">‘look for’ / ‘celebrate’</w:t>
             </w:r>
           </w:p>
         </w:tc>
@@ -2015,12 +1635,12 @@
         <w:rPr>
           <w:rStyle w:val="FootnoteReference"/>
         </w:rPr>
-        <w:footnoteReference w:id="40"/>
+        <w:footnoteReference w:id="28"/>
       </w:r>
       <w:r>
         <w:t xml:space="preserve">. A requirement was that the root have its own entry in the online dictionaries provided by Oqaasileriffik, The Language Secretariat of Greenland (</w:t>
       </w:r>
-      <w:hyperlink r:id="rId41">
+      <w:hyperlink r:id="rId29">
         <w:r>
           <w:rPr>
             <w:rStyle w:val="Hyperlink"/>
@@ -2069,8 +1689,8 @@
       <w:pPr>
         <w:pStyle w:val="TableCaption"/>
       </w:pPr>
-      <w:bookmarkStart w:id="42" w:name="tab:table2"/>
-      <w:bookmarkEnd w:id="42"/>
+      <w:bookmarkStart w:id="30" w:name="tab:table2"/>
+      <w:bookmarkEnd w:id="30"/>
       <w:r>
         <w:t xml:space="preserve">Table 2: Lexical and grammatical baseline words</w:t>
       </w:r>
@@ -2693,7 +2313,7 @@
       <w:r>
         <w:t xml:space="preserve">). Frequency was measured as the absolute number of occurrences in the corpus of written Kalaallisut provided by Oqaasileriffik, The Language Secretariat of Greenland (</w:t>
       </w:r>
-      <w:hyperlink r:id="rId43">
+      <w:hyperlink r:id="rId31">
         <w:r>
           <w:rPr>
             <w:rStyle w:val="Hyperlink"/>
@@ -2702,15 +2322,24 @@
         </w:r>
       </w:hyperlink>
       <w:r>
-        <w:t xml:space="preserve">). Because the available pool of suffixes was limited, perfect matching was not possible. Importantly, however, the resulting imbalance runs counter to the hypothesis: The lexical suffixes were, on average, shorter and more frequent than the grammatical suffixes. Suffix predictability was quantified as transitional probability based on the frequencies of the root and the root-suffix combination. Predictability was not matched in the design, but it was included as an independent variable in the statistical analyses.</w:t>
+        <w:t xml:space="preserve">). Because the available pool of suffixes was limited, perfect matching was not possible. Importantly, however, the resulting imbalance runs counter to the hypothesis: The lexical suffixes were, on average, shorter and more frequent than the grammatical suffixes. Suffix predictability was quantified as transitional probability based on the frequencies of the root and the root-suffix combination</w:t>
+      </w:r>
+      <w:r>
+        <w:rPr>
+          <w:rStyle w:val="FootnoteReference"/>
+        </w:rPr>
+        <w:footnoteReference w:id="32"/>
+      </w:r>
+      <w:r>
+        <w:t xml:space="preserve">. Predictability was not matched in the design, but it was included as an independent variable in the statistical analyses.</w:t>
       </w:r>
     </w:p>
     <w:p>
       <w:pPr>
         <w:pStyle w:val="TableCaption"/>
       </w:pPr>
-      <w:bookmarkStart w:id="44" w:name="tab:table3"/>
-      <w:bookmarkEnd w:id="44"/>
+      <w:bookmarkStart w:id="33" w:name="tab:table3"/>
+      <w:bookmarkEnd w:id="33"/>
       <w:r>
         <w:t xml:space="preserve">Table 3:</w:t>
       </w:r>
@@ -3482,8 +3111,8 @@
       <w:pPr>
         <w:pStyle w:val="TableCaption"/>
       </w:pPr>
-      <w:bookmarkStart w:id="45" w:name="tab:table4"/>
-      <w:bookmarkEnd w:id="45"/>
+      <w:bookmarkStart w:id="34" w:name="tab:table4"/>
+      <w:bookmarkEnd w:id="34"/>
       <w:r>
         <w:t xml:space="preserve">Table 4:</w:t>
       </w:r>
@@ -3535,8 +3164,8 @@
                 <w:left w:val="none" w:sz="0" w:space="0" w:color="000000"/>
                 <w:right w:val="none" w:sz="0" w:space="0" w:color="000000"/>
               </w:pBdr>
-              <w:spacing w:after="100" w:before="100" w:line="240"/>
-              <w:ind w:left="100" w:right="100" w:firstLine="0" w:firstLineChars="0"/>
+              <w:spacing w:after="120" w:before="120" w:line="240"/>
+              <w:ind w:left="120" w:right="120" w:firstLine="0" w:firstLineChars="0"/>
               <w:rPr>
                 <w:rFonts w:ascii="Arial" w:hAnsi="Arial" w:eastAsia="Arial" w:cs="Arial"/>
                 <w:i w:val="false"/>
@@ -3589,8 +3218,8 @@
                 <w:left w:val="none" w:sz="0" w:space="0" w:color="000000"/>
                 <w:right w:val="none" w:sz="0" w:space="0" w:color="000000"/>
               </w:pBdr>
-              <w:spacing w:after="100" w:before="100" w:line="240"/>
-              <w:ind w:left="100" w:right="100" w:firstLine="0" w:firstLineChars="0"/>
+              <w:spacing w:after="120" w:before="120" w:line="240"/>
+              <w:ind w:left="120" w:right="120" w:firstLine="0" w:firstLineChars="0"/>
               <w:rPr>
                 <w:rFonts w:ascii="Arial" w:hAnsi="Arial" w:eastAsia="Arial" w:cs="Arial"/>
                 <w:i w:val="false"/>
@@ -3643,8 +3272,8 @@
                 <w:left w:val="none" w:sz="0" w:space="0" w:color="000000"/>
                 <w:right w:val="none" w:sz="0" w:space="0" w:color="000000"/>
               </w:pBdr>
-              <w:spacing w:after="100" w:before="100" w:line="240"/>
-              <w:ind w:left="100" w:right="100" w:firstLine="0" w:firstLineChars="0"/>
+              <w:spacing w:after="120" w:before="120" w:line="240"/>
+              <w:ind w:left="120" w:right="120" w:firstLine="0" w:firstLineChars="0"/>
               <w:rPr>
                 <w:rFonts w:ascii="Arial" w:hAnsi="Arial" w:eastAsia="Arial" w:cs="Arial"/>
                 <w:i w:val="false"/>
@@ -3702,8 +3331,8 @@
                 <w:left w:val="none" w:sz="0" w:space="0" w:color="000000"/>
                 <w:right w:val="none" w:sz="0" w:space="0" w:color="000000"/>
               </w:pBdr>
-              <w:spacing w:after="100" w:before="100" w:line="240"/>
-              <w:ind w:left="100" w:right="100" w:firstLine="0" w:firstLineChars="0"/>
+              <w:spacing w:after="120" w:before="120" w:line="240"/>
+              <w:ind w:left="120" w:right="120" w:firstLine="0" w:firstLineChars="0"/>
               <w:rPr>
                 <w:rFonts w:ascii="Arial" w:hAnsi="Arial" w:eastAsia="Arial" w:cs="Arial"/>
                 <w:i w:val="false"/>
@@ -3756,8 +3385,8 @@
                 <w:left w:val="none" w:sz="0" w:space="0" w:color="000000"/>
                 <w:right w:val="none" w:sz="0" w:space="0" w:color="000000"/>
               </w:pBdr>
-              <w:spacing w:after="100" w:before="100" w:line="240"/>
-              <w:ind w:left="100" w:right="100" w:firstLine="0" w:firstLineChars="0"/>
+              <w:spacing w:after="120" w:before="120" w:line="240"/>
+              <w:ind w:left="120" w:right="120" w:firstLine="0" w:firstLineChars="0"/>
               <w:rPr>
                 <w:rFonts w:ascii="Arial" w:hAnsi="Arial" w:eastAsia="Arial" w:cs="Arial"/>
                 <w:i w:val="false"/>
@@ -3810,8 +3439,8 @@
                 <w:left w:val="none" w:sz="0" w:space="0" w:color="000000"/>
                 <w:right w:val="none" w:sz="0" w:space="0" w:color="000000"/>
               </w:pBdr>
-              <w:spacing w:after="100" w:before="100" w:line="240"/>
-              <w:ind w:left="100" w:right="100" w:firstLine="0" w:firstLineChars="0"/>
+              <w:spacing w:after="120" w:before="120" w:line="240"/>
+              <w:ind w:left="120" w:right="120" w:firstLine="0" w:firstLineChars="0"/>
               <w:rPr>
                 <w:rFonts w:ascii="Arial" w:hAnsi="Arial" w:eastAsia="Arial" w:cs="Arial"/>
                 <w:i w:val="false"/>
@@ -3869,8 +3498,8 @@
                 <w:left w:val="none" w:sz="0" w:space="0" w:color="000000"/>
                 <w:right w:val="none" w:sz="0" w:space="0" w:color="000000"/>
               </w:pBdr>
-              <w:spacing w:after="100" w:before="100" w:line="240"/>
-              <w:ind w:left="100" w:right="100" w:firstLine="0" w:firstLineChars="0"/>
+              <w:spacing w:after="120" w:before="120" w:line="240"/>
+              <w:ind w:left="120" w:right="120" w:firstLine="0" w:firstLineChars="0"/>
               <w:rPr>
                 <w:rFonts w:ascii="Arial" w:hAnsi="Arial" w:eastAsia="Arial" w:cs="Arial"/>
                 <w:i w:val="false"/>
@@ -3923,8 +3552,8 @@
                 <w:left w:val="none" w:sz="0" w:space="0" w:color="000000"/>
                 <w:right w:val="none" w:sz="0" w:space="0" w:color="000000"/>
               </w:pBdr>
-              <w:spacing w:after="100" w:before="100" w:line="240"/>
-              <w:ind w:left="100" w:right="100" w:firstLine="0" w:firstLineChars="0"/>
+              <w:spacing w:after="120" w:before="120" w:line="240"/>
+              <w:ind w:left="120" w:right="120" w:firstLine="0" w:firstLineChars="0"/>
               <w:rPr>
                 <w:rFonts w:ascii="Arial" w:hAnsi="Arial" w:eastAsia="Arial" w:cs="Arial"/>
                 <w:i w:val="false"/>
@@ -3977,8 +3606,8 @@
                 <w:left w:val="none" w:sz="0" w:space="0" w:color="000000"/>
                 <w:right w:val="none" w:sz="0" w:space="0" w:color="000000"/>
               </w:pBdr>
-              <w:spacing w:after="100" w:before="100" w:line="240"/>
-              <w:ind w:left="100" w:right="100" w:firstLine="0" w:firstLineChars="0"/>
+              <w:spacing w:after="120" w:before="120" w:line="240"/>
+              <w:ind w:left="120" w:right="120" w:firstLine="0" w:firstLineChars="0"/>
               <w:rPr>
                 <w:rFonts w:ascii="Arial" w:hAnsi="Arial" w:eastAsia="Arial" w:cs="Arial"/>
                 <w:i w:val="false"/>
@@ -4037,8 +3666,8 @@
                 <w:left w:val="none" w:sz="0" w:space="0" w:color="000000"/>
                 <w:right w:val="none" w:sz="0" w:space="0" w:color="000000"/>
               </w:pBdr>
-              <w:spacing w:after="100" w:before="100" w:line="240"/>
-              <w:ind w:left="100" w:right="100" w:firstLine="0" w:firstLineChars="0"/>
+              <w:spacing w:after="120" w:before="120" w:line="240"/>
+              <w:ind w:left="120" w:right="120" w:firstLine="0" w:firstLineChars="0"/>
               <w:rPr>
                 <w:rFonts w:ascii="Arial" w:hAnsi="Arial" w:eastAsia="Arial" w:cs="Arial"/>
                 <w:i w:val="false"/>
@@ -4067,9 +3696,9 @@
         </w:tc>
       </w:tr>
     </w:tbl>
-    <w:bookmarkEnd w:id="46"/>
-    <w:bookmarkEnd w:id="47"/>
-    <w:bookmarkStart w:id="49" w:name="transparency-and-openness"/>
+    <w:bookmarkEnd w:id="35"/>
+    <w:bookmarkEnd w:id="36"/>
+    <w:bookmarkStart w:id="38" w:name="transparency-and-openness"/>
     <w:p>
       <w:pPr>
         <w:pStyle w:val="Heading2"/>
@@ -4088,21 +3717,21 @@
       <w:r>
         <w:t xml:space="preserve"> </w:t>
       </w:r>
-      <w:hyperlink r:id="rId48">
+      <w:hyperlink r:id="rId37">
         <w:r>
           <w:rPr>
             <w:rStyle w:val="Hyperlink"/>
           </w:rPr>
-          <w:t xml:space="preserve">https://github.com/solvej-jaeger/eye_tracking_kalaallisut</w:t>
+          <w:t xml:space="preserve">https://anonymous.4open.science/r/eye_tracking_kalaallisut-450F/</w:t>
         </w:r>
       </w:hyperlink>
       <w:r>
         <w:t xml:space="preserve">. The study was not preregistered.</w:t>
       </w:r>
     </w:p>
-    <w:bookmarkEnd w:id="49"/>
-    <w:bookmarkEnd w:id="50"/>
-    <w:bookmarkStart w:id="87" w:name="results"/>
+    <w:bookmarkEnd w:id="38"/>
+    <w:bookmarkEnd w:id="39"/>
+    <w:bookmarkStart w:id="76" w:name="results"/>
     <w:p>
       <w:pPr>
         <w:pStyle w:val="Heading1"/>
@@ -4136,7 +3765,7 @@
         <w:rPr>
           <w:rStyle w:val="FootnoteReference"/>
         </w:rPr>
-        <w:footnoteReference w:id="51"/>
+        <w:footnoteReference w:id="40"/>
       </w:r>
       <w:r>
         <w:t xml:space="preserve">.</w:t>
@@ -4146,8 +3775,8 @@
       <w:pPr>
         <w:pStyle w:val="TableCaption"/>
       </w:pPr>
-      <w:bookmarkStart w:id="52" w:name="tab:table5"/>
-      <w:bookmarkEnd w:id="52"/>
+      <w:bookmarkStart w:id="41" w:name="tab:table5"/>
+      <w:bookmarkEnd w:id="41"/>
       <w:r>
         <w:t xml:space="preserve">Table 5:</w:t>
       </w:r>
@@ -5802,7 +5431,7 @@
         <w:rPr>
           <w:rStyle w:val="FootnoteReference"/>
         </w:rPr>
-        <w:footnoteReference w:id="53"/>
+        <w:footnoteReference w:id="42"/>
       </w:r>
       <w:r>
         <w:t xml:space="preserve">.</w:t>
@@ -5837,7 +5466,7 @@
         <w:t xml:space="preserve">.</w:t>
       </w:r>
     </w:p>
-    <w:bookmarkStart w:id="61" w:name="lexical-and-grammatical-suffixes"/>
+    <w:bookmarkStart w:id="50" w:name="lexical-and-grammatical-suffixes"/>
     <w:p>
       <w:pPr>
         <w:pStyle w:val="Heading2"/>
@@ -5888,7 +5517,7 @@
         <w:t xml:space="preserve">, as they are typically skewed with many short and few long fixations. To reduce skew, we also used log10-transformed measures of frequency (skewness = 1.45) and predictability (skewness = 3.4).</w:t>
       </w:r>
     </w:p>
-    <w:bookmarkStart w:id="56" w:name="skipping"/>
+    <w:bookmarkStart w:id="45" w:name="skipping"/>
     <w:p>
       <w:pPr>
         <w:pStyle w:val="Heading3"/>
@@ -5917,7 +5546,7 @@
         <w:rPr>
           <w:rStyle w:val="FootnoteReference"/>
         </w:rPr>
-        <w:footnoteReference w:id="54"/>
+        <w:footnoteReference w:id="43"/>
       </w:r>
       <w:r>
         <w:t xml:space="preserve">. The model revealed no significant effect of structural status, providing no support for the hypothesis. However, suffix frequency was positively associated with skipping (more frequent suffixes were skipped more often), while suffix length showed a negative association (longer suffixes were skipped less).</w:t>
@@ -5927,8 +5556,8 @@
       <w:pPr>
         <w:pStyle w:val="TableCaption"/>
       </w:pPr>
-      <w:bookmarkStart w:id="55" w:name="tab:table6"/>
-      <w:bookmarkEnd w:id="55"/>
+      <w:bookmarkStart w:id="44" w:name="tab:table6"/>
+      <w:bookmarkEnd w:id="44"/>
       <w:r>
         <w:t xml:space="preserve">Table 6:</w:t>
       </w:r>
@@ -6175,7 +5804,7 @@
         <w:tc>
           <w:tcPr>
             <w:tcBorders>
-              <w:bottom w:val="single" w:sz="8" w:space="0" w:color="000000"/>
+              <w:bottom w:val="none" w:sz="0" w:space="0" w:color="000000"/>
               <w:top w:val="single" w:sz="8" w:space="0" w:color="000000"/>
               <w:left w:val="none" w:sz="0" w:space="0" w:color="000000"/>
               <w:right w:val="none" w:sz="0" w:space="0" w:color="000000"/>
@@ -6451,6 +6080,65 @@
           <w:tcPr>
             <w:tcBorders>
               <w:bottom w:val="none" w:sz="0" w:space="0" w:color="000000"/>
+              <w:top w:val="none" w:sz="0" w:space="0" w:color="000000"/>
+              <w:left w:val="none" w:sz="0" w:space="0" w:color="000000"/>
+              <w:right w:val="none" w:sz="0" w:space="0" w:color="000000"/>
+            </w:tcBorders>
+            <w:shd w:val="clear" w:color="auto" w:fill="FFFFFF"/>
+            <w:tcMar>
+              <w:top w:w="0" w:type="dxa"/>
+              <w:bottom w:w="0" w:type="dxa"/>
+              <w:left w:w="0" w:type="dxa"/>
+              <w:right w:w="0" w:type="dxa"/>
+            </w:tcMar>
+            <w:vAlign w:val="top"/>
+          </w:tcPr>
+          <w:p>
+            <w:pPr>
+              <w:jc w:val="right"/>
+              <w:pBdr>
+                <w:bottom w:val="none" w:sz="0" w:space="0" w:color="000000"/>
+                <w:top w:val="none" w:sz="0" w:space="0" w:color="000000"/>
+                <w:left w:val="none" w:sz="0" w:space="0" w:color="000000"/>
+                <w:right w:val="none" w:sz="0" w:space="0" w:color="000000"/>
+              </w:pBdr>
+              <w:spacing w:after="120" w:before="120" w:line="240"/>
+              <w:ind w:left="120" w:right="120" w:firstLine="0" w:firstLineChars="0"/>
+              <w:rPr>
+                <w:rFonts w:ascii="Arial" w:hAnsi="Arial" w:eastAsia="Arial" w:cs="Arial"/>
+                <w:i w:val="false"/>
+                <w:b w:val="false"/>
+                <w:u w:val="none"/>
+                <w:strike w:val="false"/>
+                <w:sz w:val="22"/>
+                <w:szCs w:val="22"/>
+                <w:color w:val="000000"/>
+              </w:rPr>
+            </w:pPr>
+            <w:r xmlns:w="http://schemas.openxmlformats.org/wordprocessingml/2006/main" xmlns:wp="http://schemas.openxmlformats.org/drawingml/2006/wordprocessingDrawing" xmlns:r="http://schemas.openxmlformats.org/officeDocument/2006/relationships" xmlns:w14="http://schemas.microsoft.com/office/word/2010/wordml">
+              <w:rPr>
+                <w:rFonts w:ascii="Arial" w:hAnsi="Arial" w:eastAsia="Arial" w:cs="Arial"/>
+                <w:i w:val="false"/>
+                <w:b w:val="false"/>
+                <w:u w:val="none"/>
+                <w:strike w:val="false"/>
+                <w:sz w:val="22"/>
+                <w:szCs w:val="22"/>
+                <w:color w:val="000000"/>
+              </w:rPr>
+              <w:t xml:space="preserve">&gt;0.9</w:t>
+            </w:r>
+          </w:p>
+        </w:tc>
+      </w:tr>
+      <w:tr>
+        <w:trPr>
+          <w:trHeight w:val="670" w:hRule="auto"/>
+        </w:trPr>
+        <w:tc>
+          <w:tcPr>
+            <w:tcBorders>
+              <w:bottom w:val="single" w:sz="8" w:space="0" w:color="000000"/>
               <w:top w:val="single" w:sz="8" w:space="0" w:color="000000"/>
               <w:left w:val="none" w:sz="0" w:space="0" w:color="000000"/>
               <w:right w:val="none" w:sz="0" w:space="0" w:color="000000"/>
@@ -6466,7 +6154,7 @@
           </w:tcPr>
           <w:p>
             <w:pPr>
-              <w:jc w:val="right"/>
+              <w:jc w:val="left"/>
               <w:pBdr>
                 <w:bottom w:val="none" w:sz="0" w:space="0" w:color="000000"/>
                 <w:top w:val="none" w:sz="0" w:space="0" w:color="000000"/>
@@ -6497,15 +6185,10 @@
                 <w:szCs w:val="22"/>
                 <w:color w:val="000000"/>
               </w:rPr>
-              <w:t xml:space="preserve">&gt;0.9</w:t>
-            </w:r>
-          </w:p>
-        </w:tc>
-      </w:tr>
-      <w:tr>
-        <w:trPr>
-          <w:trHeight w:val="670" w:hRule="auto"/>
-        </w:trPr>
+              <w:t xml:space="preserve">suffix frequency</w:t>
+            </w:r>
+          </w:p>
+        </w:tc>
         <w:tc>
           <w:tcPr>
             <w:tcBorders>
@@ -6525,7 +6208,7 @@
           </w:tcPr>
           <w:p>
             <w:pPr>
-              <w:jc w:val="left"/>
+              <w:jc w:val="right"/>
               <w:pBdr>
                 <w:bottom w:val="none" w:sz="0" w:space="0" w:color="000000"/>
                 <w:top w:val="none" w:sz="0" w:space="0" w:color="000000"/>
@@ -6556,7 +6239,7 @@
                 <w:szCs w:val="22"/>
                 <w:color w:val="000000"/>
               </w:rPr>
-              <w:t xml:space="preserve">suffix frequency</w:t>
+              <w:t xml:space="preserve">0.15</w:t>
             </w:r>
           </w:p>
         </w:tc>
@@ -6610,7 +6293,7 @@
                 <w:szCs w:val="22"/>
                 <w:color w:val="000000"/>
               </w:rPr>
-              <w:t xml:space="preserve">0.15</w:t>
+              <w:t xml:space="preserve">0.06</w:t>
             </w:r>
           </w:p>
         </w:tc>
@@ -6664,7 +6347,7 @@
                 <w:szCs w:val="22"/>
                 <w:color w:val="000000"/>
               </w:rPr>
-              <w:t xml:space="preserve">0.06</w:t>
+              <w:t xml:space="preserve">2.53</w:t>
             </w:r>
           </w:p>
         </w:tc>
@@ -6699,60 +6382,6 @@
               <w:rPr>
                 <w:rFonts w:ascii="Arial" w:hAnsi="Arial" w:eastAsia="Arial" w:cs="Arial"/>
                 <w:i w:val="false"/>
-                <w:b w:val="false"/>
-                <w:u w:val="none"/>
-                <w:strike w:val="false"/>
-                <w:sz w:val="22"/>
-                <w:szCs w:val="22"/>
-                <w:color w:val="000000"/>
-              </w:rPr>
-            </w:pPr>
-            <w:r xmlns:w="http://schemas.openxmlformats.org/wordprocessingml/2006/main" xmlns:wp="http://schemas.openxmlformats.org/drawingml/2006/wordprocessingDrawing" xmlns:r="http://schemas.openxmlformats.org/officeDocument/2006/relationships" xmlns:w14="http://schemas.microsoft.com/office/word/2010/wordml">
-              <w:rPr>
-                <w:rFonts w:ascii="Arial" w:hAnsi="Arial" w:eastAsia="Arial" w:cs="Arial"/>
-                <w:i w:val="false"/>
-                <w:b w:val="false"/>
-                <w:u w:val="none"/>
-                <w:strike w:val="false"/>
-                <w:sz w:val="22"/>
-                <w:szCs w:val="22"/>
-                <w:color w:val="000000"/>
-              </w:rPr>
-              <w:t xml:space="preserve">2.53</w:t>
-            </w:r>
-          </w:p>
-        </w:tc>
-        <w:tc>
-          <w:tcPr>
-            <w:tcBorders>
-              <w:bottom w:val="none" w:sz="0" w:space="0" w:color="000000"/>
-              <w:top w:val="none" w:sz="0" w:space="0" w:color="000000"/>
-              <w:left w:val="none" w:sz="0" w:space="0" w:color="000000"/>
-              <w:right w:val="none" w:sz="0" w:space="0" w:color="000000"/>
-            </w:tcBorders>
-            <w:shd w:val="clear" w:color="auto" w:fill="FFFFFF"/>
-            <w:tcMar>
-              <w:top w:w="0" w:type="dxa"/>
-              <w:bottom w:w="0" w:type="dxa"/>
-              <w:left w:w="0" w:type="dxa"/>
-              <w:right w:w="0" w:type="dxa"/>
-            </w:tcMar>
-            <w:vAlign w:val="top"/>
-          </w:tcPr>
-          <w:p>
-            <w:pPr>
-              <w:jc w:val="right"/>
-              <w:pBdr>
-                <w:bottom w:val="none" w:sz="0" w:space="0" w:color="000000"/>
-                <w:top w:val="none" w:sz="0" w:space="0" w:color="000000"/>
-                <w:left w:val="none" w:sz="0" w:space="0" w:color="000000"/>
-                <w:right w:val="none" w:sz="0" w:space="0" w:color="000000"/>
-              </w:pBdr>
-              <w:spacing w:after="120" w:before="120" w:line="240"/>
-              <w:ind w:left="120" w:right="120" w:firstLine="0" w:firstLineChars="0"/>
-              <w:rPr>
-                <w:rFonts w:ascii="Arial" w:hAnsi="Arial" w:eastAsia="Arial" w:cs="Arial"/>
-                <w:i w:val="false"/>
                 <w:b w:val="true"/>
                 <w:u w:val="none"/>
                 <w:strike w:val="false"/>
@@ -6784,8 +6413,8 @@
         <w:tc>
           <w:tcPr>
             <w:tcBorders>
-              <w:bottom w:val="none" w:sz="0" w:space="0" w:color="000000"/>
-              <w:top w:val="none" w:sz="0" w:space="0" w:color="000000"/>
+              <w:bottom w:val="single" w:sz="8" w:space="0" w:color="000000"/>
+              <w:top w:val="single" w:sz="8" w:space="0" w:color="000000"/>
               <w:left w:val="none" w:sz="0" w:space="0" w:color="000000"/>
               <w:right w:val="none" w:sz="0" w:space="0" w:color="000000"/>
             </w:tcBorders>
@@ -7388,8 +7017,8 @@
         </w:tc>
       </w:tr>
     </w:tbl>
-    <w:bookmarkEnd w:id="56"/>
-    <w:bookmarkStart w:id="58" w:name="first-fixation-duration"/>
+    <w:bookmarkEnd w:id="45"/>
+    <w:bookmarkStart w:id="47" w:name="first-fixation-duration"/>
     <w:p>
       <w:pPr>
         <w:pStyle w:val="Heading3"/>
@@ -7436,8 +7065,8 @@
       <w:pPr>
         <w:pStyle w:val="TableCaption"/>
       </w:pPr>
-      <w:bookmarkStart w:id="57" w:name="tab:table7"/>
-      <w:bookmarkEnd w:id="57"/>
+      <w:bookmarkStart w:id="46" w:name="tab:table7"/>
+      <w:bookmarkEnd w:id="46"/>
       <w:r>
         <w:t xml:space="preserve">Table 7:</w:t>
       </w:r>
@@ -8897,8 +8526,8 @@
         </w:tc>
       </w:tr>
     </w:tbl>
-    <w:bookmarkEnd w:id="58"/>
-    <w:bookmarkStart w:id="60" w:name="gaze-duration"/>
+    <w:bookmarkEnd w:id="47"/>
+    <w:bookmarkStart w:id="49" w:name="gaze-duration"/>
     <w:p>
       <w:pPr>
         <w:pStyle w:val="Heading3"/>
@@ -8928,8 +8557,8 @@
       <w:pPr>
         <w:pStyle w:val="TableCaption"/>
       </w:pPr>
-      <w:bookmarkStart w:id="59" w:name="tab:table8"/>
-      <w:bookmarkEnd w:id="59"/>
+      <w:bookmarkStart w:id="48" w:name="tab:table8"/>
+      <w:bookmarkEnd w:id="48"/>
       <w:r>
         <w:t xml:space="preserve">Table 8:</w:t>
       </w:r>
@@ -10389,9 +10018,9 @@
         </w:tc>
       </w:tr>
     </w:tbl>
-    <w:bookmarkEnd w:id="60"/>
-    <w:bookmarkEnd w:id="61"/>
-    <w:bookmarkStart w:id="86" w:name="X661a59ba9619b408bfdf0f33b0efdadfcfeaa0d"/>
+    <w:bookmarkEnd w:id="49"/>
+    <w:bookmarkEnd w:id="50"/>
+    <w:bookmarkStart w:id="75" w:name="X661a59ba9619b408bfdf0f33b0efdadfcfeaa0d"/>
     <w:p>
       <w:pPr>
         <w:pStyle w:val="Heading2"/>
@@ -10431,7 +10060,7 @@
         <w:rPr>
           <w:rStyle w:val="FootnoteReference"/>
         </w:rPr>
-        <w:footnoteReference w:id="62"/>
+        <w:footnoteReference w:id="51"/>
       </w:r>
       <w:r>
         <w:t xml:space="preserve">. A quadratic fit places the turning point at approximately nine letters (see Supplementary Materials).</w:t>
@@ -10446,18 +10075,18 @@
           <wp:inline>
             <wp:extent cx="3669832" cy="2752374"/>
             <wp:effectExtent b="0" l="0" r="0" t="0"/>
-            <wp:docPr descr="Figure 1: Fixation density as a function of word length" title="" id="64" name="Picture"/>
+            <wp:docPr descr="Figure 1: Fixation density as a function of word length" title="" id="53" name="Picture"/>
             <a:graphic>
               <a:graphicData uri="http://schemas.openxmlformats.org/drawingml/2006/picture">
                 <pic:pic>
                   <pic:nvPicPr>
-                    <pic:cNvPr descr="paper_main_files/figure-docx/figure1-1.png" id="65" name="Picture"/>
+                    <pic:cNvPr descr="paper_main_files/figure-docx/figure1-1.png" id="54" name="Picture"/>
                     <pic:cNvPicPr>
                       <a:picLocks noChangeArrowheads="1" noChangeAspect="1"/>
                     </pic:cNvPicPr>
                   </pic:nvPicPr>
                   <pic:blipFill>
-                    <a:blip r:embed="rId63"/>
+                    <a:blip r:embed="rId52"/>
                     <a:stretch>
                       <a:fillRect/>
                     </a:stretch>
@@ -10488,8 +10117,8 @@
       <w:pPr>
         <w:pStyle w:val="ImageCaption"/>
       </w:pPr>
-      <w:bookmarkStart w:id="66" w:name="fig:figure1"/>
-      <w:bookmarkEnd w:id="66"/>
+      <w:bookmarkStart w:id="55" w:name="fig:figure1"/>
+      <w:bookmarkEnd w:id="55"/>
       <w:r>
         <w:t xml:space="preserve">Figure 1: Fixation density as a function of word length</w:t>
       </w:r>
@@ -10517,7 +10146,7 @@
         <w:rPr>
           <w:rStyle w:val="FootnoteReference"/>
         </w:rPr>
-        <w:footnoteReference w:id="67"/>
+        <w:footnoteReference w:id="56"/>
       </w:r>
       <w:r>
         <w:t xml:space="preserve">. We divided each morpheme into three bins because the shortest morphemes were three letters long (a few of the inflections were only two letters, but these were excluded from this plot). The data reveal a clear pattern: Readers’ attention peaks near the middle of the root morpheme, after which it gradually decreases across the word, with inflections receiving minimal attention – in fact, on average 51% of inflections were skipped in the first pass.</w:t>
@@ -10532,18 +10161,18 @@
           <wp:inline>
             <wp:extent cx="3669832" cy="1834916"/>
             <wp:effectExtent b="0" l="0" r="0" t="0"/>
-            <wp:docPr descr="Figure 2: Mean fixation duration per letter across target word" title="" id="69" name="Picture"/>
+            <wp:docPr descr="Figure 2: Mean fixation duration per letter across target word" title="" id="58" name="Picture"/>
             <a:graphic>
               <a:graphicData uri="http://schemas.openxmlformats.org/drawingml/2006/picture">
                 <pic:pic>
                   <pic:nvPicPr>
-                    <pic:cNvPr descr="paper_main_files/figure-docx/figure2-1.png" id="70" name="Picture"/>
+                    <pic:cNvPr descr="paper_main_files/figure-docx/figure2-1.png" id="59" name="Picture"/>
                     <pic:cNvPicPr>
                       <a:picLocks noChangeArrowheads="1" noChangeAspect="1"/>
                     </pic:cNvPicPr>
                   </pic:nvPicPr>
                   <pic:blipFill>
-                    <a:blip r:embed="rId68"/>
+                    <a:blip r:embed="rId57"/>
                     <a:stretch>
                       <a:fillRect/>
                     </a:stretch>
@@ -10574,8 +10203,8 @@
       <w:pPr>
         <w:pStyle w:val="ImageCaption"/>
       </w:pPr>
-      <w:bookmarkStart w:id="71" w:name="fig:figure2"/>
-      <w:bookmarkEnd w:id="71"/>
+      <w:bookmarkStart w:id="60" w:name="fig:figure2"/>
+      <w:bookmarkEnd w:id="60"/>
       <w:r>
         <w:t xml:space="preserve">Figure 2: Mean fixation duration per letter across target word</w:t>
       </w:r>
@@ -10600,7 +10229,7 @@
         <w:rPr>
           <w:rStyle w:val="FootnoteReference"/>
         </w:rPr>
-        <w:footnoteReference w:id="72"/>
+        <w:footnoteReference w:id="61"/>
       </w:r>
       <w:r>
         <w:t xml:space="preserve">. However, the peak fixation duration per letter is higher for the multi-morphemic target words (139 ms) than for the baseline words (92 ms).</w:t>
@@ -10615,18 +10244,18 @@
           <wp:inline>
             <wp:extent cx="3669832" cy="1834916"/>
             <wp:effectExtent b="0" l="0" r="0" t="0"/>
-            <wp:docPr descr="Figure 3: Mean fixation duration per letter across baseline word" title="" id="74" name="Picture"/>
+            <wp:docPr descr="Figure 3: Mean fixation duration per letter across baseline word" title="" id="63" name="Picture"/>
             <a:graphic>
               <a:graphicData uri="http://schemas.openxmlformats.org/drawingml/2006/picture">
                 <pic:pic>
                   <pic:nvPicPr>
-                    <pic:cNvPr descr="paper_main_files/figure-docx/figure3-1.png" id="75" name="Picture"/>
+                    <pic:cNvPr descr="paper_main_files/figure-docx/figure3-1.png" id="64" name="Picture"/>
                     <pic:cNvPicPr>
                       <a:picLocks noChangeArrowheads="1" noChangeAspect="1"/>
                     </pic:cNvPicPr>
                   </pic:nvPicPr>
                   <pic:blipFill>
-                    <a:blip r:embed="rId73"/>
+                    <a:blip r:embed="rId62"/>
                     <a:stretch>
                       <a:fillRect/>
                     </a:stretch>
@@ -10657,8 +10286,8 @@
       <w:pPr>
         <w:pStyle w:val="ImageCaption"/>
       </w:pPr>
-      <w:bookmarkStart w:id="76" w:name="fig:figure3"/>
-      <w:bookmarkEnd w:id="76"/>
+      <w:bookmarkStart w:id="65" w:name="fig:figure3"/>
+      <w:bookmarkEnd w:id="65"/>
       <w:r>
         <w:t xml:space="preserve">Figure 3: Mean fixation duration per letter across baseline word</w:t>
       </w:r>
@@ -10672,18 +10301,18 @@
           <wp:inline>
             <wp:extent cx="3669832" cy="1834916"/>
             <wp:effectExtent b="0" l="0" r="0" t="0"/>
-            <wp:docPr descr="Figure 4: Skipping rates for target suffixes and baseline words, by length. Error bars indicate standard error." title="" id="78" name="Picture"/>
+            <wp:docPr descr="Figure 4: Skipping rates for target suffixes and baseline words, by length. Error bars indicate standard error." title="" id="67" name="Picture"/>
             <a:graphic>
               <a:graphicData uri="http://schemas.openxmlformats.org/drawingml/2006/picture">
                 <pic:pic>
                   <pic:nvPicPr>
-                    <pic:cNvPr descr="paper_main_files/figure-docx/figure4-1.png" id="79" name="Picture"/>
+                    <pic:cNvPr descr="paper_main_files/figure-docx/figure4-1.png" id="68" name="Picture"/>
                     <pic:cNvPicPr>
                       <a:picLocks noChangeArrowheads="1" noChangeAspect="1"/>
                     </pic:cNvPicPr>
                   </pic:nvPicPr>
                   <pic:blipFill>
-                    <a:blip r:embed="rId77"/>
+                    <a:blip r:embed="rId66"/>
                     <a:stretch>
                       <a:fillRect/>
                     </a:stretch>
@@ -10714,8 +10343,8 @@
       <w:pPr>
         <w:pStyle w:val="ImageCaption"/>
       </w:pPr>
-      <w:bookmarkStart w:id="80" w:name="fig:figure4"/>
-      <w:bookmarkEnd w:id="80"/>
+      <w:bookmarkStart w:id="69" w:name="fig:figure4"/>
+      <w:bookmarkEnd w:id="69"/>
       <w:r>
         <w:t xml:space="preserve">Figure 4: Skipping rates for target suffixes and baseline words, by length. Error bars indicate standard error.</w:t>
       </w:r>
@@ -10773,18 +10402,18 @@
           <wp:inline>
             <wp:extent cx="3669832" cy="1834916"/>
             <wp:effectExtent b="0" l="0" r="0" t="0"/>
-            <wp:docPr descr="Figure 5: Regression rates for roots, target suffixes and baseline words. Error bars indicate standard error." title="" id="82" name="Picture"/>
+            <wp:docPr descr="Figure 5: Regression rates for roots, target suffixes and baseline words. Error bars indicate standard error." title="" id="71" name="Picture"/>
             <a:graphic>
               <a:graphicData uri="http://schemas.openxmlformats.org/drawingml/2006/picture">
                 <pic:pic>
                   <pic:nvPicPr>
-                    <pic:cNvPr descr="paper_main_files/figure-docx/figure5-1.png" id="83" name="Picture"/>
+                    <pic:cNvPr descr="paper_main_files/figure-docx/figure5-1.png" id="72" name="Picture"/>
                     <pic:cNvPicPr>
                       <a:picLocks noChangeArrowheads="1" noChangeAspect="1"/>
                     </pic:cNvPicPr>
                   </pic:nvPicPr>
                   <pic:blipFill>
-                    <a:blip r:embed="rId81"/>
+                    <a:blip r:embed="rId70"/>
                     <a:stretch>
                       <a:fillRect/>
                     </a:stretch>
@@ -10815,8 +10444,8 @@
       <w:pPr>
         <w:pStyle w:val="ImageCaption"/>
       </w:pPr>
-      <w:bookmarkStart w:id="84" w:name="fig:figure5"/>
-      <w:bookmarkEnd w:id="84"/>
+      <w:bookmarkStart w:id="73" w:name="fig:figure5"/>
+      <w:bookmarkEnd w:id="73"/>
       <w:r>
         <w:t xml:space="preserve">Figure 5: Regression rates for roots, target suffixes and baseline words. Error bars indicate standard error.</w:t>
       </w:r>
@@ -10841,7 +10470,7 @@
         <w:rPr>
           <w:rStyle w:val="FootnoteReference"/>
         </w:rPr>
-        <w:footnoteReference w:id="85"/>
+        <w:footnoteReference w:id="74"/>
       </w:r>
       <w:r>
         <w:t xml:space="preserve">) as independent variables and random intercepts for participants confirmed that both these differences were statistically significant: There were more regressions to roots than to target suffixes (</w:t>
@@ -10930,592 +10559,601 @@
         <w:t xml:space="preserve">Taken together, our exploratory findings show that processing multi-morphemic words in Kalaallisut reading requires considerable attentional resources. Regressions are common, and suffixes within long words are skipped less often than individual simple words of similar length. Overall, in multi-morphemic words, attention is most highly concentrated on the root morpheme and decreases throughout the word, reaching its lowest level on the inflection.</w:t>
       </w:r>
     </w:p>
+    <w:bookmarkEnd w:id="75"/>
+    <w:bookmarkEnd w:id="76"/>
+    <w:bookmarkStart w:id="84" w:name="discussion"/>
+    <w:p>
+      <w:pPr>
+        <w:pStyle w:val="Heading1"/>
+      </w:pPr>
+      <w:r>
+        <w:t xml:space="preserve">Discussion</w:t>
+      </w:r>
+    </w:p>
+    <w:p>
+      <w:pPr>
+        <w:pStyle w:val="FirstParagraph"/>
+      </w:pPr>
+      <w:r>
+        <w:t xml:space="preserve">The present study set out to investigate how multi-morphemic words are processed in Kalaallisut reading, with a particular focus on how readers allocate attention at the morpheme level and whether the lexical-grammatical distinction among derivational suffixes is reflected in eye-movement behavior. By combining general exploratory analyses with suffix-level analyses, the study provides insights into both overall reading patterns and fine-grained patterns of morpheme processing.</w:t>
+      </w:r>
+    </w:p>
+    <w:p>
+      <w:pPr>
+        <w:pStyle w:val="BodyText"/>
+      </w:pPr>
+      <w:r>
+        <w:t xml:space="preserve">Taken together, the results show how readers navigate morphologically complex words in Kalaallisut. Long, multi-morphemic words elicit a high density of fixations, suggesting that they place considerable demands on readers’ attentional resources. Within the word, this attention is asymmetrically distributed: Visual attention is most highly concentrated on the root and declines across the word, with relatively little attention devoted to the inflectional ending.</w:t>
+      </w:r>
+    </w:p>
+    <w:p>
+      <w:pPr>
+        <w:pStyle w:val="BodyText"/>
+      </w:pPr>
+      <w:r>
+        <w:t xml:space="preserve">This pattern does not in itself demonstrate sensitivity to morphological structure: In principle, readers could rely on syllables or larger multi-morpheme chunks as processing units when reading complex words. The suffix-level analyses, however, offer more direct evidence that individual morphemes function as units in reading: Fixation patterns for the suffixes were systematically influenced by suffix frequency, length, and structural status. As these patterns parallel effects typically observed at the word level</w:t>
+      </w:r>
+      <w:r>
+        <w:t xml:space="preserve"> </w:t>
+      </w:r>
+      <w:r>
+        <w:t xml:space="preserve">(see e.g. Rayner et al., 2011; Kuperman et al., 2024)</w:t>
+      </w:r>
+      <w:r>
+        <w:t xml:space="preserve">, they suggest that individual morphemes can serve as processing units in Kalaallisut reading, much like words do in more analytic languages.</w:t>
+      </w:r>
+    </w:p>
+    <w:p>
+      <w:pPr>
+        <w:pStyle w:val="BodyText"/>
+      </w:pPr>
+      <w:r>
+        <w:t xml:space="preserve">At the same time, however, the results also underscore that the processing of morphemes is not simply analogous to processing of simple words in Kalaallisut. This is illustrated, for example, by the distinct skipping patterns observed for suffixes compared to whole simple words, and by the regression patterns, which show frequent regressions to the root in the target words and, to a lesser extent, to the target suffixes – while regressions to the baseline words were less frequent.</w:t>
+      </w:r>
+    </w:p>
+    <w:p>
+      <w:pPr>
+        <w:pStyle w:val="BodyText"/>
+      </w:pPr>
+      <w:r>
+        <w:t xml:space="preserve">In the following sections, we discuss each of the findings in turn, considering their potential implications for our understanding of reading, language processing and morphological complexity.</w:t>
+      </w:r>
+    </w:p>
+    <w:bookmarkStart w:id="78" w:name="lexical-vs.-grammatical-suffixes"/>
+    <w:p>
+      <w:pPr>
+        <w:pStyle w:val="Heading2"/>
+      </w:pPr>
+      <w:r>
+        <w:t xml:space="preserve">Lexical vs. Grammatical Suffixes</w:t>
+      </w:r>
+    </w:p>
+    <w:p>
+      <w:pPr>
+        <w:pStyle w:val="FirstParagraph"/>
+      </w:pPr>
+      <w:r>
+        <w:t xml:space="preserve">The central question addressed in the suffix-level analyses was whether suffixes classified as lexical differ from grammatical suffixes in the amount of attention they attract during reading. The results showed that when suffix frequency, length, and predictability were controlled for, lexical suffixes elicited longer fixation times than grammatical suffixes, as reflected in both first fixation durations (FFD) and gaze durations (GD)</w:t>
+      </w:r>
+      <w:r>
+        <w:rPr>
+          <w:rStyle w:val="FootnoteReference"/>
+        </w:rPr>
+        <w:footnoteReference w:id="77"/>
+      </w:r>
+      <w:r>
+        <w:t xml:space="preserve">. These effects are consistent with the prediction that lexical suffixes attract more attention than grammatical suffixes in reading.</w:t>
+      </w:r>
+    </w:p>
+    <w:p>
+      <w:pPr>
+        <w:pStyle w:val="BodyText"/>
+      </w:pPr>
+      <w:r>
+        <w:t xml:space="preserve">In contrast, no reliable effect of structural status was observed for skipping probability. We examined skipping alongside fixation duration measures because grammatical words have traditionally been associated with higher skipping rates than lexical words</w:t>
+      </w:r>
+      <w:r>
+        <w:t xml:space="preserve"> </w:t>
+      </w:r>
+      <w:r>
+        <w:t xml:space="preserve">(e.g. Carpenter &amp; Just, 1983)</w:t>
+      </w:r>
+      <w:r>
+        <w:t xml:space="preserve"> </w:t>
+      </w:r>
+      <w:r>
+        <w:t xml:space="preserve">– although it has recently been argued that this difference may largely reflect correlated factors such as frequency and length</w:t>
+      </w:r>
+      <w:r>
+        <w:t xml:space="preserve"> </w:t>
+      </w:r>
+      <w:r>
+        <w:t xml:space="preserve">(Staub, 2024)</w:t>
+      </w:r>
+      <w:r>
+        <w:t xml:space="preserve">. Within our theoretical framework, grammatical suffixes would likewise in principle be expected to be skipped more often than lexical suffixes. However, skipping constitutes a relatively indirect and noisy measure of attention allocation. The decision to skip a suffix depends both on the degree to which the suffix has been processed parafoveally and on whether that processing is deemed sufficient to forego direct fixation. Degree of parafoveal processing is influenced by multiple factors, including properties such as frequency and predictability of both the root and the suffix. In Kalaallisut, morpheme skipping rates may also be influenced by the difficulty of identifying morpheme boundaries parafoveally, as these boundaries are not visually marked (see further discussion in the section Differences between reading of suffixes and words). Against this background, the absence of a structural-status effect on skipping does not undermine the fixation-time findings. Notably, a similar dissociation between fixation-duration measures and skipping probability was observed by</w:t>
+      </w:r>
+      <w:r>
+        <w:t xml:space="preserve"> </w:t>
+      </w:r>
+      <w:r>
+        <w:t xml:space="preserve">Jaeger &amp; Boye (2026)</w:t>
+      </w:r>
+      <w:r>
+        <w:t xml:space="preserve"> </w:t>
+      </w:r>
+      <w:r>
+        <w:t xml:space="preserve">in a reanalysis of data from</w:t>
+      </w:r>
+      <w:r>
+        <w:t xml:space="preserve"> </w:t>
+      </w:r>
+      <w:r>
+        <w:t xml:space="preserve">Staub (2024)</w:t>
+      </w:r>
+      <w:r>
+        <w:t xml:space="preserve">.</w:t>
+      </w:r>
+    </w:p>
+    <w:p>
+      <w:pPr>
+        <w:pStyle w:val="BodyText"/>
+      </w:pPr>
+      <w:r>
+        <w:t xml:space="preserve">The results indicate that Kalaallisut suffixes classified as lexical are processed with greater attentional investment than those classified as grammatical. The fixation-time measures provide consistent support for this distinction, whereas the skipping data do not contradict it given their lower sensitivity. The findings thus lend empirical support to the proposed structural classification of suffixes in Kalaallisut and suggest that this distinction is reflected in real-time language processing.</w:t>
+      </w:r>
+    </w:p>
+    <w:p>
+      <w:pPr>
+        <w:pStyle w:val="BodyText"/>
+      </w:pPr>
+      <w:r>
+        <w:t xml:space="preserve">These results have broad theoretical implications, as they challenge a widespread assumption in both functional and generative linguistics that affixes are inherently grammatical elements</w:t>
+      </w:r>
+      <w:r>
+        <w:t xml:space="preserve"> </w:t>
+      </w:r>
+      <w:r>
+        <w:t xml:space="preserve">(e.g. Martinet, 1960:</w:t>
+      </w:r>
+      <w:r>
+        <w:t xml:space="preserve"> </w:t>
+      </w:r>
+      <w:r>
+        <w:t xml:space="preserve">4.19; Bybee et al., 1994; Segalowitz &amp; Lane, 2000)</w:t>
+      </w:r>
+      <w:r>
+        <w:t xml:space="preserve">. If some affixes in some languages are in fact lexical, this calls for a more differentiated approach to affixation, in which affixes are not automatically attributed grammatical status. Such a reconceptualization may in turn affect our understanding of the distinction between words and phrases, since this distinction is often grounded in assumptions about the types of elements words and phrases can contain. As discussed by</w:t>
+      </w:r>
+      <w:r>
+        <w:t xml:space="preserve"> </w:t>
+      </w:r>
+      <w:r>
+        <w:t xml:space="preserve">M. Nielsen et al. (under review)</w:t>
+      </w:r>
+      <w:r>
+        <w:t xml:space="preserve">, several of the traditional criteria used to distinguish words from phrases lose their force once a theoretically grounded notion of lexical affixes is adopted, suggesting that at least some of the classic contrasts between morphology and syntax may need to be reconsidered. Finally, the confirmation of the hypotheses provides further support for the theoretical framework adopted here</w:t>
+      </w:r>
+      <w:r>
+        <w:t xml:space="preserve"> </w:t>
+      </w:r>
+      <w:r>
+        <w:t xml:space="preserve">(Boye, 2023, 2024; Boye &amp; Harder, 2012)</w:t>
+      </w:r>
+      <w:r>
+        <w:t xml:space="preserve">, as, to our knowledge, no other existing framework predicts these specific patterns.</w:t>
+      </w:r>
+    </w:p>
+    <w:bookmarkEnd w:id="78"/>
+    <w:bookmarkStart w:id="79" w:name="morphemes-as-processing-units"/>
+    <w:p>
+      <w:pPr>
+        <w:pStyle w:val="Heading2"/>
+      </w:pPr>
+      <w:r>
+        <w:t xml:space="preserve">Morphemes as Processing Units</w:t>
+      </w:r>
+    </w:p>
+    <w:p>
+      <w:pPr>
+        <w:pStyle w:val="FirstParagraph"/>
+      </w:pPr>
+      <w:r>
+        <w:t xml:space="preserve">Beyond the effects of structural status, the suffix-level analyses revealed robust effects of frequency and length: More frequent suffixes were skipped more often and received shorter fixation times, whereas longer suffixes were skipped less frequently and attracted longer gaze durations. As mentioned above, these patterns closely mirror well-established word-level effects reported for other languages</w:t>
+      </w:r>
+      <w:r>
+        <w:t xml:space="preserve"> </w:t>
+      </w:r>
+      <w:r>
+        <w:t xml:space="preserve">(Kuperman et al., 2024; Rayner et al., 2011)</w:t>
+      </w:r>
+      <w:r>
+        <w:t xml:space="preserve">. Although length showed a reverse effect for FFD – longer suffixes elicited shorter initial fixations – this pattern is not unprecedented and has been reported previously for Finnish compound words</w:t>
+      </w:r>
+      <w:r>
+        <w:t xml:space="preserve"> </w:t>
+      </w:r>
+      <w:r>
+        <w:t xml:space="preserve">(Bertram &amp; Hyönä, 2003)</w:t>
+      </w:r>
+      <w:r>
+        <w:t xml:space="preserve">. It is likely that the pattern is a reflection of increased refixation probability as a function of length (the finding that gaze durations increased as a function of suffix length is consistent with this interpretation). No independent effects of suffix predictability were observed, likely due to its correlation with frequency or limitations of the corpus-based predictability measures.</w:t>
+      </w:r>
+    </w:p>
+    <w:p>
+      <w:pPr>
+        <w:pStyle w:val="BodyText"/>
+      </w:pPr>
+      <w:r>
+        <w:t xml:space="preserve">Taken together, these findings demonstrate systematic attentional differences at the morpheme level that parallel classic word-level effects in eye-movement research. This suggests that multi-morphemic Kalaallisut words are morphologically decomposed during reading and that individual morphemes function as processing units (especially the effects of frequency and structural status support this interpretation, as the effects of morpheme length could also be due to syllabic rather than morphemic segmentation).</w:t>
+      </w:r>
+    </w:p>
+    <w:p>
+      <w:pPr>
+        <w:pStyle w:val="BodyText"/>
+      </w:pPr>
+      <w:r>
+        <w:t xml:space="preserve">These results have important implications for models of reading and for eye-tracking research. Most influential models of eye-movement control in reading (e.g. E-Z Reader</w:t>
+      </w:r>
+      <w:r>
+        <w:t xml:space="preserve"> </w:t>
+      </w:r>
+      <w:r>
+        <w:t xml:space="preserve">(Reichle et al., 2003)</w:t>
+      </w:r>
+      <w:r>
+        <w:t xml:space="preserve"> </w:t>
+      </w:r>
+      <w:r>
+        <w:t xml:space="preserve">and SWIFT</w:t>
+      </w:r>
+      <w:r>
+        <w:t xml:space="preserve"> </w:t>
+      </w:r>
+      <w:r>
+        <w:t xml:space="preserve">(Engbert et al., 2005)</w:t>
+      </w:r>
+      <w:r>
+        <w:t xml:space="preserve">) assume that the word is the fundamental unit of processing. While this assumption is well motivated for more analytic languages, it is less straightforward to apply to Kalaallisut. Kalaallisut words are often very long, highly complex, and individually infrequent, making holistic word recognition difficult and reducing the plausibility of whole-word processing as the default strategy. Instead, the present findings suggest that readers make use of morphemes as processing units, particularly in cases where a word is too long and complex to process as a single unit.</w:t>
+      </w:r>
+    </w:p>
+    <w:p>
+      <w:pPr>
+        <w:pStyle w:val="BodyText"/>
+      </w:pPr>
+      <w:r>
+        <w:t xml:space="preserve">Methodologically, the present study demonstrates the value of analyzing eye movements within words. By treating individual suffixes as independent analysis regions, it provides a level of granularity that word-level designs cannot achieve. This approach is particularly well suited to morphologically rich languages like Kalaallisut and opens up new avenues for investigating morphological processing in real time.</w:t>
+      </w:r>
+    </w:p>
+    <w:bookmarkEnd w:id="79"/>
+    <w:bookmarkStart w:id="80" w:name="word-length-and-fixation-density"/>
+    <w:p>
+      <w:pPr>
+        <w:pStyle w:val="Heading2"/>
+      </w:pPr>
+      <w:r>
+        <w:t xml:space="preserve">Word Length and Fixation Density</w:t>
+      </w:r>
+    </w:p>
+    <w:p>
+      <w:pPr>
+        <w:pStyle w:val="FirstParagraph"/>
+      </w:pPr>
+      <w:r>
+        <w:t xml:space="preserve">As illustrated in Figure</w:t>
+      </w:r>
+      <w:r>
+        <w:t xml:space="preserve"> </w:t>
+      </w:r>
+      <w:r>
+        <w:t xml:space="preserve">1</w:t>
+      </w:r>
+      <w:r>
+        <w:t xml:space="preserve">, fixation density exhibits a U-shaped relationship with word length, with a minimum at approximately nine letters, a pattern that is observed for both fast and slow readers (see Supplementary Materials). Beyond nine letters, fixation density increases with increasing word length, suggesting that reading long words in Kalaallisut imposes a high processing load on the reader. This may reflect morphological processes, as word length in Kalaallisut often correlates with morphological complexity. In line with this, suffixes within the multi-morphemic target words were skipped less and regressed to more frequently than the morphologically simple baseline words of similar length.</w:t>
+      </w:r>
+    </w:p>
+    <w:p>
+      <w:pPr>
+        <w:pStyle w:val="BodyText"/>
+      </w:pPr>
+      <w:r>
+        <w:t xml:space="preserve">The turning point at around nine letters is noteworthy because it aligns closely with findings from other languages:</w:t>
+      </w:r>
+      <w:r>
+        <w:t xml:space="preserve"> </w:t>
+      </w:r>
+      <w:r>
+        <w:t xml:space="preserve">Hyönä et al. (2024)</w:t>
+      </w:r>
+      <w:r>
+        <w:t xml:space="preserve"> </w:t>
+      </w:r>
+      <w:r>
+        <w:t xml:space="preserve">found evidence that Finnish compound words up to nine letters tend to be processed holistically, whereas longer compounds are more likely to be processed via morphological decomposition. A similar mechanism may underlie the present Kalaallisut results: Words exceeding nine letters likely require decomposition, thereby increasing fixation density. Moreover, as word length increases, morphological complexity is also likely to increase, placing further demands on the processing system.</w:t>
+      </w:r>
+    </w:p>
+    <w:p>
+      <w:pPr>
+        <w:pStyle w:val="BodyText"/>
+      </w:pPr>
+      <w:r>
+        <w:t xml:space="preserve">Word length effects in eye-movement research are often modeled as linear</w:t>
+      </w:r>
+      <w:r>
+        <w:t xml:space="preserve"> </w:t>
+      </w:r>
+      <w:r>
+        <w:t xml:space="preserve">(see e.g. Kuperman et al., 2024)</w:t>
+      </w:r>
+      <w:r>
+        <w:t xml:space="preserve">. While such linear approximations may be sufficient for many languages and experimental contexts, they risk obscuring meaningful patterns in languages characterized by very long words. In the present data, the observed non-linear relationship between word length and fixation density sheds light on the role of morphological decomposition as an important factor in Kalaallisut reading. Capturing such non-linearities is crucial for developing models of reading that generalize to morphologically rich languages.</w:t>
+      </w:r>
+    </w:p>
+    <w:bookmarkEnd w:id="80"/>
+    <w:bookmarkStart w:id="81" w:name="asymmetric-attention-distribution"/>
+    <w:p>
+      <w:pPr>
+        <w:pStyle w:val="Heading2"/>
+      </w:pPr>
+      <w:r>
+        <w:t xml:space="preserve">Asymmetric Attention Distribution</w:t>
+      </w:r>
+    </w:p>
+    <w:p>
+      <w:pPr>
+        <w:pStyle w:val="FirstParagraph"/>
+      </w:pPr>
+      <w:r>
+        <w:t xml:space="preserve">The within-word attention distribution observed for the target words (Figure</w:t>
+      </w:r>
+      <w:r>
+        <w:t xml:space="preserve"> </w:t>
+      </w:r>
+      <w:r>
+        <w:t xml:space="preserve">2</w:t>
+      </w:r>
+      <w:r>
+        <w:t xml:space="preserve">) exhibits a clear asymmetry, with morphemes later in the word receiving less attention than those earlier in the word. Several, partly interacting factors may account for this pattern. One possible contributor is frequency: Many suffixes are considerably more frequent than roots, potentially facilitating faster processing (although a mixed-effects model of fixation density across word regions that includes frequency as a predictor indicates that frequency alone does not account for the observed pattern; see Supplementary Materials). Another possible contributing factor is word-final position: The inflection’s position next to a space may make it easier to identify parafoveally than the suffixes embedded in the middle of the word, increasing the likelihood of skipping.</w:t>
+      </w:r>
+    </w:p>
+    <w:p>
+      <w:pPr>
+        <w:pStyle w:val="BodyText"/>
+      </w:pPr>
+      <w:r>
+        <w:t xml:space="preserve">Structural status is also likely to shape the attention profile. In the target words, roots were always lexical (i.e. modifiable), target suffixes were split evenly between lexical and grammatical status, and filler suffixes and inflections were always grammatical (i.e. non-modifiable). The suffix-level analyses indicate that lexical morphemes tend to attract longer fixations than grammatical ones, suggesting that differences in structural status contribute to the overall distribution of attention within the word. However, this effect is difficult to disentangle from positional and frequency-related influences.</w:t>
+      </w:r>
+    </w:p>
+    <w:p>
+      <w:pPr>
+        <w:pStyle w:val="BodyText"/>
+      </w:pPr>
+      <w:r>
+        <w:t xml:space="preserve">The interpretation is further complicated by the fact that this lexical-grammatical organization reflects a general property of Kalaallisut word structure: Roots are typically lexical, inflections are always grammatical, and lexical suffixes tend to occupy slots close to the root</w:t>
+      </w:r>
+      <w:r>
+        <w:t xml:space="preserve"> </w:t>
+      </w:r>
+      <w:r>
+        <w:t xml:space="preserve">(M. Nielsen et al., under review)</w:t>
+      </w:r>
+      <w:r>
+        <w:t xml:space="preserve">. Readers’ attention allocation may therefore be shaped not only by properties of individual morphemes in the current word but also by their broader knowledge of the language’s morphological architecture. If suffixes closer to the root are more often lexical – and lexical suffixes tend to attract more attention – readers may start to systematically allocate more attention to suffixes nearer the root than to those further away.</w:t>
+      </w:r>
+    </w:p>
+    <w:p>
+      <w:pPr>
+        <w:pStyle w:val="BodyText"/>
+      </w:pPr>
+      <w:r>
+        <w:t xml:space="preserve">Future work could help disentangle these interacting factors by examining eye movements in left-branching languages with predominantly prefixing morphology, such as Athabaskan languages (e.g. Navajo), where the lexical root typically occurs at the end of the word. Such comparisons would allow for a clearer separation of positional and parafoveal effects from those related to structural status and frequency.</w:t>
+      </w:r>
+    </w:p>
+    <w:bookmarkEnd w:id="81"/>
+    <w:bookmarkStart w:id="83" w:name="X946ab59d40330995faa5774c5193493a66f9606"/>
+    <w:p>
+      <w:pPr>
+        <w:pStyle w:val="Heading2"/>
+      </w:pPr>
+      <w:r>
+        <w:t xml:space="preserve">Differences between Reading of Suffixes and Words</w:t>
+      </w:r>
+    </w:p>
+    <w:p>
+      <w:pPr>
+        <w:pStyle w:val="FirstParagraph"/>
+      </w:pPr>
+      <w:r>
+        <w:t xml:space="preserve">Although individual suffixes in Kalaallisut may correspond to separate words in more analytic languages, and although our results indicate that suffixes function as processing units in Kalaallisut reading, the observed within-word attention profile (Figure</w:t>
+      </w:r>
+      <w:r>
+        <w:t xml:space="preserve"> </w:t>
+      </w:r>
+      <w:r>
+        <w:t xml:space="preserve">2</w:t>
+      </w:r>
+      <w:r>
+        <w:t xml:space="preserve">) clearly shows that reading a four-morpheme Kalaallisut word is not simply equivalent to reading three or four independent words. Instead, morphemes are processed within a structured and highly asymmetric attentional landscape shaped by morphological organization and visual position. Comparing the profiles of attention distribution within words (Figures</w:t>
+      </w:r>
+      <w:r>
+        <w:t xml:space="preserve"> </w:t>
+      </w:r>
+      <w:r>
+        <w:t xml:space="preserve">2</w:t>
+      </w:r>
+      <w:r>
+        <w:t xml:space="preserve"> </w:t>
+      </w:r>
+      <w:r>
+        <w:t xml:space="preserve">and</w:t>
+      </w:r>
+      <w:r>
+        <w:t xml:space="preserve"> </w:t>
+      </w:r>
+      <w:r>
+        <w:t xml:space="preserve">3</w:t>
+      </w:r>
+      <w:r>
+        <w:t xml:space="preserve">) further highlights this distinction: While fixation patterns for the morphologically simple baseline words show a characteristic peak in the second quartile of the word, suffixes do not exhibit a comparable pattern. Thus, reading suffixes cannot be equated with reading independent words.</w:t>
+      </w:r>
+    </w:p>
+    <w:p>
+      <w:pPr>
+        <w:pStyle w:val="BodyText"/>
+      </w:pPr>
+      <w:r>
+        <w:t xml:space="preserve">Further evidence for this comes from skipping behavior (Figure</w:t>
+      </w:r>
+      <w:r>
+        <w:t xml:space="preserve"> </w:t>
+      </w:r>
+      <w:r>
+        <w:t xml:space="preserve">4</w:t>
+      </w:r>
+      <w:r>
+        <w:t xml:space="preserve">). Even though the baseline words were selected to match the target suffixes in morphological complexity and structural status, they were skipped more frequently than the suffixes. This is noteworthy because suffixes are, if anything, more predictable than words, given the limited inventory of suffixes in the language</w:t>
+      </w:r>
+      <w:r>
+        <w:rPr>
+          <w:rStyle w:val="FootnoteReference"/>
+        </w:rPr>
+        <w:footnoteReference w:id="82"/>
+      </w:r>
+      <w:r>
+        <w:t xml:space="preserve">.</w:t>
+      </w:r>
+    </w:p>
+    <w:p>
+      <w:pPr>
+        <w:pStyle w:val="BodyText"/>
+      </w:pPr>
+      <w:r>
+        <w:t xml:space="preserve">A plausible explanation is that morpheme boundaries are difficult to identify parafoveally in Kalaallisut, as they, unlike word boundaries, are not marked by spaces or other visual cues. Earlier studies have shown that adding visual cues to mark morpheme boundaries can make reading of complex words more efficient</w:t>
+      </w:r>
+      <w:r>
+        <w:t xml:space="preserve"> </w:t>
+      </w:r>
+      <w:r>
+        <w:t xml:space="preserve">(see e.g. Bertram &amp; Hyönä, 2013)</w:t>
+      </w:r>
+      <w:r>
+        <w:t xml:space="preserve">. The lack of such cues may make it hard to parafoveally determine what can be skipped. This may also explain why there is no fixation peak in the second quartile for suffixes: While spaces guide eye movements between words, the absence of such cues for morphemes may limit optimal saccade targeting to suffixes within complex words.</w:t>
+      </w:r>
+    </w:p>
+    <w:p>
+      <w:pPr>
+        <w:pStyle w:val="BodyText"/>
+      </w:pPr>
+      <w:r>
+        <w:t xml:space="preserve">Together, these findings – along with the high fixation density observed for long words (Figure</w:t>
+      </w:r>
+      <w:r>
+        <w:t xml:space="preserve"> </w:t>
+      </w:r>
+      <w:r>
+        <w:t xml:space="preserve">1</w:t>
+      </w:r>
+      <w:r>
+        <w:t xml:space="preserve">) – suggest that reading multi-morphemic words in Kalaallisut places relatively high demands on the processing system. Given that such words are pervasive in the language, this raises the broader question of whether reading Kalaallisut is, all else being equal, more resource demanding than reading languages characterized by shorter words, such as English. This question remains open and requires targeted cross-linguistic investigation. Nevertheless, it is noteworthy that many native speakers of Kalaallisut prefer reading in Danish or English when given the choice, despite the widespread use of Kalaallisut text in schools and the media in Greenland. In the present study, 35 participants (67%) reported reading Kalaallisut every day, yet only 25 of these 35 identified Kalaallisut as one of their preferred languages for reading.</w:t>
+      </w:r>
+    </w:p>
+    <w:p>
+      <w:pPr>
+        <w:pStyle w:val="BodyText"/>
+      </w:pPr>
+      <w:r>
+        <w:t xml:space="preserve">One could speculate that because Kalaallisut orthography is relatively young and was developed on the basis of European writing traditions, it may not be optimally suited to the language’s morphological structure. This raises the possibility that readers of Kalaallisut may benefit from alternative orthographic solutions, introducing visual cues to facilitate the processing of complex words.</w:t>
+      </w:r>
+    </w:p>
+    <w:p>
+      <w:pPr>
+        <w:pStyle w:val="BodyText"/>
+      </w:pPr>
+      <w:r>
+        <w:t xml:space="preserve">One promising direction for future research is comparative work with closely related languages that employ different orthographic systems. Inuktitut, for example, uses a syllabic writing system rather than the Latin alphabet. Eye-tracking studies of Inuktitut reading could provide valuable insight into how multi-morphemic words are processed in a syllabic orthography, where fewer symbols are used to represent the same linguistic material. Such a system may reduce visual crowding and constrain the possible locations of morpheme boundaries, potentially facilitating segmentation. Comparative evidence of this kind would help clarify the extent to which the processing demands observed here reflect properties of Kalaallisut morphology per se or characteristics of its orthographic implementation.</w:t>
+      </w:r>
+    </w:p>
+    <w:bookmarkEnd w:id="83"/>
+    <w:bookmarkEnd w:id="84"/>
+    <w:bookmarkStart w:id="85" w:name="conclusions"/>
+    <w:p>
+      <w:pPr>
+        <w:pStyle w:val="Heading1"/>
+      </w:pPr>
+      <w:r>
+        <w:t xml:space="preserve">Conclusions</w:t>
+      </w:r>
+    </w:p>
+    <w:p>
+      <w:pPr>
+        <w:pStyle w:val="FirstParagraph"/>
+      </w:pPr>
+      <w:r>
+        <w:t xml:space="preserve">This study set out to explore how multi-morphemic words are processed in Kalaallisut reading. Three main conclusions emerge.</w:t>
+      </w:r>
+    </w:p>
+    <w:p>
+      <w:pPr>
+        <w:pStyle w:val="BodyText"/>
+      </w:pPr>
+      <w:r>
+        <w:t xml:space="preserve">First, the results provide support for the theory-based claim that some Kalaallisut suffixes are lexical rather than grammatical, showing that this proposed distinction is reflected in attention allocation in reading. This challenges the widespread assumption that affixes are always grammatical elements.</w:t>
+      </w:r>
+    </w:p>
+    <w:p>
+      <w:pPr>
+        <w:pStyle w:val="BodyText"/>
+      </w:pPr>
+      <w:r>
+        <w:t xml:space="preserve">Second, the study shows that the word cannot always be assumed to be the basic unit of processing in reading. Our findings indicate that reading of multi-morphemic words in Kalaallisut is driven to a large extent by morpheme-level processing. This poses a challenge to influential models of eye-movement control that take the word as their fundamental unit, and it underscores the need for models to account for morpheme-level processing in order to accommodate languages where morphologically complex words are frequent.</w:t>
+      </w:r>
+    </w:p>
+    <w:p>
+      <w:pPr>
+        <w:pStyle w:val="BodyText"/>
+      </w:pPr>
+      <w:r>
+        <w:t xml:space="preserve">Third, although the results indicate that morphemes function as processing units in Kalaallisut, processing suffixes is not equivalent to processing individual simple words. Saccade targeting and skipping within complex words appears less efficient than between words. This may reflect that morpheme boundaries are not visually marked in the orthography, and it points to an interesting avenue for further research on the interaction between morphological structure and orthography in shaping reading behavior.</w:t>
+      </w:r>
+    </w:p>
+    <w:p>
+      <w:pPr>
+        <w:pStyle w:val="BodyText"/>
+      </w:pPr>
+      <w:r>
+        <w:t xml:space="preserve">Taken together, these findings demonstrate that the study of morphologically rich languages offers critical insights into the mechanisms of reading and language processing. They expose limitations of assumptions that are often taken for granted in psycholinguistic research and underscore the importance of broadening the empirical base of reading studies. Future comparative work, particularly across languages with different orthographic systems, will be essential for disentangling the roles of morphology and orthography and for understanding how readers adapt to extreme morphological complexity.</w:t>
+      </w:r>
+    </w:p>
+    <w:bookmarkEnd w:id="85"/>
+    <w:bookmarkStart w:id="86" w:name="competing-interests-declaration"/>
+    <w:p>
+      <w:pPr>
+        <w:pStyle w:val="Heading1"/>
+      </w:pPr>
+      <w:r>
+        <w:t xml:space="preserve">Competing Interests Declaration</w:t>
+      </w:r>
+    </w:p>
+    <w:p>
+      <w:pPr>
+        <w:pStyle w:val="FirstParagraph"/>
+      </w:pPr>
+      <w:r>
+        <w:t xml:space="preserve">Competing interests: The authors declare none.</w:t>
+      </w:r>
+    </w:p>
     <w:bookmarkEnd w:id="86"/>
-    <w:bookmarkEnd w:id="87"/>
-    <w:bookmarkStart w:id="94" w:name="discussion"/>
+    <w:bookmarkStart w:id="168" w:name="references"/>
     <w:p>
       <w:pPr>
         <w:pStyle w:val="Heading1"/>
       </w:pPr>
       <w:r>
-        <w:t xml:space="preserve">Discussion</w:t>
-      </w:r>
-    </w:p>
-    <w:p>
-      <w:pPr>
-        <w:pStyle w:val="FirstParagraph"/>
-      </w:pPr>
-      <w:r>
-        <w:t xml:space="preserve">The present study set out to investigate how multi-morphemic words are processed in Kalaallisut reading, with a particular focus on how readers allocate attention at the morpheme level and whether the lexical-grammatical distinction among derivational suffixes is reflected in eye-movement behavior. By combining general exploratory analyses with suffix-level analyses, the study provides insights into both overall reading patterns and fine-grained patterns of morpheme processing.</w:t>
-      </w:r>
-    </w:p>
-    <w:p>
-      <w:pPr>
-        <w:pStyle w:val="BodyText"/>
-      </w:pPr>
-      <w:r>
-        <w:t xml:space="preserve">Taken together, the results show how readers navigate morphologically complex words in Kalaallisut. Long, multi-morphemic words elicit a high density of fixations, suggesting that they place considerable demands on readers’ attentional resources. Within the word, this attention is asymmetrically distributed: Visual attention is most highly concentrated on the root and declines across the word, with relatively little attention devoted to the inflectional ending.</w:t>
-      </w:r>
-    </w:p>
-    <w:p>
-      <w:pPr>
-        <w:pStyle w:val="BodyText"/>
-      </w:pPr>
-      <w:r>
-        <w:t xml:space="preserve">This pattern does not in itself demonstrate sensitivity to morphological structure: In principle, readers could rely on syllables or larger multi-morpheme chunks as processing units when reading complex words. The suffix-level analyses, however, offer more direct evidence that individual morphemes function as units in reading: Fixation patterns for the suffixes were systematically influenced by suffix frequency, length, and structural status. As these patterns parallel effects typically observed at the word level</w:t>
-      </w:r>
-      <w:r>
-        <w:t xml:space="preserve"> </w:t>
-      </w:r>
-      <w:r>
-        <w:t xml:space="preserve">(Kuperman et al., 2024; see e.g. Rayner et al., 2011)</w:t>
-      </w:r>
-      <w:r>
-        <w:t xml:space="preserve">, they suggest that individual morphemes can serve as processing units in Kalaallisut reading, much like words do in more analytic languages.</w:t>
-      </w:r>
-    </w:p>
-    <w:p>
-      <w:pPr>
-        <w:pStyle w:val="BodyText"/>
-      </w:pPr>
-      <w:r>
-        <w:t xml:space="preserve">At the same time, however, the results also underscore that the processing of morphemes is not simply analogous to processing of simple words in Kalaallisut. This is illustrated, for example, by the distinct skipping patterns observed for suffixes compared to whole simple words, and by the regression patterns, which show frequent regressions to the root in the target words and, to a lesser extent, to the target suffixes – while regressions to the baseline words were less frequent.</w:t>
-      </w:r>
-    </w:p>
-    <w:p>
-      <w:pPr>
-        <w:pStyle w:val="BodyText"/>
-      </w:pPr>
-      <w:r>
-        <w:t xml:space="preserve">In the following sections, we discuss each of the findings in turn, considering their potential implications for our understanding of reading, language processing and morphological complexity.</w:t>
-      </w:r>
-    </w:p>
-    <w:bookmarkStart w:id="88" w:name="lexical-vs.-grammatical-suffixes"/>
-    <w:p>
-      <w:pPr>
-        <w:pStyle w:val="Heading2"/>
-      </w:pPr>
-      <w:r>
-        <w:t xml:space="preserve">Lexical vs. Grammatical Suffixes</w:t>
-      </w:r>
-    </w:p>
-    <w:p>
-      <w:pPr>
-        <w:pStyle w:val="FirstParagraph"/>
-      </w:pPr>
-      <w:r>
-        <w:t xml:space="preserve">The central question addressed in the suffix-level analyses was whether suffixes classified as lexical differ from grammatical suffixes in the amount of attention they attract during reading. The results showed that when suffix frequency, length, and predictability were controlled for, lexical suffixes elicited longer fixation times than grammatical suffixes, as reflected in both first fixation durations (FFD) and gaze durations (GD). These effects are consistent with the prediction that lexical suffixes attract more attention than grammatical suffixes in reading.</w:t>
-      </w:r>
-    </w:p>
-    <w:p>
-      <w:pPr>
-        <w:pStyle w:val="BodyText"/>
-      </w:pPr>
-      <w:r>
-        <w:t xml:space="preserve">In contrast, no reliable effect of structural status was observed for skipping probability. We examined skipping alongside fixation duration measures because grammatical words have traditionally been associated with higher skipping rates than lexical words</w:t>
-      </w:r>
-      <w:r>
-        <w:t xml:space="preserve"> </w:t>
-      </w:r>
-      <w:r>
-        <w:t xml:space="preserve">(e.g. Carpenter &amp; Just, 1983)</w:t>
-      </w:r>
-      <w:r>
-        <w:t xml:space="preserve"> </w:t>
-      </w:r>
-      <w:r>
-        <w:t xml:space="preserve">– although it has recently been argued that this difference may largely reflect correlated factors such as frequency and length</w:t>
-      </w:r>
-      <w:r>
-        <w:t xml:space="preserve"> </w:t>
-      </w:r>
-      <w:r>
-        <w:t xml:space="preserve">(Staub, 2024)</w:t>
-      </w:r>
-      <w:r>
-        <w:t xml:space="preserve">. Within our theoretical framework, grammatical suffixes would likewise in principle be expected to be skipped more often than lexical suffixes. However, skipping constitutes a relatively indirect and noisy measure of attention allocation. The decision to skip a suffix depends both on the degree to which the suffix has been processed parafoveally and on whether that processing is deemed sufficient to forego direct fixation. Degree of parafoveal processing is influenced by multiple factors, including properties such as frequency and predictability of both the root and the suffix. In Kalaallisut, morpheme skipping rates may also be influenced by the difficulty of identifying morpheme boundaries parafoveally, as these boundaries are not visually marked (see further discussion in the section Differences between reading of suffixes and words). Against this background, the absence of a structural-status effect on skipping does not undermine the fixation-time findings. Notably, a similar dissociation between fixation-duration measures and skipping probability was observed by</w:t>
-      </w:r>
-      <w:r>
-        <w:t xml:space="preserve"> </w:t>
-      </w:r>
-      <w:r>
-        <w:t xml:space="preserve">Jaeger &amp; Boye (under review)</w:t>
-      </w:r>
-      <w:r>
-        <w:t xml:space="preserve"> </w:t>
-      </w:r>
-      <w:r>
-        <w:t xml:space="preserve">in a reanalysis of data from</w:t>
-      </w:r>
-      <w:r>
-        <w:t xml:space="preserve"> </w:t>
-      </w:r>
-      <w:r>
-        <w:t xml:space="preserve">Staub (2024)</w:t>
-      </w:r>
-      <w:r>
-        <w:t xml:space="preserve">.</w:t>
-      </w:r>
-    </w:p>
-    <w:p>
-      <w:pPr>
-        <w:pStyle w:val="BodyText"/>
-      </w:pPr>
-      <w:r>
-        <w:t xml:space="preserve">The results indicate that Kalaallisut suffixes classified as lexical are processed with greater attentional investment than those classified as grammatical. The fixation-time measures provide consistent support for this distinction, whereas the skipping data do not contradict it given their lower sensitivity. The findings thus lend empirical support to the proposed structural classification of suffixes in Kalaallisut and suggest that this distinction is reflected in real-time language processing.</w:t>
-      </w:r>
-    </w:p>
-    <w:p>
-      <w:pPr>
-        <w:pStyle w:val="BodyText"/>
-      </w:pPr>
-      <w:r>
-        <w:t xml:space="preserve">These results have broad theoretical implications, as they challenge a widespread assumption in both functional and generative linguistics that affixes are inherently grammatical elements</w:t>
-      </w:r>
-      <w:r>
-        <w:t xml:space="preserve"> </w:t>
-      </w:r>
-      <w:r>
-        <w:t xml:space="preserve">(e.g. Martinet, 1960:</w:t>
-      </w:r>
-      <w:r>
-        <w:t xml:space="preserve"> </w:t>
-      </w:r>
-      <w:r>
-        <w:t xml:space="preserve">4.19; Bybee et al., 1994; Segalowitz &amp; Lane, 2000)</w:t>
-      </w:r>
-      <w:r>
-        <w:t xml:space="preserve">. If some affixes in some languages are in fact lexical, this calls for a more differentiated approach to affixation, in which affixes are not automatically attributed grammatical status. Such a reconceptualization may in turn affect our understanding of the distinction between words and phrases, since this distinction is often grounded in assumptions about the types of elements words and phrases can contain. As discussed by</w:t>
-      </w:r>
-      <w:r>
-        <w:t xml:space="preserve"> </w:t>
-      </w:r>
-      <w:r>
-        <w:t xml:space="preserve">M. Nielsen et al. (under review)</w:t>
-      </w:r>
-      <w:r>
-        <w:t xml:space="preserve">, several of the traditional criteria used to distinguish words from phrases lose their force once a theoretically grounded notion of lexical affixes is adopted, suggesting that at least some of the classic contrasts between morphology and syntax may need to be reconsidered. Finally, the confirmation of the hypotheses provides further support for the theoretical framework adopted here</w:t>
-      </w:r>
-      <w:r>
-        <w:t xml:space="preserve"> </w:t>
-      </w:r>
-      <w:r>
-        <w:t xml:space="preserve">(Boye, 2023, 2024; Boye &amp; Harder, 2012)</w:t>
-      </w:r>
-      <w:r>
-        <w:t xml:space="preserve">, as, to our knowledge, no other existing framework predicts these specific patterns.</w:t>
-      </w:r>
-    </w:p>
-    <w:bookmarkEnd w:id="88"/>
-    <w:bookmarkStart w:id="89" w:name="morphemes-as-processing-units"/>
-    <w:p>
-      <w:pPr>
-        <w:pStyle w:val="Heading2"/>
-      </w:pPr>
-      <w:r>
-        <w:t xml:space="preserve">Morphemes as Processing Units</w:t>
-      </w:r>
-    </w:p>
-    <w:p>
-      <w:pPr>
-        <w:pStyle w:val="FirstParagraph"/>
-      </w:pPr>
-      <w:r>
-        <w:t xml:space="preserve">Beyond the effects of structural status, the suffix-level analyses revealed robust effects of frequency and length: More frequent suffixes were skipped more often and received shorter fixation times, whereas longer suffixes were skipped less frequently and attracted longer gaze durations. As mentioned above, these patterns closely mirror well-established word-level effects reported for other languages</w:t>
-      </w:r>
-      <w:r>
-        <w:t xml:space="preserve"> </w:t>
-      </w:r>
-      <w:r>
-        <w:t xml:space="preserve">(Kuperman et al., 2024; Rayner et al., 2011)</w:t>
-      </w:r>
-      <w:r>
-        <w:t xml:space="preserve">. Although length showed a reverse effect for FFD – longer suffixes elicited shorter initial fixations – this pattern is not unprecedented and has been reported previously for Finnish compound words</w:t>
-      </w:r>
-      <w:r>
-        <w:t xml:space="preserve"> </w:t>
-      </w:r>
-      <w:r>
-        <w:t xml:space="preserve">(Bertram &amp; Hyönä, 2003)</w:t>
-      </w:r>
-      <w:r>
-        <w:t xml:space="preserve">. It is likely that the pattern is a reflection of increased refixation probability as a function of length (the finding that gaze durations increased as a function of suffix length is consistent with this interpretation). No independent effects of suffix predictability were observed, likely due to its correlation with frequency or limitations of the corpus-based predictability measures.</w:t>
-      </w:r>
-    </w:p>
-    <w:p>
-      <w:pPr>
-        <w:pStyle w:val="BodyText"/>
-      </w:pPr>
-      <w:r>
-        <w:t xml:space="preserve">Taken together, these findings demonstrate systematic attentional differences at the morpheme level that parallel classic word-level effects in eye-movement research. This suggests that multi-morphemic Kalaallisut words are morphologically decomposed during reading and that individual morphemes function as processing units (especially the effects of frequency and structural status support this interpretation, as the effects of morpheme length could also be due to syllabic rather than morphemic segmentation).</w:t>
-      </w:r>
-    </w:p>
-    <w:p>
-      <w:pPr>
-        <w:pStyle w:val="BodyText"/>
-      </w:pPr>
-      <w:r>
-        <w:t xml:space="preserve">These results have important implications for models of reading and for eye-tracking research. Most influential models of eye-movement control in reading (e.g. E-Z Reader</w:t>
-      </w:r>
-      <w:r>
-        <w:t xml:space="preserve"> </w:t>
-      </w:r>
-      <w:r>
-        <w:t xml:space="preserve">(Reichle et al., 2003)</w:t>
-      </w:r>
-      <w:r>
-        <w:t xml:space="preserve"> </w:t>
-      </w:r>
-      <w:r>
-        <w:t xml:space="preserve">and SWIFT</w:t>
-      </w:r>
-      <w:r>
-        <w:t xml:space="preserve"> </w:t>
-      </w:r>
-      <w:r>
-        <w:t xml:space="preserve">(Engbert et al., 2005)</w:t>
-      </w:r>
-      <w:r>
-        <w:t xml:space="preserve">) assume that the word is the fundamental unit of processing. While this assumption is well motivated for more analytic languages, it is less straightforward to apply to Kalaallisut. Kalaallisut words are often very long, highly complex, and individually infrequent, making holistic word recognition difficult and reducing the plausibility of whole-word processing as the default strategy. Instead, the present findings suggest that readers make use of morphemes as processing units, particularly in cases where a word is too long and complex to process as a single unit.</w:t>
-      </w:r>
-    </w:p>
-    <w:p>
-      <w:pPr>
-        <w:pStyle w:val="BodyText"/>
-      </w:pPr>
-      <w:r>
-        <w:t xml:space="preserve">Methodologically, the present study demonstrates the value of analyzing eye movements within words. By treating individual suffixes as independent analysis regions, it provides a level of granularity that word-level designs cannot achieve. This approach is particularly well suited to morphologically rich languages like Kalaallisut and opens up new avenues for investigating morphological processing in real time.</w:t>
-      </w:r>
-    </w:p>
-    <w:bookmarkEnd w:id="89"/>
-    <w:bookmarkStart w:id="90" w:name="word-length-and-fixation-density"/>
-    <w:p>
-      <w:pPr>
-        <w:pStyle w:val="Heading2"/>
-      </w:pPr>
-      <w:r>
-        <w:t xml:space="preserve">Word Length and Fixation Density</w:t>
-      </w:r>
-    </w:p>
-    <w:p>
-      <w:pPr>
-        <w:pStyle w:val="FirstParagraph"/>
-      </w:pPr>
-      <w:r>
-        <w:t xml:space="preserve">As illustrated in Figure</w:t>
-      </w:r>
-      <w:r>
-        <w:t xml:space="preserve"> </w:t>
-      </w:r>
-      <w:r>
-        <w:t xml:space="preserve">1</w:t>
-      </w:r>
-      <w:r>
-        <w:t xml:space="preserve">, fixation density exhibits a U-shaped relationship with word length, with a minimum at approximately nine letters, a pattern that is observed for both fast and slow readers (see Supplementary Materials). Beyond nine letters, fixation density increases with increasing word length, suggesting that reading long words in Kalaallisut imposes a high processing load on the reader. This may reflect morphological processes, as word length in Kalaallisut often correlates with morphological complexity. In line with this, suffixes within the multi-morphemic target words were skipped less and regressed to more frequently than the morphologically simple baseline words of similar length.</w:t>
-      </w:r>
-    </w:p>
-    <w:p>
-      <w:pPr>
-        <w:pStyle w:val="BodyText"/>
-      </w:pPr>
-      <w:r>
-        <w:t xml:space="preserve">The turning point at around nine letters is noteworthy because it aligns closely with findings from other languages:</w:t>
-      </w:r>
-      <w:r>
-        <w:t xml:space="preserve"> </w:t>
-      </w:r>
-      <w:r>
-        <w:t xml:space="preserve">Hyönä et al. (2024)</w:t>
-      </w:r>
-      <w:r>
-        <w:t xml:space="preserve"> </w:t>
-      </w:r>
-      <w:r>
-        <w:t xml:space="preserve">found evidence that Finnish compound words up to nine letters tend to be processed holistically, whereas longer compounds are more likely to be processed via morphological decomposition. A similar mechanism may underlie the present Kalaallisut results: Words exceeding nine letters likely require decomposition, thereby increasing fixation density. Moreover, as word length increases, morphological complexity is also likely to increase, placing further demands on the processing system.</w:t>
-      </w:r>
-    </w:p>
-    <w:p>
-      <w:pPr>
-        <w:pStyle w:val="BodyText"/>
-      </w:pPr>
-      <w:r>
-        <w:t xml:space="preserve">Word length effects in eye-movement research are often modeled as linear</w:t>
-      </w:r>
-      <w:r>
-        <w:t xml:space="preserve"> </w:t>
-      </w:r>
-      <w:r>
-        <w:t xml:space="preserve">(see e.g. Kuperman et al., 2024)</w:t>
-      </w:r>
-      <w:r>
-        <w:t xml:space="preserve">. While such linear approximations may be sufficient for many languages and experimental contexts, they risk obscuring meaningful patterns in languages characterized by very long words. In the present data, the observed non-linear relationship between word length and fixation density sheds light on the role of morphological decomposition as an important factor in Kalaallisut reading. Capturing such non-linearities is crucial for developing models of reading that generalize to morphologically rich languages.</w:t>
-      </w:r>
-    </w:p>
-    <w:bookmarkEnd w:id="90"/>
-    <w:bookmarkStart w:id="91" w:name="asymmetric-attention-distribution"/>
-    <w:p>
-      <w:pPr>
-        <w:pStyle w:val="Heading2"/>
-      </w:pPr>
-      <w:r>
-        <w:t xml:space="preserve">Asymmetric Attention Distribution</w:t>
-      </w:r>
-    </w:p>
-    <w:p>
-      <w:pPr>
-        <w:pStyle w:val="FirstParagraph"/>
-      </w:pPr>
-      <w:r>
-        <w:t xml:space="preserve">The within-word attention distribution observed for the target words (Figure</w:t>
-      </w:r>
-      <w:r>
-        <w:t xml:space="preserve"> </w:t>
-      </w:r>
-      <w:r>
-        <w:t xml:space="preserve">2</w:t>
-      </w:r>
-      <w:r>
-        <w:t xml:space="preserve">) exhibits a clear asymmetry, with morphemes later in the word receiving less attention than those earlier in the word. Several, partly interacting factors may account for this pattern. One possible contributor is frequency: Many suffixes are considerably more frequent than roots, potentially facilitating faster processing (although a mixed-effects model of fixation density across word regions that includes frequency as a predictor indicates that frequency alone does not account for the observed pattern; see Supplementary Materials). Another possible contributing factor is word-final position: The inflection’s position next to a space may make it easier to identify parafoveally than the suffixes embedded in the middle of the word, increasing the likelihood of skipping.</w:t>
-      </w:r>
-    </w:p>
-    <w:p>
-      <w:pPr>
-        <w:pStyle w:val="BodyText"/>
-      </w:pPr>
-      <w:r>
-        <w:t xml:space="preserve">Structural status is also likely to shape the attention profile. In the target words, roots were always lexical (i.e. modifiable), target suffixes were split evenly between lexical and grammatical status, and filler suffixes and inflections were always grammatical (i.e. non-modifiable). The suffix-level analyses indicate that lexical morphemes tend to attract longer fixations than grammatical ones, suggesting that differences in structural status contribute to the overall distribution of attention within the word. However, this effect is difficult to disentangle from positional and frequency-related influences.</w:t>
-      </w:r>
-    </w:p>
-    <w:p>
-      <w:pPr>
-        <w:pStyle w:val="BodyText"/>
-      </w:pPr>
-      <w:r>
-        <w:t xml:space="preserve">The interpretation is further complicated by the fact that this lexical-grammatical organization reflects a general property of Kalaallisut word structure: Roots are typically lexical, inflections are always grammatical, and lexical suffixes tend to occupy slots close to the root</w:t>
-      </w:r>
-      <w:r>
-        <w:t xml:space="preserve"> </w:t>
-      </w:r>
-      <w:r>
-        <w:t xml:space="preserve">(M. Nielsen et al., under review)</w:t>
-      </w:r>
-      <w:r>
-        <w:t xml:space="preserve">. Readers’ attention allocation may therefore be shaped not only by properties of individual morphemes in the current word but also by their broader knowledge of the language’s morphological architecture. If suffixes closer to the root are more often lexical – and lexical suffixes tend to attract more attention – readers may start to systematically allocate more attention to suffixes nearer the root than to those further away.</w:t>
-      </w:r>
-    </w:p>
-    <w:p>
-      <w:pPr>
-        <w:pStyle w:val="BodyText"/>
-      </w:pPr>
-      <w:r>
-        <w:t xml:space="preserve">Future work could help disentangle these interacting factors by examining eye movements in left-branching languages with predominantly prefixing morphology, such as Athabaskan languages (e.g. Navajo), where the lexical root typically occurs at the end of the word. Such comparisons would allow for a clearer separation of positional and parafoveal effects from those related to structural status and frequency.</w:t>
-      </w:r>
-    </w:p>
-    <w:bookmarkEnd w:id="91"/>
-    <w:bookmarkStart w:id="93" w:name="X946ab59d40330995faa5774c5193493a66f9606"/>
-    <w:p>
-      <w:pPr>
-        <w:pStyle w:val="Heading2"/>
-      </w:pPr>
-      <w:r>
-        <w:t xml:space="preserve">Differences between Reading of Suffixes and Words</w:t>
-      </w:r>
-    </w:p>
-    <w:p>
-      <w:pPr>
-        <w:pStyle w:val="FirstParagraph"/>
-      </w:pPr>
-      <w:r>
-        <w:t xml:space="preserve">Although individual suffixes in Kalaallisut may correspond to separate words in more analytic languages, and although our results indicate that suffixes function as processing units in Kalaallisut reading, the observed within-word attention profile (Figure</w:t>
-      </w:r>
-      <w:r>
-        <w:t xml:space="preserve"> </w:t>
-      </w:r>
-      <w:r>
-        <w:t xml:space="preserve">2</w:t>
-      </w:r>
-      <w:r>
-        <w:t xml:space="preserve">) clearly shows that reading a four-morpheme Kalaallisut word is not simply equivalent to reading three or four independent words. Instead, morphemes are processed within a structured and highly asymmetric attentional landscape shaped by morphological organization and visual position. Comparing the profiles of attention distribution within words (Figures</w:t>
-      </w:r>
-      <w:r>
-        <w:t xml:space="preserve"> </w:t>
-      </w:r>
-      <w:r>
-        <w:t xml:space="preserve">2</w:t>
-      </w:r>
-      <w:r>
-        <w:t xml:space="preserve"> </w:t>
-      </w:r>
-      <w:r>
-        <w:t xml:space="preserve">and</w:t>
-      </w:r>
-      <w:r>
-        <w:t xml:space="preserve"> </w:t>
-      </w:r>
-      <w:r>
-        <w:t xml:space="preserve">3</w:t>
-      </w:r>
-      <w:r>
-        <w:t xml:space="preserve">) further highlights this distinction: While fixation patterns for the morphologically simple baseline words show a characteristic peak in the second quartile of the word, suffixes do not exhibit a comparable pattern. Thus, reading suffixes cannot be equated with reading independent words.</w:t>
-      </w:r>
-    </w:p>
-    <w:p>
-      <w:pPr>
-        <w:pStyle w:val="BodyText"/>
-      </w:pPr>
-      <w:r>
-        <w:t xml:space="preserve">Further evidence for this comes from skipping behavior (Figure</w:t>
-      </w:r>
-      <w:r>
-        <w:t xml:space="preserve"> </w:t>
-      </w:r>
-      <w:r>
-        <w:t xml:space="preserve">4</w:t>
-      </w:r>
-      <w:r>
-        <w:t xml:space="preserve">). Even though the baseline words were selected to match the target suffixes in morphological complexity and structural status, they were skipped more frequently than the suffixes. This is noteworthy because suffixes are, if anything, more predictable than words, given the limited inventory of suffixes in the language</w:t>
-      </w:r>
-      <w:r>
-        <w:rPr>
-          <w:rStyle w:val="FootnoteReference"/>
-        </w:rPr>
-        <w:footnoteReference w:id="92"/>
-      </w:r>
-      <w:r>
-        <w:t xml:space="preserve">.</w:t>
-      </w:r>
-    </w:p>
-    <w:p>
-      <w:pPr>
-        <w:pStyle w:val="BodyText"/>
-      </w:pPr>
-      <w:r>
-        <w:t xml:space="preserve">A plausible explanation is that morpheme boundaries are difficult to identify parafoveally in Kalaallisut, as they, unlike word boundaries, are not marked by spaces or other visual cues. Earlier studies have shown that adding visual cues to mark morpheme boundaries can make reading of complex words more efficient</w:t>
-      </w:r>
-      <w:r>
-        <w:t xml:space="preserve"> </w:t>
-      </w:r>
-      <w:r>
-        <w:t xml:space="preserve">(see e.g. Bertram &amp; Hyönä, 2013)</w:t>
-      </w:r>
-      <w:r>
-        <w:t xml:space="preserve">. The lack of such cues may make it hard to parafoveally determine what can be skipped. This may also explain why there is no fixation peak in the second quartile for suffixes: While spaces guide eye movements between words, the absence of such cues for morphemes may limit optimal saccade targeting to suffixes within complex words.</w:t>
-      </w:r>
-    </w:p>
-    <w:p>
-      <w:pPr>
-        <w:pStyle w:val="BodyText"/>
-      </w:pPr>
-      <w:r>
-        <w:t xml:space="preserve">Together, these findings – along with the high fixation density observed for long words (Figure</w:t>
-      </w:r>
-      <w:r>
-        <w:t xml:space="preserve"> </w:t>
-      </w:r>
-      <w:r>
-        <w:t xml:space="preserve">1</w:t>
-      </w:r>
-      <w:r>
-        <w:t xml:space="preserve">) – suggest that reading multi-morphemic words in Kalaallisut places relatively high demands on the processing system. Given that such words are pervasive in the language, this raises the broader question of whether reading Kalaallisut is, all else being equal, more resource demanding than reading languages characterized by shorter words, such as English. This question remains open and requires targeted cross-linguistic investigation. Nevertheless, it is noteworthy that many native speakers of Kalaallisut prefer reading in Danish or English when given the choice, despite the widespread use of Kalaallisut text in schools and the media in Greenland. In the present study, 35 participants (67%) reported reading Kalaallisut every day, yet only 25 of these 35 identified Kalaallisut as one of their preferred languages for reading.</w:t>
-      </w:r>
-    </w:p>
-    <w:p>
-      <w:pPr>
-        <w:pStyle w:val="BodyText"/>
-      </w:pPr>
-      <w:r>
-        <w:t xml:space="preserve">One could speculate that because Kalaallisut orthography is relatively young and was developed on the basis of European writing traditions, it may not be optimally suited to the language’s morphological structure. This raises the possibility that readers of Kalaallisut may benefit from alternative orthographic solutions, introducing visual cues to facilitate the processing of complex words.</w:t>
-      </w:r>
-    </w:p>
-    <w:p>
-      <w:pPr>
-        <w:pStyle w:val="BodyText"/>
-      </w:pPr>
-      <w:r>
-        <w:t xml:space="preserve">One promising direction for future research is comparative work with closely related languages that employ different orthographic systems. Inuktitut, for example, uses a syllabic writing system rather than the Latin alphabet. Eye-tracking studies of Inuktitut reading could provide valuable insight into how multi-morphemic words are processed in a syllabic orthography, where fewer symbols are used to represent the same linguistic material. Such a system may reduce visual crowding and constrain the possible locations of morpheme boundaries, potentially facilitating segmentation. Comparative evidence of this kind would help clarify the extent to which the processing demands observed here reflect properties of Kalaallisut morphology per se or characteristics of its orthographic implementation.</w:t>
-      </w:r>
-    </w:p>
-    <w:bookmarkEnd w:id="93"/>
-    <w:bookmarkEnd w:id="94"/>
-    <w:bookmarkStart w:id="95" w:name="conclusions"/>
-    <w:p>
-      <w:pPr>
-        <w:pStyle w:val="Heading1"/>
-      </w:pPr>
-      <w:r>
-        <w:t xml:space="preserve">Conclusions</w:t>
-      </w:r>
-    </w:p>
-    <w:p>
-      <w:pPr>
-        <w:pStyle w:val="FirstParagraph"/>
-      </w:pPr>
-      <w:r>
-        <w:t xml:space="preserve">This study set out to explore how multi-morphemic words are processed in Kalaallisut reading. Three main conclusions emerge.</w:t>
-      </w:r>
-    </w:p>
-    <w:p>
-      <w:pPr>
-        <w:pStyle w:val="BodyText"/>
-      </w:pPr>
-      <w:r>
-        <w:t xml:space="preserve">First, the results provide support for the theory-based claim that some Kalaallisut suffixes are lexical rather than grammatical, showing that this proposed distinction is reflected in attention allocation in reading. This challenges the widespread assumption that affixes are always grammatical elements.</w:t>
-      </w:r>
-    </w:p>
-    <w:p>
-      <w:pPr>
-        <w:pStyle w:val="BodyText"/>
-      </w:pPr>
-      <w:r>
-        <w:t xml:space="preserve">Second, the study shows that the word cannot always be assumed to be the basic unit of processing in reading. Our findings indicate that reading of multi-morphemic words in Kalaallisut is driven to a large extent by morpheme-level processing. This poses a challenge to influential models of eye-movement control that take the word as their fundamental unit, and it underscores the need for models to account for morpheme-level processing in order to accommodate languages where morphologically complex words are frequent.</w:t>
-      </w:r>
-    </w:p>
-    <w:p>
-      <w:pPr>
-        <w:pStyle w:val="BodyText"/>
-      </w:pPr>
-      <w:r>
-        <w:t xml:space="preserve">Third, although the results indicate that morphemes function as processing units in Kalaallisut, processing suffixes is not equivalent to processing individual simple words. Saccade targeting and skipping within complex words appears less efficient than between words. This may reflect that morpheme boundaries are not visually marked in the orthography, and it points to an interesting avenue for further research on the interaction between morphological structure and orthography in shaping reading behavior.</w:t>
-      </w:r>
-    </w:p>
-    <w:p>
-      <w:pPr>
-        <w:pStyle w:val="BodyText"/>
-      </w:pPr>
-      <w:r>
-        <w:t xml:space="preserve">Taken together, these findings demonstrate that the study of morphologically rich languages offers critical insights into the mechanisms of reading and language processing. They expose limitations of assumptions that are often taken for granted in psycholinguistic research and underscore the importance of broadening the empirical base of reading studies. Future comparative work, particularly across languages with different orthographic systems, will be essential for disentangling the roles of morphology and orthography and for understanding how readers adapt to extreme morphological complexity.</w:t>
-      </w:r>
-    </w:p>
-    <w:bookmarkEnd w:id="95"/>
-    <w:bookmarkStart w:id="96" w:name="acknowledgements"/>
-    <w:p>
-      <w:pPr>
-        <w:pStyle w:val="Heading1"/>
-      </w:pPr>
-      <w:r>
-        <w:t xml:space="preserve">Acknowledgements</w:t>
-      </w:r>
-    </w:p>
-    <w:p>
-      <w:pPr>
-        <w:pStyle w:val="FirstParagraph"/>
-      </w:pPr>
-      <w:r>
-        <w:t xml:space="preserve">The present study was funded by the Independent Research Fund Denmark (grant number: 10.46540/2027-00079B). The authors would like to thank the Department of Communication and Psychology at Aalborg University for lending the portable eye tracker.</w:t>
-      </w:r>
-    </w:p>
-    <w:bookmarkEnd w:id="96"/>
-    <w:bookmarkStart w:id="178" w:name="references"/>
-    <w:p>
-      <w:pPr>
-        <w:pStyle w:val="Heading1"/>
-      </w:pPr>
-      <w:r>
         <w:t xml:space="preserve">References</w:t>
       </w:r>
     </w:p>
-    <w:bookmarkStart w:id="177" w:name="refs"/>
-    <w:bookmarkStart w:id="98" w:name="ref-batesFittingLinearMixedEffects2015"/>
+    <w:bookmarkStart w:id="167" w:name="refs"/>
+    <w:bookmarkStart w:id="88" w:name="ref-batesFittingLinearMixedEffects2015"/>
     <w:p>
       <w:pPr>
         <w:pStyle w:val="Bibliography"/>
@@ -11564,7 +11202,7 @@
       <w:r>
         <w:t xml:space="preserve"> </w:t>
       </w:r>
-      <w:hyperlink r:id="rId97">
+      <w:hyperlink r:id="rId87">
         <w:r>
           <w:rPr>
             <w:rStyle w:val="Hyperlink"/>
@@ -11573,8 +11211,8 @@
         </w:r>
       </w:hyperlink>
     </w:p>
-    <w:bookmarkEnd w:id="98"/>
-    <w:bookmarkStart w:id="100" w:name="ref-bertramLengthComplexWord2003"/>
+    <w:bookmarkEnd w:id="88"/>
+    <w:bookmarkStart w:id="90" w:name="ref-bertramLengthComplexWord2003"/>
     <w:p>
       <w:pPr>
         <w:pStyle w:val="Bibliography"/>
@@ -11635,7 +11273,7 @@
       <w:r>
         <w:t xml:space="preserve"> </w:t>
       </w:r>
-      <w:hyperlink r:id="rId99">
+      <w:hyperlink r:id="rId89">
         <w:r>
           <w:rPr>
             <w:rStyle w:val="Hyperlink"/>
@@ -11644,8 +11282,8 @@
         </w:r>
       </w:hyperlink>
     </w:p>
-    <w:bookmarkEnd w:id="100"/>
-    <w:bookmarkStart w:id="102" w:name="ref-bertramRoleHyphensConstituent2013"/>
+    <w:bookmarkEnd w:id="90"/>
+    <w:bookmarkStart w:id="92" w:name="ref-bertramRoleHyphensConstituent2013"/>
     <w:p>
       <w:pPr>
         <w:pStyle w:val="Bibliography"/>
@@ -11727,7 +11365,7 @@
       <w:r>
         <w:t xml:space="preserve"> </w:t>
       </w:r>
-      <w:hyperlink r:id="rId101">
+      <w:hyperlink r:id="rId91">
         <w:r>
           <w:rPr>
             <w:rStyle w:val="Hyperlink"/>
@@ -11736,8 +11374,8 @@
         </w:r>
       </w:hyperlink>
     </w:p>
-    <w:bookmarkEnd w:id="102"/>
-    <w:bookmarkStart w:id="104" w:name="ref-boyeLexicalVsGrammatical2023"/>
+    <w:bookmarkEnd w:id="92"/>
+    <w:bookmarkStart w:id="94" w:name="ref-boyeLexicalVsGrammatical2023"/>
     <w:p>
       <w:pPr>
         <w:pStyle w:val="Bibliography"/>
@@ -11752,7 +11390,16 @@
         <w:t xml:space="preserve">Grammatical Words</w:t>
       </w:r>
       <w:r>
-        <w:t xml:space="preserve">. In E. van Lier (Ed.),</w:t>
+        <w:t xml:space="preserve">. In</w:t>
+      </w:r>
+      <w:r>
+        <w:t xml:space="preserve"> </w:t>
+      </w:r>
+      <w:r>
+        <w:t xml:space="preserve">E. van Lier (Ed.)</w:t>
+      </w:r>
+      <w:r>
+        <w:t xml:space="preserve">,</w:t>
       </w:r>
       <w:r>
         <w:t xml:space="preserve"> </w:t>
@@ -11815,7 +11462,7 @@
       <w:r>
         <w:t xml:space="preserve"> </w:t>
       </w:r>
-      <w:hyperlink r:id="rId103">
+      <w:hyperlink r:id="rId93">
         <w:r>
           <w:rPr>
             <w:rStyle w:val="Hyperlink"/>
@@ -11824,8 +11471,8 @@
         </w:r>
       </w:hyperlink>
     </w:p>
-    <w:bookmarkEnd w:id="104"/>
-    <w:bookmarkStart w:id="106" w:name="X75fe85e942d2e44d6e7f448306ad8ed8b195d1c"/>
+    <w:bookmarkEnd w:id="94"/>
+    <w:bookmarkStart w:id="96" w:name="X75fe85e942d2e44d6e7f448306ad8ed8b195d1c"/>
     <w:p>
       <w:pPr>
         <w:pStyle w:val="Bibliography"/>
@@ -11876,7 +11523,7 @@
       <w:r>
         <w:t xml:space="preserve"> </w:t>
       </w:r>
-      <w:hyperlink r:id="rId105">
+      <w:hyperlink r:id="rId95">
         <w:r>
           <w:rPr>
             <w:rStyle w:val="Hyperlink"/>
@@ -11885,8 +11532,8 @@
         </w:r>
       </w:hyperlink>
     </w:p>
-    <w:bookmarkEnd w:id="106"/>
-    <w:bookmarkStart w:id="108" w:name="ref-boyeAgrammatismUsagebasedTheory2023"/>
+    <w:bookmarkEnd w:id="96"/>
+    <w:bookmarkStart w:id="98" w:name="ref-boyeAgrammatismUsagebasedTheory2023"/>
     <w:p>
       <w:pPr>
         <w:pStyle w:val="Bibliography"/>
@@ -11935,7 +11582,7 @@
       <w:r>
         <w:t xml:space="preserve"> </w:t>
       </w:r>
-      <w:hyperlink r:id="rId107">
+      <w:hyperlink r:id="rId97">
         <w:r>
           <w:rPr>
             <w:rStyle w:val="Hyperlink"/>
@@ -11944,8 +11591,8 @@
         </w:r>
       </w:hyperlink>
     </w:p>
-    <w:bookmarkEnd w:id="108"/>
-    <w:bookmarkStart w:id="110" w:name="ref-boyeUsageBasedTheoryGrammatical2012"/>
+    <w:bookmarkEnd w:id="98"/>
+    <w:bookmarkStart w:id="100" w:name="ref-boyeUsageBasedTheoryGrammatical2012"/>
     <w:p>
       <w:pPr>
         <w:pStyle w:val="Bibliography"/>
@@ -12012,7 +11659,7 @@
       <w:r>
         <w:t xml:space="preserve">(1), 1–44. https://doi.org/</w:t>
       </w:r>
-      <w:hyperlink r:id="rId109">
+      <w:hyperlink r:id="rId99">
         <w:r>
           <w:rPr>
             <w:rStyle w:val="Hyperlink"/>
@@ -12021,8 +11668,8 @@
         </w:r>
       </w:hyperlink>
     </w:p>
-    <w:bookmarkEnd w:id="110"/>
-    <w:bookmarkStart w:id="111" w:name="ref-bybeeEvolutionGrammarTense1994"/>
+    <w:bookmarkEnd w:id="100"/>
+    <w:bookmarkStart w:id="101" w:name="ref-bybeeEvolutionGrammarTense1994"/>
     <w:p>
       <w:pPr>
         <w:pStyle w:val="Bibliography"/>
@@ -12065,8 +11712,8 @@
         <w:t xml:space="preserve">. University of Chicago Press.</w:t>
       </w:r>
     </w:p>
-    <w:bookmarkEnd w:id="111"/>
-    <w:bookmarkStart w:id="112" w:name="X7ae2403f63b50d2cbc56b36abe32abd2902c377"/>
+    <w:bookmarkEnd w:id="101"/>
+    <w:bookmarkStart w:id="102" w:name="X7ae2403f63b50d2cbc56b36abe32abd2902c377"/>
     <w:p>
       <w:pPr>
         <w:pStyle w:val="Bibliography"/>
@@ -12101,8 +11748,8 @@
         <w:t xml:space="preserve">(1/2), 69–82.</w:t>
       </w:r>
     </w:p>
-    <w:bookmarkEnd w:id="112"/>
-    <w:bookmarkStart w:id="113" w:name="ref-carpenterWhatYourEyes1983"/>
+    <w:bookmarkEnd w:id="102"/>
+    <w:bookmarkStart w:id="103" w:name="ref-carpenterWhatYourEyes1983"/>
     <w:p>
       <w:pPr>
         <w:pStyle w:val="Bibliography"/>
@@ -12155,8 +11802,8 @@
         <w:t xml:space="preserve">(pp. 275–307). Academic Press.</w:t>
       </w:r>
     </w:p>
-    <w:bookmarkEnd w:id="113"/>
-    <w:bookmarkStart w:id="114" w:name="ref-chomskyMinimalistProgram2014"/>
+    <w:bookmarkEnd w:id="103"/>
+    <w:bookmarkStart w:id="104" w:name="ref-chomskyMinimalistProgram2014"/>
     <w:p>
       <w:pPr>
         <w:pStyle w:val="Bibliography"/>
@@ -12181,8 +11828,8 @@
         <w:t xml:space="preserve">(20th anniversary edition). MIT Press.</w:t>
       </w:r>
     </w:p>
-    <w:bookmarkEnd w:id="114"/>
-    <w:bookmarkStart w:id="116" w:name="Xbe63cc610368a0cf6776be8154020122a1125e4"/>
+    <w:bookmarkEnd w:id="104"/>
+    <w:bookmarkStart w:id="106" w:name="Xbe63cc610368a0cf6776be8154020122a1125e4"/>
     <w:p>
       <w:pPr>
         <w:pStyle w:val="Bibliography"/>
@@ -12219,7 +11866,7 @@
       <w:r>
         <w:t xml:space="preserve"> </w:t>
       </w:r>
-      <w:hyperlink r:id="rId115">
+      <w:hyperlink r:id="rId105">
         <w:r>
           <w:rPr>
             <w:rStyle w:val="Hyperlink"/>
@@ -12228,8 +11875,8 @@
         </w:r>
       </w:hyperlink>
     </w:p>
-    <w:bookmarkEnd w:id="116"/>
-    <w:bookmarkStart w:id="118" w:name="ref-ehrlich1981"/>
+    <w:bookmarkEnd w:id="106"/>
+    <w:bookmarkStart w:id="108" w:name="ref-ehrlich1981"/>
     <w:p>
       <w:pPr>
         <w:pStyle w:val="Bibliography"/>
@@ -12266,7 +11913,7 @@
       <w:r>
         <w:t xml:space="preserve"> </w:t>
       </w:r>
-      <w:hyperlink r:id="rId117">
+      <w:hyperlink r:id="rId107">
         <w:r>
           <w:rPr>
             <w:rStyle w:val="Hyperlink"/>
@@ -12275,8 +11922,8 @@
         </w:r>
       </w:hyperlink>
     </w:p>
-    <w:bookmarkEnd w:id="118"/>
-    <w:bookmarkStart w:id="120" w:name="ref-ellisFrequencyEffectsLanguage2002"/>
+    <w:bookmarkEnd w:id="108"/>
+    <w:bookmarkStart w:id="110" w:name="ref-ellisFrequencyEffectsLanguage2002"/>
     <w:p>
       <w:pPr>
         <w:pStyle w:val="Bibliography"/>
@@ -12325,7 +11972,7 @@
       <w:r>
         <w:t xml:space="preserve"> </w:t>
       </w:r>
-      <w:hyperlink r:id="rId119">
+      <w:hyperlink r:id="rId109">
         <w:r>
           <w:rPr>
             <w:rStyle w:val="Hyperlink"/>
@@ -12334,8 +11981,8 @@
         </w:r>
       </w:hyperlink>
     </w:p>
-    <w:bookmarkEnd w:id="120"/>
-    <w:bookmarkStart w:id="122" w:name="ref-engbertSWIFTDynamicalModel2005"/>
+    <w:bookmarkEnd w:id="110"/>
+    <w:bookmarkStart w:id="112" w:name="ref-engbertSWIFTDynamicalModel2005"/>
     <w:p>
       <w:pPr>
         <w:pStyle w:val="Bibliography"/>
@@ -12402,7 +12049,7 @@
       <w:r>
         <w:t xml:space="preserve"> </w:t>
       </w:r>
-      <w:hyperlink r:id="rId121">
+      <w:hyperlink r:id="rId111">
         <w:r>
           <w:rPr>
             <w:rStyle w:val="Hyperlink"/>
@@ -12411,8 +12058,8 @@
         </w:r>
       </w:hyperlink>
     </w:p>
-    <w:bookmarkEnd w:id="122"/>
-    <w:bookmarkStart w:id="124" w:name="ref-fortescueAffixOrderingWest1980"/>
+    <w:bookmarkEnd w:id="112"/>
+    <w:bookmarkStart w:id="114" w:name="ref-fortescueAffixOrderingWest1980"/>
     <w:p>
       <w:pPr>
         <w:pStyle w:val="Bibliography"/>
@@ -12470,7 +12117,7 @@
       <w:r>
         <w:t xml:space="preserve"> </w:t>
       </w:r>
-      <w:hyperlink r:id="rId123">
+      <w:hyperlink r:id="rId113">
         <w:r>
           <w:rPr>
             <w:rStyle w:val="Hyperlink"/>
@@ -12479,8 +12126,8 @@
         </w:r>
       </w:hyperlink>
     </w:p>
-    <w:bookmarkEnd w:id="124"/>
-    <w:bookmarkStart w:id="125" w:name="ref-fortescueWestGreenlandic1984"/>
+    <w:bookmarkEnd w:id="114"/>
+    <w:bookmarkStart w:id="115" w:name="ref-fortescueWestGreenlandic1984"/>
     <w:p>
       <w:pPr>
         <w:pStyle w:val="Bibliography"/>
@@ -12516,8 +12163,8 @@
         <w:t xml:space="preserve">. Croom Helm.</w:t>
       </w:r>
     </w:p>
-    <w:bookmarkEnd w:id="125"/>
-    <w:bookmarkStart w:id="126" w:name="ref-gerdtsSalishLexicalSuffixes1996"/>
+    <w:bookmarkEnd w:id="115"/>
+    <w:bookmarkStart w:id="116" w:name="ref-gerdtsSalishLexicalSuffixes1996"/>
     <w:p>
       <w:pPr>
         <w:pStyle w:val="Bibliography"/>
@@ -12542,8 +12189,8 @@
         <w:t xml:space="preserve">(pp. 163–176). CSLI Publications.</w:t>
       </w:r>
     </w:p>
-    <w:bookmarkEnd w:id="126"/>
-    <w:bookmarkStart w:id="127" w:name="ref-hopperPrinciplesGrammaticization1991"/>
+    <w:bookmarkEnd w:id="116"/>
+    <w:bookmarkStart w:id="117" w:name="ref-hopperPrinciplesGrammaticization1991"/>
     <w:p>
       <w:pPr>
         <w:pStyle w:val="Bibliography"/>
@@ -12582,8 +12229,8 @@
         <w:t xml:space="preserve">(Vol. 1, pp. 17–35). John Benjamins Publishing Company.</w:t>
       </w:r>
     </w:p>
-    <w:bookmarkEnd w:id="127"/>
-    <w:bookmarkStart w:id="129" w:name="ref-hyonaReadingCompoundWords2024"/>
+    <w:bookmarkEnd w:id="117"/>
+    <w:bookmarkStart w:id="119" w:name="ref-hyonaReadingCompoundWords2024"/>
     <w:p>
       <w:pPr>
         <w:pStyle w:val="Bibliography"/>
@@ -12653,7 +12300,7 @@
       <w:r>
         <w:t xml:space="preserve"> </w:t>
       </w:r>
-      <w:hyperlink r:id="rId128">
+      <w:hyperlink r:id="rId118">
         <w:r>
           <w:rPr>
             <w:rStyle w:val="Hyperlink"/>
@@ -12662,8 +12309,8 @@
         </w:r>
       </w:hyperlink>
     </w:p>
-    <w:bookmarkEnd w:id="129"/>
-    <w:bookmarkStart w:id="131" w:name="ref-ishkhanyanMeetingPointWhere2019"/>
+    <w:bookmarkEnd w:id="119"/>
+    <w:bookmarkStart w:id="121" w:name="ref-ishkhanyanMeetingPointWhere2019"/>
     <w:p>
       <w:pPr>
         <w:pStyle w:val="Bibliography"/>
@@ -12730,7 +12377,7 @@
       <w:r>
         <w:t xml:space="preserve"> </w:t>
       </w:r>
-      <w:hyperlink r:id="rId130">
+      <w:hyperlink r:id="rId120">
         <w:r>
           <w:rPr>
             <w:rStyle w:val="Hyperlink"/>
@@ -12739,8 +12386,8 @@
         </w:r>
       </w:hyperlink>
     </w:p>
-    <w:bookmarkEnd w:id="131"/>
-    <w:bookmarkStart w:id="133" w:name="Xc0023b1dbbe966bdbbc2a41bc8e986376094ddd"/>
+    <w:bookmarkEnd w:id="121"/>
+    <w:bookmarkStart w:id="123" w:name="Xc0023b1dbbe966bdbbc2a41bc8e986376094ddd"/>
     <w:p>
       <w:pPr>
         <w:pStyle w:val="Bibliography"/>
@@ -12813,7 +12460,7 @@
       <w:r>
         <w:t xml:space="preserve"> </w:t>
       </w:r>
-      <w:hyperlink r:id="rId132">
+      <w:hyperlink r:id="rId122">
         <w:r>
           <w:rPr>
             <w:rStyle w:val="Hyperlink"/>
@@ -12822,14 +12469,14 @@
         </w:r>
       </w:hyperlink>
     </w:p>
-    <w:bookmarkEnd w:id="133"/>
-    <w:bookmarkStart w:id="134" w:name="X650317c6948688630465099fd8c4c75534d3aec"/>
+    <w:bookmarkEnd w:id="123"/>
+    <w:bookmarkStart w:id="124" w:name="X650317c6948688630465099fd8c4c75534d3aec"/>
     <w:p>
       <w:pPr>
         <w:pStyle w:val="Bibliography"/>
       </w:pPr>
       <w:r>
-        <w:t xml:space="preserve">Jaeger, S. W., &amp; Boye, K. (under review).</w:t>
+        <w:t xml:space="preserve">Jaeger, S. W., &amp; Boye, K. (2026).</w:t>
       </w:r>
       <w:r>
         <w:t xml:space="preserve"> </w:t>
@@ -12873,8 +12520,8 @@
         <w:t xml:space="preserve">.</w:t>
       </w:r>
     </w:p>
-    <w:bookmarkEnd w:id="134"/>
-    <w:bookmarkStart w:id="136" w:name="ref-justTheoryReadingEye1980"/>
+    <w:bookmarkEnd w:id="124"/>
+    <w:bookmarkStart w:id="126" w:name="ref-justTheoryReadingEye1980"/>
     <w:p>
       <w:pPr>
         <w:pStyle w:val="Bibliography"/>
@@ -12923,7 +12570,7 @@
       <w:r>
         <w:t xml:space="preserve"> </w:t>
       </w:r>
-      <w:hyperlink r:id="rId135">
+      <w:hyperlink r:id="rId125">
         <w:r>
           <w:rPr>
             <w:rStyle w:val="Hyperlink"/>
@@ -12932,8 +12579,8 @@
         </w:r>
       </w:hyperlink>
     </w:p>
-    <w:bookmarkEnd w:id="136"/>
-    <w:bookmarkStart w:id="138" w:name="ref-kahnWestGreenlandicEssential2021"/>
+    <w:bookmarkEnd w:id="126"/>
+    <w:bookmarkStart w:id="128" w:name="ref-kahnWestGreenlandicEssential2021"/>
     <w:p>
       <w:pPr>
         <w:pStyle w:val="Bibliography"/>
@@ -12992,7 +12639,7 @@
       <w:r>
         <w:t xml:space="preserve"> </w:t>
       </w:r>
-      <w:hyperlink r:id="rId137">
+      <w:hyperlink r:id="rId127">
         <w:r>
           <w:rPr>
             <w:rStyle w:val="Hyperlink"/>
@@ -13001,8 +12648,8 @@
         </w:r>
       </w:hyperlink>
     </w:p>
-    <w:bookmarkEnd w:id="138"/>
-    <w:bookmarkStart w:id="139" w:name="ref-kazamaLexicalAffixesTungusic2011"/>
+    <w:bookmarkEnd w:id="128"/>
+    <w:bookmarkStart w:id="129" w:name="ref-kazamaLexicalAffixesTungusic2011"/>
     <w:p>
       <w:pPr>
         <w:pStyle w:val="Bibliography"/>
@@ -13027,8 +12674,8 @@
         <w:t xml:space="preserve">(Vol. 2, pp. 55–66). Tokyo University of Foreign Studies.</w:t>
       </w:r>
     </w:p>
-    <w:bookmarkEnd w:id="139"/>
-    <w:bookmarkStart w:id="140" w:name="ref-kinkadeOriginsSalishanLexical1998"/>
+    <w:bookmarkEnd w:id="129"/>
+    <w:bookmarkStart w:id="130" w:name="ref-kinkadeOriginsSalishanLexical1998"/>
     <w:p>
       <w:pPr>
         <w:pStyle w:val="Bibliography"/>
@@ -13063,8 +12710,8 @@
         <w:t xml:space="preserve">, 266–295.</w:t>
       </w:r>
     </w:p>
-    <w:bookmarkEnd w:id="140"/>
-    <w:bookmarkStart w:id="142" w:name="ref-kleinWhatSimpleLetterDetection2016"/>
+    <w:bookmarkEnd w:id="130"/>
+    <w:bookmarkStart w:id="132" w:name="ref-kleinWhatSimpleLetterDetection2016"/>
     <w:p>
       <w:pPr>
         <w:pStyle w:val="Bibliography"/>
@@ -13122,7 +12769,7 @@
       <w:r>
         <w:t xml:space="preserve"> </w:t>
       </w:r>
-      <w:hyperlink r:id="rId141">
+      <w:hyperlink r:id="rId131">
         <w:r>
           <w:rPr>
             <w:rStyle w:val="Hyperlink"/>
@@ -13131,8 +12778,8 @@
         </w:r>
       </w:hyperlink>
     </w:p>
-    <w:bookmarkEnd w:id="142"/>
-    <w:bookmarkStart w:id="144" w:name="ref-krejtzReadingFunctionContent2016"/>
+    <w:bookmarkEnd w:id="132"/>
+    <w:bookmarkStart w:id="134" w:name="ref-krejtzReadingFunctionContent2016"/>
     <w:p>
       <w:pPr>
         <w:pStyle w:val="Bibliography"/>
@@ -13202,7 +12849,7 @@
       <w:r>
         <w:t xml:space="preserve"> </w:t>
       </w:r>
-      <w:hyperlink r:id="rId143">
+      <w:hyperlink r:id="rId133">
         <w:r>
           <w:rPr>
             <w:rStyle w:val="Hyperlink"/>
@@ -13211,8 +12858,8 @@
         </w:r>
       </w:hyperlink>
     </w:p>
-    <w:bookmarkEnd w:id="144"/>
-    <w:bookmarkStart w:id="146" w:name="ref-kupermanWordLengthFrequency2024"/>
+    <w:bookmarkEnd w:id="134"/>
+    <w:bookmarkStart w:id="136" w:name="ref-kupermanWordLengthFrequency2024"/>
     <w:p>
       <w:pPr>
         <w:pStyle w:val="Bibliography"/>
@@ -13249,7 +12896,7 @@
       <w:r>
         <w:t xml:space="preserve"> </w:t>
       </w:r>
-      <w:hyperlink r:id="rId145">
+      <w:hyperlink r:id="rId135">
         <w:r>
           <w:rPr>
             <w:rStyle w:val="Hyperlink"/>
@@ -13258,8 +12905,8 @@
         </w:r>
       </w:hyperlink>
     </w:p>
-    <w:bookmarkEnd w:id="146"/>
-    <w:bookmarkStart w:id="147" w:name="ref-kurebitoLexicalAffixesChukchi2001"/>
+    <w:bookmarkEnd w:id="136"/>
+    <w:bookmarkStart w:id="137" w:name="ref-kurebitoLexicalAffixesChukchi2001"/>
     <w:p>
       <w:pPr>
         <w:pStyle w:val="Bibliography"/>
@@ -13294,8 +12941,8 @@
         <w:t xml:space="preserve">, 65–84.</w:t>
       </w:r>
     </w:p>
-    <w:bookmarkEnd w:id="147"/>
-    <w:bookmarkStart w:id="149" w:name="Xd4119b2f3cf8316f24c8aab84b8b646d817dc2a"/>
+    <w:bookmarkEnd w:id="137"/>
+    <w:bookmarkStart w:id="139" w:name="Xd4119b2f3cf8316f24c8aab84b8b646d817dc2a"/>
     <w:p>
       <w:pPr>
         <w:pStyle w:val="Bibliography"/>
@@ -13332,7 +12979,7 @@
       <w:r>
         <w:t xml:space="preserve"> </w:t>
       </w:r>
-      <w:hyperlink r:id="rId148">
+      <w:hyperlink r:id="rId138">
         <w:r>
           <w:rPr>
             <w:rStyle w:val="Hyperlink"/>
@@ -13341,8 +12988,8 @@
         </w:r>
       </w:hyperlink>
     </w:p>
-    <w:bookmarkEnd w:id="149"/>
-    <w:bookmarkStart w:id="151" w:name="X8dd4316d97c8ea58cde81ec899f5475aebdbb1b"/>
+    <w:bookmarkEnd w:id="139"/>
+    <w:bookmarkStart w:id="141" w:name="X8dd4316d97c8ea58cde81ec899f5475aebdbb1b"/>
     <w:p>
       <w:pPr>
         <w:pStyle w:val="Bibliography"/>
@@ -13421,7 +13068,7 @@
       <w:r>
         <w:t xml:space="preserve"> </w:t>
       </w:r>
-      <w:hyperlink r:id="rId150">
+      <w:hyperlink r:id="rId140">
         <w:r>
           <w:rPr>
             <w:rStyle w:val="Hyperlink"/>
@@ -13430,8 +13077,8 @@
         </w:r>
       </w:hyperlink>
     </w:p>
-    <w:bookmarkEnd w:id="151"/>
-    <w:bookmarkStart w:id="152" w:name="Xd40248a11a016e9fc181c1d92cb236de48fa00c"/>
+    <w:bookmarkEnd w:id="141"/>
+    <w:bookmarkStart w:id="142" w:name="Xd40248a11a016e9fc181c1d92cb236de48fa00c"/>
     <w:p>
       <w:pPr>
         <w:pStyle w:val="Bibliography"/>
@@ -13502,8 +13149,8 @@
         <w:t xml:space="preserve">. Armand Colin.</w:t>
       </w:r>
     </w:p>
-    <w:bookmarkEnd w:id="152"/>
-    <w:bookmarkStart w:id="154" w:name="X7ab20a0649d893680a785c7c3cbb1289b51779c"/>
+    <w:bookmarkEnd w:id="142"/>
+    <w:bookmarkStart w:id="144" w:name="X7ab20a0649d893680a785c7c3cbb1289b51779c"/>
     <w:p>
       <w:pPr>
         <w:pStyle w:val="Bibliography"/>
@@ -13530,7 +13177,7 @@
       <w:r>
         <w:t xml:space="preserve"> </w:t>
       </w:r>
-      <w:hyperlink r:id="rId153">
+      <w:hyperlink r:id="rId143">
         <w:r>
           <w:rPr>
             <w:rStyle w:val="Hyperlink"/>
@@ -13539,8 +13186,8 @@
         </w:r>
       </w:hyperlink>
     </w:p>
-    <w:bookmarkEnd w:id="154"/>
-    <w:bookmarkStart w:id="156" w:name="ref-mattissenSubTypesPolysynthesis2017"/>
+    <w:bookmarkEnd w:id="144"/>
+    <w:bookmarkStart w:id="146" w:name="ref-mattissenSubTypesPolysynthesis2017"/>
     <w:p>
       <w:pPr>
         <w:pStyle w:val="Bibliography"/>
@@ -13627,7 +13274,7 @@
       <w:r>
         <w:t xml:space="preserve"> </w:t>
       </w:r>
-      <w:hyperlink r:id="rId155">
+      <w:hyperlink r:id="rId145">
         <w:r>
           <w:rPr>
             <w:rStyle w:val="Hyperlink"/>
@@ -13636,8 +13283,8 @@
         </w:r>
       </w:hyperlink>
     </w:p>
-    <w:bookmarkEnd w:id="156"/>
-    <w:bookmarkStart w:id="157" w:name="Xcef59b2bb06f007a72fd95da2f09a10ca8a1a1f"/>
+    <w:bookmarkEnd w:id="146"/>
+    <w:bookmarkStart w:id="147" w:name="Xcef59b2bb06f007a72fd95da2f09a10ca8a1a1f"/>
     <w:p>
       <w:pPr>
         <w:pStyle w:val="Bibliography"/>
@@ -13662,8 +13309,8 @@
         <w:t xml:space="preserve">(pp. 357–372). John Benjamins Publishing Company.</w:t>
       </w:r>
     </w:p>
-    <w:bookmarkEnd w:id="157"/>
-    <w:bookmarkStart w:id="159" w:name="ref-nielsenLeksikalskeAffikser2024"/>
+    <w:bookmarkEnd w:id="147"/>
+    <w:bookmarkStart w:id="149" w:name="ref-nielsenLeksikalskeAffikser2024"/>
     <w:p>
       <w:pPr>
         <w:pStyle w:val="Bibliography"/>
@@ -13709,7 +13356,7 @@
       <w:r>
         <w:t xml:space="preserve"> </w:t>
       </w:r>
-      <w:hyperlink r:id="rId158">
+      <w:hyperlink r:id="rId148">
         <w:r>
           <w:rPr>
             <w:rStyle w:val="Hyperlink"/>
@@ -13718,8 +13365,8 @@
         </w:r>
       </w:hyperlink>
     </w:p>
-    <w:bookmarkEnd w:id="159"/>
-    <w:bookmarkStart w:id="160" w:name="X3c4b0807097255b972658cd696266b90256e761"/>
+    <w:bookmarkEnd w:id="149"/>
+    <w:bookmarkStart w:id="150" w:name="X3c4b0807097255b972658cd696266b90256e761"/>
     <w:p>
       <w:pPr>
         <w:pStyle w:val="Bibliography"/>
@@ -13741,8 +13388,8 @@
         <w:t xml:space="preserve">.</w:t>
       </w:r>
     </w:p>
-    <w:bookmarkEnd w:id="160"/>
-    <w:bookmarkStart w:id="162" w:name="Xe2c33026a2adcbc355e0ad8f55d102b95bdef3f"/>
+    <w:bookmarkEnd w:id="150"/>
+    <w:bookmarkStart w:id="152" w:name="Xe2c33026a2adcbc355e0ad8f55d102b95bdef3f"/>
     <w:p>
       <w:pPr>
         <w:pStyle w:val="Bibliography"/>
@@ -13788,7 +13435,7 @@
       <w:r>
         <w:t xml:space="preserve"> </w:t>
       </w:r>
-      <w:hyperlink r:id="rId161">
+      <w:hyperlink r:id="rId151">
         <w:r>
           <w:rPr>
             <w:rStyle w:val="Hyperlink"/>
@@ -13797,8 +13444,8 @@
         </w:r>
       </w:hyperlink>
     </w:p>
-    <w:bookmarkEnd w:id="162"/>
-    <w:bookmarkStart w:id="163" w:name="X7d7144c0a52ec3594cffc5fec0f425498533505"/>
+    <w:bookmarkEnd w:id="152"/>
+    <w:bookmarkStart w:id="153" w:name="X7d7144c0a52ec3594cffc5fec0f425498533505"/>
     <w:p>
       <w:pPr>
         <w:pStyle w:val="Bibliography"/>
@@ -13820,8 +13467,8 @@
         <w:t xml:space="preserve">. R Foundation for Statistical Computing.</w:t>
       </w:r>
     </w:p>
-    <w:bookmarkEnd w:id="163"/>
-    <w:bookmarkStart w:id="165" w:name="ref-raynerEyeMovementsWord2011"/>
+    <w:bookmarkEnd w:id="153"/>
+    <w:bookmarkStart w:id="155" w:name="ref-raynerEyeMovementsWord2011"/>
     <w:p>
       <w:pPr>
         <w:pStyle w:val="Bibliography"/>
@@ -13870,7 +13517,7 @@
       <w:r>
         <w:t xml:space="preserve"> </w:t>
       </w:r>
-      <w:hyperlink r:id="rId164">
+      <w:hyperlink r:id="rId154">
         <w:r>
           <w:rPr>
             <w:rStyle w:val="Hyperlink"/>
@@ -13879,8 +13526,8 @@
         </w:r>
       </w:hyperlink>
     </w:p>
-    <w:bookmarkEnd w:id="165"/>
-    <w:bookmarkStart w:id="167" w:name="ref-reichleEZReaderModel2003"/>
+    <w:bookmarkEnd w:id="155"/>
+    <w:bookmarkStart w:id="157" w:name="ref-reichleEZReaderModel2003"/>
     <w:p>
       <w:pPr>
         <w:pStyle w:val="Bibliography"/>
@@ -13941,7 +13588,7 @@
       <w:r>
         <w:t xml:space="preserve"> </w:t>
       </w:r>
-      <w:hyperlink r:id="rId166">
+      <w:hyperlink r:id="rId156">
         <w:r>
           <w:rPr>
             <w:rStyle w:val="Hyperlink"/>
@@ -13950,8 +13597,8 @@
         </w:r>
       </w:hyperlink>
     </w:p>
-    <w:bookmarkEnd w:id="167"/>
-    <w:bookmarkStart w:id="169" w:name="ref-segalowitzLexicalAccessFunction2000"/>
+    <w:bookmarkEnd w:id="157"/>
+    <w:bookmarkStart w:id="159" w:name="ref-segalowitzLexicalAccessFunction2000"/>
     <w:p>
       <w:pPr>
         <w:pStyle w:val="Bibliography"/>
@@ -14021,7 +13668,7 @@
       <w:r>
         <w:t xml:space="preserve"> </w:t>
       </w:r>
-      <w:hyperlink r:id="rId168">
+      <w:hyperlink r:id="rId158">
         <w:r>
           <w:rPr>
             <w:rStyle w:val="Hyperlink"/>
@@ -14030,8 +13677,8 @@
         </w:r>
       </w:hyperlink>
     </w:p>
-    <w:bookmarkEnd w:id="169"/>
-    <w:bookmarkStart w:id="171" w:name="Xfc49065d968bb399454a80a7890debe613e7357"/>
+    <w:bookmarkEnd w:id="159"/>
+    <w:bookmarkStart w:id="161" w:name="Xfc49065d968bb399454a80a7890debe613e7357"/>
     <w:p>
       <w:pPr>
         <w:pStyle w:val="Bibliography"/>
@@ -14086,7 +13733,7 @@
       <w:r>
         <w:t xml:space="preserve"> </w:t>
       </w:r>
-      <w:hyperlink r:id="rId170">
+      <w:hyperlink r:id="rId160">
         <w:r>
           <w:rPr>
             <w:rStyle w:val="Hyperlink"/>
@@ -14095,8 +13742,8 @@
         </w:r>
       </w:hyperlink>
     </w:p>
-    <w:bookmarkEnd w:id="171"/>
-    <w:bookmarkStart w:id="173" w:name="ref-staubFunctionContentWord2024"/>
+    <w:bookmarkEnd w:id="161"/>
+    <w:bookmarkStart w:id="163" w:name="ref-staubFunctionContentWord2024"/>
     <w:p>
       <w:pPr>
         <w:pStyle w:val="Bibliography"/>
@@ -14133,7 +13780,7 @@
       <w:r>
         <w:t xml:space="preserve"> </w:t>
       </w:r>
-      <w:hyperlink r:id="rId172">
+      <w:hyperlink r:id="rId162">
         <w:r>
           <w:rPr>
             <w:rStyle w:val="Hyperlink"/>
@@ -14142,8 +13789,8 @@
         </w:r>
       </w:hyperlink>
     </w:p>
-    <w:bookmarkEnd w:id="173"/>
-    <w:bookmarkStart w:id="174" w:name="ref-talmyTowardCognitiveSemantics2000"/>
+    <w:bookmarkEnd w:id="163"/>
+    <w:bookmarkStart w:id="164" w:name="ref-talmyTowardCognitiveSemantics2000"/>
     <w:p>
       <w:pPr>
         <w:pStyle w:val="Bibliography"/>
@@ -14165,8 +13812,8 @@
         <w:t xml:space="preserve">. MIT Press.</w:t>
       </w:r>
     </w:p>
-    <w:bookmarkEnd w:id="174"/>
-    <w:bookmarkStart w:id="176" w:name="X0dece0ec1e6d323c04cb22046ef24ba5e7f7ff3"/>
+    <w:bookmarkEnd w:id="164"/>
+    <w:bookmarkStart w:id="166" w:name="X0dece0ec1e6d323c04cb22046ef24ba5e7f7ff3"/>
     <w:p>
       <w:pPr>
         <w:pStyle w:val="Bibliography"/>
@@ -14256,7 +13903,7 @@
       <w:r>
         <w:t xml:space="preserve"> </w:t>
       </w:r>
-      <w:hyperlink r:id="rId175">
+      <w:hyperlink r:id="rId165">
         <w:r>
           <w:rPr>
             <w:rStyle w:val="Hyperlink"/>
@@ -14265,11 +13912,11 @@
         </w:r>
       </w:hyperlink>
     </w:p>
-    <w:bookmarkEnd w:id="176"/>
-    <w:bookmarkEnd w:id="177"/>
-    <w:bookmarkEnd w:id="178"/>
+    <w:bookmarkEnd w:id="166"/>
+    <w:bookmarkEnd w:id="167"/>
+    <w:bookmarkEnd w:id="168"/>
     <w:sectPr>
-      <w:footerReference r:id="rId9" w:type="default"/>
+      <w:footerReference r:id="rId7" w:type="default"/>
       <w:pgSz w:h="16838" w:w="11906"/>
       <w:pgMar w:bottom="1440" w:footer="708" w:gutter="0" w:header="708" w:left="1440" w:right="1440" w:top="1440"/>
       <w:cols w:space="708"/>
@@ -14341,6 +13988,129 @@
       </w:r>
     </w:p>
   </w:footnote>
+  <w:footnote w:id="19">
+    <w:p>
+      <w:pPr>
+        <w:pStyle w:val="FootnoteText"/>
+      </w:pPr>
+      <w:r>
+        <w:rPr>
+          <w:rStyle w:val="FootnoteReference"/>
+        </w:rPr>
+        <w:footnoteRef/>
+      </w:r>
+      <w:r>
+        <w:t xml:space="preserve"> </w:t>
+      </w:r>
+      <w:r>
+        <w:t xml:space="preserve">Gloss abbreviations used in this paper: 1 = 1st person; 3 = 3rd person; CAUS = causative; CONSEQ = consequential mood; DECL = declarative mood; NEG = negation; PASS = passive; PL = plural; PRF = perfect; SG = singular.</w:t>
+      </w:r>
+    </w:p>
+  </w:footnote>
+  <w:footnote w:id="21">
+    <w:p>
+      <w:pPr>
+        <w:pStyle w:val="FootnoteText"/>
+      </w:pPr>
+      <w:r>
+        <w:rPr>
+          <w:rStyle w:val="FootnoteReference"/>
+        </w:rPr>
+        <w:footnoteRef/>
+      </w:r>
+      <w:r>
+        <w:t xml:space="preserve"> </w:t>
+      </w:r>
+      <w:r>
+        <w:t xml:space="preserve">One of the participants only completed half of the experiment due to physical discomfort.</w:t>
+      </w:r>
+    </w:p>
+  </w:footnote>
+  <w:footnote w:id="23">
+    <w:p>
+      <w:pPr>
+        <w:pStyle w:val="FootnoteText"/>
+      </w:pPr>
+      <w:r>
+        <w:rPr>
+          <w:rStyle w:val="FootnoteReference"/>
+        </w:rPr>
+        <w:footnoteRef/>
+      </w:r>
+      <w:r>
+        <w:t xml:space="preserve"> </w:t>
+      </w:r>
+      <w:r>
+        <w:t xml:space="preserve">For two participants, it was not possible to calibrate the tracker using the right eye. In these two cases, the left eye was tracked instead.</w:t>
+      </w:r>
+    </w:p>
+  </w:footnote>
+  <w:footnote w:id="24">
+    <w:p>
+      <w:pPr>
+        <w:pStyle w:val="FootnoteText"/>
+      </w:pPr>
+      <w:r>
+        <w:rPr>
+          <w:rStyle w:val="FootnoteReference"/>
+        </w:rPr>
+        <w:footnoteRef/>
+      </w:r>
+      <w:r>
+        <w:t xml:space="preserve"> </w:t>
+      </w:r>
+      <w:r>
+        <w:t xml:space="preserve">Two different monitors were used because the first 40 participants were tested in Greenland and the last 12 in Denmark.</w:t>
+      </w:r>
+    </w:p>
+  </w:footnote>
+  <w:footnote w:id="26">
+    <w:p>
+      <w:pPr>
+        <w:pStyle w:val="FootnoteText"/>
+      </w:pPr>
+      <w:r>
+        <w:rPr>
+          <w:rStyle w:val="FootnoteReference"/>
+        </w:rPr>
+        <w:footnoteRef/>
+      </w:r>
+      <w:r>
+        <w:t xml:space="preserve"> </w:t>
+      </w:r>
+      <w:r>
+        <w:t xml:space="preserve">The target suffix set was restricted to 8 lexical and 8 grammatical suffixes to allow for matching across a range of relevant linguistic parameters, including suffix type, frequency and length.</w:t>
+      </w:r>
+    </w:p>
+  </w:footnote>
+  <w:footnote w:id="28">
+    <w:p>
+      <w:pPr>
+        <w:pStyle w:val="FootnoteText"/>
+      </w:pPr>
+      <w:r>
+        <w:rPr>
+          <w:rStyle w:val="FootnoteReference"/>
+        </w:rPr>
+        <w:footnoteRef/>
+      </w:r>
+      <w:r>
+        <w:t xml:space="preserve"> </w:t>
+      </w:r>
+      <w:r>
+        <w:t xml:space="preserve">This ensured that the root-target suffix combination was never shorter than 10 letters, a threshold motivated by evidence from Finnish compound processing showing a shift from holistic to decompositional processing at this length</w:t>
+      </w:r>
+      <w:r>
+        <w:t xml:space="preserve"> </w:t>
+      </w:r>
+      <w:r>
+        <w:t xml:space="preserve">(Hyönä et al., 2024)</w:t>
+      </w:r>
+      <w:r>
+        <w:t xml:space="preserve">. Keeping all roots relatively long thus avoided a potential confound whereby combinations with short target suffixes would sometimes fall below this threshold while those with longer suffixes would not.</w:t>
+      </w:r>
+    </w:p>
+  </w:footnote>
   <w:footnote w:id="32">
     <w:p>
       <w:pPr>
@@ -14356,64 +14126,7 @@
         <w:t xml:space="preserve"> </w:t>
       </w:r>
       <w:r>
-        <w:t xml:space="preserve">Gloss abbreviations used in this paper: 1 = 1st person; 3 = 3rd person; CAUS = causative; CONSEQ = consequential mood; DECL = declarative mood; NEG = negation; PASS = passive; PL = plural; PRF = perfect; SG = singular.</w:t>
-      </w:r>
-    </w:p>
-  </w:footnote>
-  <w:footnote w:id="34">
-    <w:p>
-      <w:pPr>
-        <w:pStyle w:val="FootnoteText"/>
-      </w:pPr>
-      <w:r>
-        <w:rPr>
-          <w:rStyle w:val="FootnoteReference"/>
-        </w:rPr>
-        <w:footnoteRef/>
-      </w:r>
-      <w:r>
-        <w:t xml:space="preserve"> </w:t>
-      </w:r>
-      <w:r>
-        <w:t xml:space="preserve">One of the participants only completed half of the experiment due to physical discomfort.</w:t>
-      </w:r>
-    </w:p>
-  </w:footnote>
-  <w:footnote w:id="36">
-    <w:p>
-      <w:pPr>
-        <w:pStyle w:val="FootnoteText"/>
-      </w:pPr>
-      <w:r>
-        <w:rPr>
-          <w:rStyle w:val="FootnoteReference"/>
-        </w:rPr>
-        <w:footnoteRef/>
-      </w:r>
-      <w:r>
-        <w:t xml:space="preserve"> </w:t>
-      </w:r>
-      <w:r>
-        <w:t xml:space="preserve">For two participants, it was not possible to calibrate the tracker using the right eye. In these two cases, the left eye was tracked instead.</w:t>
-      </w:r>
-    </w:p>
-  </w:footnote>
-  <w:footnote w:id="37">
-    <w:p>
-      <w:pPr>
-        <w:pStyle w:val="FootnoteText"/>
-      </w:pPr>
-      <w:r>
-        <w:rPr>
-          <w:rStyle w:val="FootnoteReference"/>
-        </w:rPr>
-        <w:footnoteRef/>
-      </w:r>
-      <w:r>
-        <w:t xml:space="preserve"> </w:t>
-      </w:r>
-      <w:r>
-        <w:t xml:space="preserve">Two different monitors were used because the first 40 participants were tested in Greenland and the last 12 in Denmark.</w:t>
+        <w:t xml:space="preserve">In eye-tracking research, predictability is commonly operationalized using cloze-task norms. However, adapting this approach to the suffix level is not straightforward, and conducting a cloze task was therefore beyond the scope of the present study.</w:t>
       </w:r>
     </w:p>
   </w:footnote>
@@ -14432,20 +14145,11 @@
         <w:t xml:space="preserve"> </w:t>
       </w:r>
       <w:r>
-        <w:t xml:space="preserve">This ensured that the root-target suffix combination was never shorter than 10 letters, a threshold motivated by evidence from Finnish compound processing showing a shift from holistic to decompositional processing at this length</w:t>
-      </w:r>
-      <w:r>
-        <w:t xml:space="preserve"> </w:t>
-      </w:r>
-      <w:r>
-        <w:t xml:space="preserve">(Hyönä et al., 2024)</w:t>
-      </w:r>
-      <w:r>
-        <w:t xml:space="preserve">. Keeping all roots relatively long thus avoided a potential confound whereby combinations with short target suffixes would sometimes fall below this threshold while those with longer suffixes would not.</w:t>
+        <w:t xml:space="preserve">In step 4, all trials were visually inspected in DataViewer and excluded if the lines of fixations did not align with the lines of text for sentence 2 and 3 (e.g., due to head movement or calibration issues). For each trial, misalignment on sentence 1 was accepted, because data from sentence 1 are not included in the analyses. While this step involves some subjective judgment, the statistical analyses were performed both with and without these trials and yielded significant results in the same directions in both cases. Instead of excluding these trials, an alternative approach would have been to use post-processing error correction where fixation positions are adjusted to align with the text. However, we chose not to do this because there were only relatively few problematic trials, and because such error correction also involves some degree of guesswork as to where fixations belong.</w:t>
       </w:r>
     </w:p>
   </w:footnote>
-  <w:footnote w:id="51">
+  <w:footnote w:id="42">
     <w:p>
       <w:pPr>
         <w:pStyle w:val="FootnoteText"/>
@@ -14460,36 +14164,17 @@
         <w:t xml:space="preserve"> </w:t>
       </w:r>
       <w:r>
-        <w:t xml:space="preserve">In step 4, all trials were visually inspected in DataViewer and excluded if the lines of fixations did not align with the lines of text for sentence 2 and 3 (e.g., due to head movement or calibration issues). For each trial, misalignment on sentence 1 was accepted, because data from sentence 1 are not included in the analyses. While this step involves some subjective judgment, the statistical analyses were performed both with and without these trials and yielded significant results in the same directions in both cases. Instead of excluding these trials, an alternative approach would have been to use post-processing error correction where fixation positions are adjusted to align with the text. However, we chose not to do this because there were only relatively few problematic trials, and because such error correction also involves some degree of guesswork as to where fixations belong.</w:t>
-      </w:r>
-    </w:p>
-  </w:footnote>
-  <w:footnote w:id="53">
-    <w:p>
-      <w:pPr>
-        <w:pStyle w:val="FootnoteText"/>
-      </w:pPr>
-      <w:r>
-        <w:rPr>
-          <w:rStyle w:val="FootnoteReference"/>
-        </w:rPr>
-        <w:footnoteRef/>
-      </w:r>
-      <w:r>
-        <w:t xml:space="preserve"> </w:t>
-      </w:r>
-      <w:r>
         <w:t xml:space="preserve">The raw data and preprocessing scripts are available here:</w:t>
       </w:r>
       <w:r>
         <w:t xml:space="preserve"> </w:t>
       </w:r>
-      <w:hyperlink r:id="rId48">
+      <w:hyperlink r:id="rId37">
         <w:r>
           <w:rPr>
             <w:rStyle w:val="Hyperlink"/>
           </w:rPr>
-          <w:t xml:space="preserve">https://github.com/solvej-jaeger/eye_tracking_kalaallisut</w:t>
+          <w:t xml:space="preserve">https://anonymous.4open.science/r/eye_tracking_kalaallisut-450F/</w:t>
         </w:r>
       </w:hyperlink>
       <w:r>
@@ -14497,7 +14182,7 @@
       </w:r>
     </w:p>
   </w:footnote>
-  <w:footnote w:id="54">
+  <w:footnote w:id="43">
     <w:p>
       <w:pPr>
         <w:pStyle w:val="FootnoteText"/>
@@ -14516,7 +14201,7 @@
       </w:r>
     </w:p>
   </w:footnote>
-  <w:footnote w:id="62">
+  <w:footnote w:id="51">
     <w:p>
       <w:pPr>
         <w:pStyle w:val="FootnoteText"/>
@@ -14535,7 +14220,7 @@
       </w:r>
     </w:p>
   </w:footnote>
-  <w:footnote w:id="67">
+  <w:footnote w:id="56">
     <w:p>
       <w:pPr>
         <w:pStyle w:val="FootnoteText"/>
@@ -14554,7 +14239,7 @@
       </w:r>
     </w:p>
   </w:footnote>
-  <w:footnote w:id="72">
+  <w:footnote w:id="61">
     <w:p>
       <w:pPr>
         <w:pStyle w:val="FootnoteText"/>
@@ -14573,7 +14258,7 @@
       </w:r>
     </w:p>
   </w:footnote>
-  <w:footnote w:id="85">
+  <w:footnote w:id="74">
     <w:p>
       <w:pPr>
         <w:pStyle w:val="FootnoteText"/>
@@ -14592,7 +14277,26 @@
       </w:r>
     </w:p>
   </w:footnote>
-  <w:footnote w:id="92">
+  <w:footnote w:id="77">
+    <w:p>
+      <w:pPr>
+        <w:pStyle w:val="FootnoteText"/>
+      </w:pPr>
+      <w:r>
+        <w:rPr>
+          <w:rStyle w:val="FootnoteReference"/>
+        </w:rPr>
+        <w:footnoteRef/>
+      </w:r>
+      <w:r>
+        <w:t xml:space="preserve"> </w:t>
+      </w:r>
+      <w:r>
+        <w:t xml:space="preserve">We conducted supplementary analyses (see Supplementary Materials) including the log-transformed frequencies of the root and filler suffix as additional predictors. Frequency effects varied across measures: higher root frequency was associated with increased skipping of the target suffix, whereas higher filler-suffix frequency was associated with shorter first-fixation durations on the target suffix. Importantly, the effects of structural status remained significant when these predictors were included.</w:t>
+      </w:r>
+    </w:p>
+  </w:footnote>
+  <w:footnote w:id="82">
     <w:p>
       <w:pPr>
         <w:pStyle w:val="FootnoteText"/>

</xml_diff>